<commit_message>
docs(voicekey): strengthen research evidence
</commit_message>
<xml_diff>
--- a/docs/voicekey/proposal/voicekey-technical-proposal-v2.1.docx
+++ b/docs/voicekey/proposal/voicekey-technical-proposal-v2.1.docx
@@ -5433,7 +5433,26 @@
           <w:color w:val="000000"/>
           <w:sz w:val="22"/>
         </w:rPr>
-        <w:t>The pilot should measure repeated explanations, time to confirmed understanding, support requests, and user acceptance. It should not claim a return on investment before those values are observed. Before procurement, the team needs a selected schematic, two comparable manufacturing quotes, a warranty and replacement plan, and a clear policy for customer-provided versus loaner phones. Component and cost anchors are listed in Section 5.3, and the full cost model is retained with the project documentation.</w:t>
+        <w:t xml:space="preserve">The pilot should measure repeated explanations, time to confirmed understanding, support requests, and user acceptance. It should not claim a return on investment before those values are observed. Before procurement, the team needs a selected schematic, two comparable manufacturing quotes, a warranty and replacement plan, and a clear policy for customer-provided versus loaner phones. Component and cost anchors are listed in Section 5.3. Calculation and exclusion detail is in the </w:t>
+      </w:r>
+      <w:hyperlink r:id="rId13">
+        <w:r>
+          <w:rPr>
+            <w:color w:val="2E74B5"/>
+            <w:u w:val="single"/>
+            <w:rFonts w:ascii="Calibri" w:hAnsi="Calibri"/>
+            <w:sz w:val="22"/>
+          </w:rPr>
+          <w:t>cost model</w:t>
+        </w:r>
+      </w:hyperlink>
+      <w:r>
+        <w:rPr>
+          <w:rFonts w:ascii="Calibri" w:hAnsi="Calibri"/>
+          <w:color w:val="000000"/>
+          <w:sz w:val="22"/>
+        </w:rPr>
+        <w:t>: direct pilot cash includes dongles, fixtures, labels or shipping, replacement reserve, and field support; it excludes NRE, loaner phones, formal certification, and lab capital unless a row explicitly states otherwise.</w:t>
       </w:r>
     </w:p>
     <w:p>
@@ -5507,7 +5526,7 @@
         </w:rPr>
         <w:t xml:space="preserve">VoiceKey uses a cascade because each stage can be inspected and replaced independently. A cascade is also a sensible starting point for English-Vietnamese: the </w:t>
       </w:r>
-      <w:hyperlink r:id="rId13">
+      <w:hyperlink r:id="rId14">
         <w:r>
           <w:rPr>
             <w:color w:val="2E74B5"/>
@@ -6010,11 +6029,11 @@
         <w:tblInd w:type="dxa" w:w="120"/>
       </w:tblPr>
       <w:tblGrid>
-        <w:gridCol w:w="1135"/>
-        <w:gridCol w:w="2464"/>
-        <w:gridCol w:w="1103"/>
-        <w:gridCol w:w="1738"/>
-        <w:gridCol w:w="2920"/>
+        <w:gridCol w:w="1128"/>
+        <w:gridCol w:w="2442"/>
+        <w:gridCol w:w="1115"/>
+        <w:gridCol w:w="1724"/>
+        <w:gridCol w:w="2951"/>
       </w:tblGrid>
       <w:tr>
         <w:trPr>
@@ -6023,7 +6042,7 @@
         </w:trPr>
         <w:tc>
           <w:tcPr>
-            <w:tcW w:type="dxa" w:w="1135"/>
+            <w:tcW w:type="dxa" w:w="1128"/>
             <w:vAlign w:val="center"/>
             <w:tcBorders>
               <w:top w:val="single" w:sz="4" w:space="0" w:color="D9E1EA"/>
@@ -6057,7 +6076,7 @@
         </w:tc>
         <w:tc>
           <w:tcPr>
-            <w:tcW w:type="dxa" w:w="2464"/>
+            <w:tcW w:type="dxa" w:w="2442"/>
             <w:vAlign w:val="center"/>
             <w:tcBorders>
               <w:top w:val="single" w:sz="4" w:space="0" w:color="D9E1EA"/>
@@ -6091,7 +6110,7 @@
         </w:tc>
         <w:tc>
           <w:tcPr>
-            <w:tcW w:type="dxa" w:w="1103"/>
+            <w:tcW w:type="dxa" w:w="1115"/>
             <w:vAlign w:val="center"/>
             <w:tcBorders>
               <w:top w:val="single" w:sz="4" w:space="0" w:color="D9E1EA"/>
@@ -6125,7 +6144,7 @@
         </w:tc>
         <w:tc>
           <w:tcPr>
-            <w:tcW w:type="dxa" w:w="1738"/>
+            <w:tcW w:type="dxa" w:w="1724"/>
             <w:vAlign w:val="center"/>
             <w:tcBorders>
               <w:top w:val="single" w:sz="4" w:space="0" w:color="D9E1EA"/>
@@ -6159,7 +6178,7 @@
         </w:tc>
         <w:tc>
           <w:tcPr>
-            <w:tcW w:type="dxa" w:w="2920"/>
+            <w:tcW w:type="dxa" w:w="2951"/>
             <w:vAlign w:val="center"/>
             <w:tcBorders>
               <w:top w:val="single" w:sz="4" w:space="0" w:color="D9E1EA"/>
@@ -6198,7 +6217,7 @@
         </w:trPr>
         <w:tc>
           <w:tcPr>
-            <w:tcW w:type="dxa" w:w="1135"/>
+            <w:tcW w:type="dxa" w:w="1128"/>
             <w:vAlign w:val="center"/>
             <w:tcBorders>
               <w:top w:val="single" w:sz="4" w:space="0" w:color="D9E1EA"/>
@@ -6230,7 +6249,7 @@
         </w:tc>
         <w:tc>
           <w:tcPr>
-            <w:tcW w:type="dxa" w:w="2464"/>
+            <w:tcW w:type="dxa" w:w="2442"/>
             <w:vAlign w:val="center"/>
             <w:tcBorders>
               <w:top w:val="single" w:sz="4" w:space="0" w:color="D9E1EA"/>
@@ -6258,7 +6277,7 @@
               </w:rPr>
               <w:t xml:space="preserve">Local VAD, such as </w:t>
             </w:r>
-            <w:hyperlink r:id="rId14">
+            <w:hyperlink r:id="rId15">
               <w:r>
                 <w:rPr>
                   <w:color w:val="2E74B5"/>
@@ -6273,7 +6292,7 @@
         </w:tc>
         <w:tc>
           <w:tcPr>
-            <w:tcW w:type="dxa" w:w="1103"/>
+            <w:tcW w:type="dxa" w:w="1115"/>
             <w:vAlign w:val="center"/>
             <w:tcBorders>
               <w:top w:val="single" w:sz="4" w:space="0" w:color="D9E1EA"/>
@@ -6305,7 +6324,7 @@
         </w:tc>
         <w:tc>
           <w:tcPr>
-            <w:tcW w:type="dxa" w:w="1738"/>
+            <w:tcW w:type="dxa" w:w="1724"/>
             <w:vAlign w:val="center"/>
             <w:tcBorders>
               <w:top w:val="single" w:sz="4" w:space="0" w:color="D9E1EA"/>
@@ -6337,7 +6356,7 @@
         </w:tc>
         <w:tc>
           <w:tcPr>
-            <w:tcW w:type="dxa" w:w="2920"/>
+            <w:tcW w:type="dxa" w:w="2951"/>
             <w:vAlign w:val="center"/>
             <w:tcBorders>
               <w:top w:val="single" w:sz="4" w:space="0" w:color="D9E1EA"/>
@@ -6374,7 +6393,7 @@
         </w:trPr>
         <w:tc>
           <w:tcPr>
-            <w:tcW w:type="dxa" w:w="1135"/>
+            <w:tcW w:type="dxa" w:w="1128"/>
             <w:vAlign w:val="center"/>
             <w:tcBorders>
               <w:top w:val="single" w:sz="4" w:space="0" w:color="D9E1EA"/>
@@ -6406,27 +6425,35 @@
         </w:tc>
         <w:tc>
           <w:tcPr>
-            <w:tcW w:type="dxa" w:w="2464"/>
-            <w:vAlign w:val="center"/>
-            <w:tcBorders>
-              <w:top w:val="single" w:sz="4" w:space="0" w:color="D9E1EA"/>
-              <w:left w:val="single" w:sz="4" w:space="0" w:color="D9E1EA"/>
-              <w:bottom w:val="single" w:sz="4" w:space="0" w:color="D9E1EA"/>
-              <w:right w:val="single" w:sz="4" w:space="0" w:color="D9E1EA"/>
-            </w:tcBorders>
-            <w:tcMar>
-              <w:top w:w="80" w:type="dxa"/>
-              <w:bottom w:w="80" w:type="dxa"/>
-              <w:start w:w="120" w:type="dxa"/>
-              <w:end w:w="120" w:type="dxa"/>
-            </w:tcMar>
-          </w:tcPr>
-          <w:p>
-            <w:pPr>
-              <w:spacing w:after="0" w:line="252" w:lineRule="auto"/>
-              <w:jc w:val="left"/>
-            </w:pPr>
-            <w:hyperlink r:id="rId15">
+            <w:tcW w:type="dxa" w:w="2442"/>
+            <w:vAlign w:val="center"/>
+            <w:tcBorders>
+              <w:top w:val="single" w:sz="4" w:space="0" w:color="D9E1EA"/>
+              <w:left w:val="single" w:sz="4" w:space="0" w:color="D9E1EA"/>
+              <w:bottom w:val="single" w:sz="4" w:space="0" w:color="D9E1EA"/>
+              <w:right w:val="single" w:sz="4" w:space="0" w:color="D9E1EA"/>
+            </w:tcBorders>
+            <w:tcMar>
+              <w:top w:w="80" w:type="dxa"/>
+              <w:bottom w:w="80" w:type="dxa"/>
+              <w:start w:w="120" w:type="dxa"/>
+              <w:end w:w="120" w:type="dxa"/>
+            </w:tcMar>
+          </w:tcPr>
+          <w:p>
+            <w:pPr>
+              <w:spacing w:after="0" w:line="252" w:lineRule="auto"/>
+              <w:jc w:val="left"/>
+            </w:pPr>
+            <w:r>
+              <w:rPr>
+                <w:rFonts w:ascii="Calibri" w:hAnsi="Calibri"/>
+                <w:color w:val="000000"/>
+                <w:sz w:val="17"/>
+              </w:rPr>
+              <w:t xml:space="preserve">Benchmark multilingual Whisper base and small variants through </w:t>
+            </w:r>
+            <w:hyperlink r:id="rId16">
               <w:r>
                 <w:rPr>
                   <w:color w:val="2E74B5"/>
@@ -6443,9 +6470,9 @@
                 <w:color w:val="000000"/>
                 <w:sz w:val="17"/>
               </w:rPr>
-              <w:t xml:space="preserve"> with a multilingual Whisper small baseline; Vietnamese-specific evaluation with </w:t>
-            </w:r>
-            <w:hyperlink r:id="rId16">
+              <w:t xml:space="preserve">; compare them with </w:t>
+            </w:r>
+            <w:hyperlink r:id="rId17">
               <w:r>
                 <w:rPr>
                   <w:color w:val="2E74B5"/>
@@ -6456,43 +6483,19 @@
                 <w:t>PhoWhisper</w:t>
               </w:r>
             </w:hyperlink>
-          </w:p>
-        </w:tc>
-        <w:tc>
-          <w:tcPr>
-            <w:tcW w:type="dxa" w:w="1103"/>
-            <w:vAlign w:val="center"/>
-            <w:tcBorders>
-              <w:top w:val="single" w:sz="4" w:space="0" w:color="D9E1EA"/>
-              <w:left w:val="single" w:sz="4" w:space="0" w:color="D9E1EA"/>
-              <w:bottom w:val="single" w:sz="4" w:space="0" w:color="D9E1EA"/>
-              <w:right w:val="single" w:sz="4" w:space="0" w:color="D9E1EA"/>
-            </w:tcBorders>
-            <w:tcMar>
-              <w:top w:w="80" w:type="dxa"/>
-              <w:bottom w:w="80" w:type="dxa"/>
-              <w:start w:w="120" w:type="dxa"/>
-              <w:end w:w="120" w:type="dxa"/>
-            </w:tcMar>
-          </w:tcPr>
-          <w:p>
-            <w:pPr>
-              <w:spacing w:after="0" w:line="252" w:lineRule="auto"/>
-              <w:jc w:val="left"/>
-            </w:pPr>
             <w:r>
               <w:rPr>
                 <w:rFonts w:ascii="Calibri" w:hAnsi="Calibri"/>
                 <w:color w:val="000000"/>
                 <w:sz w:val="17"/>
               </w:rPr>
-              <w:t>50 to 250 MB budget</w:t>
-            </w:r>
-          </w:p>
-        </w:tc>
-        <w:tc>
-          <w:tcPr>
-            <w:tcW w:type="dxa" w:w="1738"/>
+              <w:t xml:space="preserve"> variants on named Vietnamese ASR test sets</w:t>
+            </w:r>
+          </w:p>
+        </w:tc>
+        <w:tc>
+          <w:tcPr>
+            <w:tcW w:type="dxa" w:w="1115"/>
             <w:vAlign w:val="center"/>
             <w:tcBorders>
               <w:top w:val="single" w:sz="4" w:space="0" w:color="D9E1EA"/>
@@ -6518,13 +6521,13 @@
                 <w:color w:val="000000"/>
                 <w:sz w:val="17"/>
               </w:rPr>
-              <w:t>Partial update &lt;=500 ms after a one-second audio window; final text &lt;=1.0 s after endpoint</w:t>
-            </w:r>
-          </w:p>
-        </w:tc>
-        <w:tc>
-          <w:tcPr>
-            <w:tcW w:type="dxa" w:w="2920"/>
+              <w:t>Measured per candidate</w:t>
+            </w:r>
+          </w:p>
+        </w:tc>
+        <w:tc>
+          <w:tcPr>
+            <w:tcW w:type="dxa" w:w="1724"/>
             <w:vAlign w:val="center"/>
             <w:tcBorders>
               <w:top w:val="single" w:sz="4" w:space="0" w:color="D9E1EA"/>
@@ -6550,7 +6553,39 @@
                 <w:color w:val="000000"/>
                 <w:sz w:val="17"/>
               </w:rPr>
-              <w:t>Select after English-Vietnamese accuracy, memory, heat, and device test</w:t>
+              <w:t>Partial update &lt;=500 ms after a one-second audio window; final text &lt;=1.0 s after endpoint</w:t>
+            </w:r>
+          </w:p>
+        </w:tc>
+        <w:tc>
+          <w:tcPr>
+            <w:tcW w:type="dxa" w:w="2951"/>
+            <w:vAlign w:val="center"/>
+            <w:tcBorders>
+              <w:top w:val="single" w:sz="4" w:space="0" w:color="D9E1EA"/>
+              <w:left w:val="single" w:sz="4" w:space="0" w:color="D9E1EA"/>
+              <w:bottom w:val="single" w:sz="4" w:space="0" w:color="D9E1EA"/>
+              <w:right w:val="single" w:sz="4" w:space="0" w:color="D9E1EA"/>
+            </w:tcBorders>
+            <w:tcMar>
+              <w:top w:w="80" w:type="dxa"/>
+              <w:bottom w:w="80" w:type="dxa"/>
+              <w:start w:w="120" w:type="dxa"/>
+              <w:end w:w="120" w:type="dxa"/>
+            </w:tcMar>
+          </w:tcPr>
+          <w:p>
+            <w:pPr>
+              <w:spacing w:after="0" w:line="252" w:lineRule="auto"/>
+              <w:jc w:val="left"/>
+            </w:pPr>
+            <w:r>
+              <w:rPr>
+                <w:rFonts w:ascii="Calibri" w:hAnsi="Calibri"/>
+                <w:color w:val="000000"/>
+                <w:sz w:val="17"/>
+              </w:rPr>
+              <w:t>Record actual quantized file size, runtime memory, accuracy, heat, and latency. Do not assume one shared size band.</w:t>
             </w:r>
           </w:p>
         </w:tc>
@@ -6561,7 +6596,7 @@
         </w:trPr>
         <w:tc>
           <w:tcPr>
-            <w:tcW w:type="dxa" w:w="1135"/>
+            <w:tcW w:type="dxa" w:w="1128"/>
             <w:vAlign w:val="center"/>
             <w:tcBorders>
               <w:top w:val="single" w:sz="4" w:space="0" w:color="D9E1EA"/>
@@ -6593,27 +6628,27 @@
         </w:tc>
         <w:tc>
           <w:tcPr>
-            <w:tcW w:type="dxa" w:w="2464"/>
-            <w:vAlign w:val="center"/>
-            <w:tcBorders>
-              <w:top w:val="single" w:sz="4" w:space="0" w:color="D9E1EA"/>
-              <w:left w:val="single" w:sz="4" w:space="0" w:color="D9E1EA"/>
-              <w:bottom w:val="single" w:sz="4" w:space="0" w:color="D9E1EA"/>
-              <w:right w:val="single" w:sz="4" w:space="0" w:color="D9E1EA"/>
-            </w:tcBorders>
-            <w:tcMar>
-              <w:top w:w="80" w:type="dxa"/>
-              <w:bottom w:w="80" w:type="dxa"/>
-              <w:start w:w="120" w:type="dxa"/>
-              <w:end w:w="120" w:type="dxa"/>
-            </w:tcMar>
-          </w:tcPr>
-          <w:p>
-            <w:pPr>
-              <w:spacing w:after="0" w:line="252" w:lineRule="auto"/>
-              <w:jc w:val="left"/>
-            </w:pPr>
-            <w:hyperlink r:id="rId17">
+            <w:tcW w:type="dxa" w:w="2442"/>
+            <w:vAlign w:val="center"/>
+            <w:tcBorders>
+              <w:top w:val="single" w:sz="4" w:space="0" w:color="D9E1EA"/>
+              <w:left w:val="single" w:sz="4" w:space="0" w:color="D9E1EA"/>
+              <w:bottom w:val="single" w:sz="4" w:space="0" w:color="D9E1EA"/>
+              <w:right w:val="single" w:sz="4" w:space="0" w:color="D9E1EA"/>
+            </w:tcBorders>
+            <w:tcMar>
+              <w:top w:w="80" w:type="dxa"/>
+              <w:bottom w:w="80" w:type="dxa"/>
+              <w:start w:w="120" w:type="dxa"/>
+              <w:end w:w="120" w:type="dxa"/>
+            </w:tcMar>
+          </w:tcPr>
+          <w:p>
+            <w:pPr>
+              <w:spacing w:after="0" w:line="252" w:lineRule="auto"/>
+              <w:jc w:val="left"/>
+            </w:pPr>
+            <w:hyperlink r:id="rId18">
               <w:r>
                 <w:rPr>
                   <w:color w:val="2E74B5"/>
@@ -6632,7 +6667,7 @@
               </w:rPr>
               <w:t xml:space="preserve"> and </w:t>
             </w:r>
-            <w:hyperlink r:id="rId18">
+            <w:hyperlink r:id="rId19">
               <w:r>
                 <w:rPr>
                   <w:color w:val="2E74B5"/>
@@ -6655,7 +6690,7 @@
         </w:tc>
         <w:tc>
           <w:tcPr>
-            <w:tcW w:type="dxa" w:w="1103"/>
+            <w:tcW w:type="dxa" w:w="1115"/>
             <w:vAlign w:val="center"/>
             <w:tcBorders>
               <w:top w:val="single" w:sz="4" w:space="0" w:color="D9E1EA"/>
@@ -6687,7 +6722,7 @@
         </w:tc>
         <w:tc>
           <w:tcPr>
-            <w:tcW w:type="dxa" w:w="1738"/>
+            <w:tcW w:type="dxa" w:w="1724"/>
             <w:vAlign w:val="center"/>
             <w:tcBorders>
               <w:top w:val="single" w:sz="4" w:space="0" w:color="D9E1EA"/>
@@ -6719,7 +6754,7 @@
         </w:tc>
         <w:tc>
           <w:tcPr>
-            <w:tcW w:type="dxa" w:w="2920"/>
+            <w:tcW w:type="dxa" w:w="2951"/>
             <w:vAlign w:val="center"/>
             <w:tcBorders>
               <w:top w:val="single" w:sz="4" w:space="0" w:color="D9E1EA"/>
@@ -6756,7 +6791,7 @@
         </w:trPr>
         <w:tc>
           <w:tcPr>
-            <w:tcW w:type="dxa" w:w="1135"/>
+            <w:tcW w:type="dxa" w:w="1128"/>
             <w:vAlign w:val="center"/>
             <w:tcBorders>
               <w:top w:val="single" w:sz="4" w:space="0" w:color="D9E1EA"/>
@@ -6788,7 +6823,7 @@
         </w:tc>
         <w:tc>
           <w:tcPr>
-            <w:tcW w:type="dxa" w:w="2464"/>
+            <w:tcW w:type="dxa" w:w="2442"/>
             <w:vAlign w:val="center"/>
             <w:tcBorders>
               <w:top w:val="single" w:sz="4" w:space="0" w:color="D9E1EA"/>
@@ -6816,7 +6851,7 @@
               </w:rPr>
               <w:t xml:space="preserve">Local runtime such as </w:t>
             </w:r>
-            <w:hyperlink r:id="rId19">
+            <w:hyperlink r:id="rId20">
               <w:r>
                 <w:rPr>
                   <w:color w:val="2E74B5"/>
@@ -6839,7 +6874,7 @@
         </w:tc>
         <w:tc>
           <w:tcPr>
-            <w:tcW w:type="dxa" w:w="1103"/>
+            <w:tcW w:type="dxa" w:w="1115"/>
             <w:vAlign w:val="center"/>
             <w:tcBorders>
               <w:top w:val="single" w:sz="4" w:space="0" w:color="D9E1EA"/>
@@ -6871,7 +6906,7 @@
         </w:tc>
         <w:tc>
           <w:tcPr>
-            <w:tcW w:type="dxa" w:w="1738"/>
+            <w:tcW w:type="dxa" w:w="1724"/>
             <w:vAlign w:val="center"/>
             <w:tcBorders>
               <w:top w:val="single" w:sz="4" w:space="0" w:color="D9E1EA"/>
@@ -6903,7 +6938,7 @@
         </w:tc>
         <w:tc>
           <w:tcPr>
-            <w:tcW w:type="dxa" w:w="2920"/>
+            <w:tcW w:type="dxa" w:w="2951"/>
             <w:vAlign w:val="center"/>
             <w:tcBorders>
               <w:top w:val="single" w:sz="4" w:space="0" w:color="D9E1EA"/>
@@ -6940,7 +6975,7 @@
         </w:trPr>
         <w:tc>
           <w:tcPr>
-            <w:tcW w:type="dxa" w:w="1135"/>
+            <w:tcW w:type="dxa" w:w="1128"/>
             <w:vAlign w:val="center"/>
             <w:tcBorders>
               <w:top w:val="single" w:sz="4" w:space="0" w:color="D9E1EA"/>
@@ -6972,7 +7007,7 @@
         </w:tc>
         <w:tc>
           <w:tcPr>
-            <w:tcW w:type="dxa" w:w="2464"/>
+            <w:tcW w:type="dxa" w:w="2442"/>
             <w:vAlign w:val="center"/>
             <w:tcBorders>
               <w:top w:val="single" w:sz="4" w:space="0" w:color="D9E1EA"/>
@@ -7004,7 +7039,7 @@
         </w:tc>
         <w:tc>
           <w:tcPr>
-            <w:tcW w:type="dxa" w:w="1103"/>
+            <w:tcW w:type="dxa" w:w="1115"/>
             <w:vAlign w:val="center"/>
             <w:tcBorders>
               <w:top w:val="single" w:sz="4" w:space="0" w:color="D9E1EA"/>
@@ -7036,7 +7071,7 @@
         </w:tc>
         <w:tc>
           <w:tcPr>
-            <w:tcW w:type="dxa" w:w="1738"/>
+            <w:tcW w:type="dxa" w:w="1724"/>
             <w:vAlign w:val="center"/>
             <w:tcBorders>
               <w:top w:val="single" w:sz="4" w:space="0" w:color="D9E1EA"/>
@@ -7068,7 +7103,7 @@
         </w:tc>
         <w:tc>
           <w:tcPr>
-            <w:tcW w:type="dxa" w:w="2920"/>
+            <w:tcW w:type="dxa" w:w="2951"/>
             <w:vAlign w:val="center"/>
             <w:tcBorders>
               <w:top w:val="single" w:sz="4" w:space="0" w:color="D9E1EA"/>
@@ -7115,7 +7150,7 @@
         </w:rPr>
         <w:t xml:space="preserve">The </w:t>
       </w:r>
-      <w:hyperlink r:id="rId20">
+      <w:hyperlink r:id="rId21">
         <w:r>
           <w:rPr>
             <w:color w:val="2E74B5"/>
@@ -7134,7 +7169,7 @@
         </w:rPr>
         <w:t xml:space="preserve"> says the released models are not real-time out of the box. VoiceKey therefore treats every model, quantization level, runtime, phone, and language pack as a benchmark decision. </w:t>
       </w:r>
-      <w:hyperlink r:id="rId21">
+      <w:hyperlink r:id="rId22">
         <w:r>
           <w:rPr>
             <w:color w:val="2E74B5"/>
@@ -8309,7 +8344,7 @@
                 <w:color w:val="000000"/>
                 <w:sz w:val="18"/>
               </w:rPr>
-              <w:t>All required turns pass in Airplane Mode; no hidden network request, crash, or route loss during the 30-minute session</w:t>
+              <w:t>All required turns pass both in Airplane Mode and in a network-enabled capture test that records zero VoiceKey outbound connections after the verified local pack is installed. Report the pack version and hash, capture method, crashes, and route losses for the 30-minute session.</w:t>
             </w:r>
           </w:p>
         </w:tc>
@@ -9555,7 +9590,7 @@
         </w:rPr>
         <w:t xml:space="preserve">Two current embedded platforms illustrate the future Edge hardware class. Qualcomm documents the </w:t>
       </w:r>
-      <w:hyperlink r:id="rId22">
+      <w:hyperlink r:id="rId23">
         <w:r>
           <w:rPr>
             <w:color w:val="2E74B5"/>
@@ -9574,7 +9609,7 @@
         </w:rPr>
         <w:t xml:space="preserve"> with up to 12 dense TOPS and up to 16 GB LPDDR5. MediaTek documents the </w:t>
       </w:r>
-      <w:hyperlink r:id="rId23">
+      <w:hyperlink r:id="rId24">
         <w:r>
           <w:rPr>
             <w:color w:val="2E74B5"/>
@@ -9812,7 +9847,7 @@
               <w:spacing w:after="0" w:line="252" w:lineRule="auto"/>
               <w:jc w:val="left"/>
             </w:pPr>
-            <w:hyperlink r:id="rId24">
+            <w:hyperlink r:id="rId25">
               <w:r>
                 <w:rPr>
                   <w:color w:val="2E74B5"/>
@@ -10308,7 +10343,7 @@
         </w:rPr>
         <w:t xml:space="preserve">Android is the first platform because it documents USB host and accessory communication, USB audio, and microphone capture APIs. Actual behavior still needs a supported-phone matrix and route verification. </w:t>
       </w:r>
-      <w:hyperlink r:id="rId25">
+      <w:hyperlink r:id="rId26">
         <w:r>
           <w:rPr>
             <w:color w:val="2E74B5"/>
@@ -10327,7 +10362,7 @@
         </w:rPr>
         <w:t xml:space="preserve"> </w:t>
       </w:r>
-      <w:hyperlink r:id="rId26">
+      <w:hyperlink r:id="rId27">
         <w:r>
           <w:rPr>
             <w:color w:val="2E74B5"/>
@@ -10346,7 +10381,7 @@
         </w:rPr>
         <w:t xml:space="preserve"> </w:t>
       </w:r>
-      <w:hyperlink r:id="rId27">
+      <w:hyperlink r:id="rId28">
         <w:r>
           <w:rPr>
             <w:color w:val="2E74B5"/>
@@ -10366,9 +10401,9 @@
           <w:color w:val="000000"/>
           <w:sz w:val="22"/>
         </w:rPr>
-        <w:t xml:space="preserve">iOS can support a phone-only experience through the built-in microphone and speaker using </w:t>
+        <w:t xml:space="preserve">iOS can first be evaluated as a phone-only app using the built-in microphone and speaker through </w:t>
       </w:r>
-      <w:hyperlink r:id="rId28">
+      <w:hyperlink r:id="rId29">
         <w:r>
           <w:rPr>
             <w:color w:val="2E74B5"/>
@@ -10385,26 +10420,7 @@
           <w:color w:val="000000"/>
           <w:sz w:val="22"/>
         </w:rPr>
-        <w:t xml:space="preserve">. Apple now publishes a preliminary </w:t>
-      </w:r>
-      <w:hyperlink r:id="rId29">
-        <w:r>
-          <w:rPr>
-            <w:color w:val="2E74B5"/>
-            <w:u w:val="single"/>
-            <w:rFonts w:ascii="Calibri" w:hAnsi="Calibri"/>
-            <w:sz w:val="22"/>
-          </w:rPr>
-          <w:t>AccessoryAccess</w:t>
-        </w:r>
-      </w:hyperlink>
-      <w:r>
-        <w:rPr>
-          <w:rFonts w:ascii="Calibri" w:hAnsi="Calibri"/>
-          <w:color w:val="000000"/>
-          <w:sz w:val="22"/>
-        </w:rPr>
-        <w:t xml:space="preserve"> framework for connected USB accessories, while its established </w:t>
+        <w:t xml:space="preserve">. Apple's </w:t>
       </w:r>
       <w:hyperlink r:id="rId30">
         <w:r>
@@ -10414,7 +10430,7 @@
             <w:rFonts w:ascii="Calibri" w:hAnsi="Calibri"/>
             <w:sz w:val="22"/>
           </w:rPr>
-          <w:t>External Accessory</w:t>
+          <w:t>AccessoryAccess USB entitlement</w:t>
         </w:r>
       </w:hyperlink>
       <w:r>
@@ -10423,7 +10439,7 @@
           <w:color w:val="000000"/>
           <w:sz w:val="22"/>
         </w:rPr>
-        <w:t xml:space="preserve"> documentation is associated with MFi accessories. That is not a finished custom-USB product path for VoiceKey, so iOS is a later validation track.</w:t>
+        <w:t xml:space="preserve"> is for macOS USB access, not an iOS USB-accessory path. A custom wired iPhone accessory is out of scope until it is demonstrated on a current Apple-supported iOS framework and hardware.</w:t>
       </w:r>
     </w:p>
     <w:p>
@@ -11587,7 +11603,7 @@
           <w:color w:val="000000"/>
           <w:sz w:val="22"/>
         </w:rPr>
-        <w:t xml:space="preserve">The component anchors include an </w:t>
+        <w:t xml:space="preserve">The public anchors cover the </w:t>
       </w:r>
       <w:hyperlink r:id="rId31">
         <w:r>
@@ -11597,7 +11613,7 @@
             <w:rFonts w:ascii="Calibri" w:hAnsi="Calibri"/>
             <w:sz w:val="22"/>
           </w:rPr>
-          <w:t>STUSB4500 controller class</w:t>
+          <w:t>STM32U575 MCU</w:t>
         </w:r>
       </w:hyperlink>
       <w:r>
@@ -11616,25 +11632,6 @@
             <w:rFonts w:ascii="Calibri" w:hAnsi="Calibri"/>
             <w:sz w:val="22"/>
           </w:rPr>
-          <w:t>STM32U575 listing</w:t>
-        </w:r>
-      </w:hyperlink>
-      <w:r>
-        <w:rPr>
-          <w:rFonts w:ascii="Calibri" w:hAnsi="Calibri"/>
-          <w:color w:val="000000"/>
-          <w:sz w:val="22"/>
-        </w:rPr>
-        <w:t xml:space="preserve">, </w:t>
-      </w:r>
-      <w:hyperlink r:id="rId33">
-        <w:r>
-          <w:rPr>
-            <w:color w:val="2E74B5"/>
-            <w:u w:val="single"/>
-            <w:rFonts w:ascii="Calibri" w:hAnsi="Calibri"/>
-            <w:sz w:val="22"/>
-          </w:rPr>
           <w:t>TLV320AIC3263 codec</w:t>
         </w:r>
       </w:hyperlink>
@@ -11646,6 +11643,25 @@
         </w:rPr>
         <w:t xml:space="preserve">, and </w:t>
       </w:r>
+      <w:hyperlink r:id="rId33">
+        <w:r>
+          <w:rPr>
+            <w:color w:val="2E74B5"/>
+            <w:u w:val="single"/>
+            <w:rFonts w:ascii="Calibri" w:hAnsi="Calibri"/>
+            <w:sz w:val="22"/>
+          </w:rPr>
+          <w:t>SPH0655 digital microphone</w:t>
+        </w:r>
+      </w:hyperlink>
+      <w:r>
+        <w:rPr>
+          <w:rFonts w:ascii="Calibri" w:hAnsi="Calibri"/>
+          <w:color w:val="000000"/>
+          <w:sz w:val="22"/>
+        </w:rPr>
+        <w:t xml:space="preserve">. The </w:t>
+      </w:r>
       <w:hyperlink r:id="rId34">
         <w:r>
           <w:rPr>
@@ -11654,7 +11670,7 @@
             <w:rFonts w:ascii="Calibri" w:hAnsi="Calibri"/>
             <w:sz w:val="22"/>
           </w:rPr>
-          <w:t>SPH0655 digital microphone listing</w:t>
+          <w:t>STUSB4500</w:t>
         </w:r>
       </w:hyperlink>
       <w:r>
@@ -11663,7 +11679,7 @@
           <w:color w:val="000000"/>
           <w:sz w:val="22"/>
         </w:rPr>
-        <w:t>. Assembly, enclosure, test, and manufacturing yield still need supplier quotes.</w:t>
+        <w:t xml:space="preserve"> is an alternative sink and PD-controller reference only. It is excluded from the v1 passive USB-device CC BOM unless the selected schematic explicitly changes to a controller-based topology. Assembly, enclosure, test, and manufacturing yield still need supplier quotes.</w:t>
       </w:r>
     </w:p>
     <w:tbl>
@@ -14477,7 +14493,7 @@
           <w:color w:val="000000"/>
           <w:sz w:val="22"/>
         </w:rPr>
-        <w:t>All required models and voices are in a signed local pack before the conversation begins.</w:t>
+        <w:t>Each pack contains a versioned manifest signed by a release key pinned in the app. Before activation, the app verifies the manifest signature and listed file hashes and rejects unsigned, tampered, or revoked packs. Key rotation and rollback behavior are release tests.</w:t>
       </w:r>
     </w:p>
     <w:p>
@@ -16062,7 +16078,7 @@
                 <w:color w:val="000000"/>
                 <w:sz w:val="17"/>
               </w:rPr>
-              <w:t>Run short two-person turns in Airplane Mode with visible source text, translation, and timing</w:t>
+              <w:t>Run short two-person turns in Airplane Mode and the network-enabled no-egress capture test, with visible source text, translation, and timing</w:t>
             </w:r>
           </w:p>
         </w:tc>
@@ -17468,9 +17484,9 @@
         <w:tblInd w:type="dxa" w:w="120"/>
       </w:tblPr>
       <w:tblGrid>
-        <w:gridCol w:w="1280"/>
-        <w:gridCol w:w="4419"/>
-        <w:gridCol w:w="3661"/>
+        <w:gridCol w:w="1232"/>
+        <w:gridCol w:w="4302"/>
+        <w:gridCol w:w="3826"/>
       </w:tblGrid>
       <w:tr>
         <w:trPr>
@@ -17479,7 +17495,7 @@
         </w:trPr>
         <w:tc>
           <w:tcPr>
-            <w:tcW w:type="dxa" w:w="1280"/>
+            <w:tcW w:type="dxa" w:w="1232"/>
             <w:vAlign w:val="center"/>
             <w:tcBorders>
               <w:top w:val="single" w:sz="4" w:space="0" w:color="D9E1EA"/>
@@ -17513,7 +17529,7 @@
         </w:tc>
         <w:tc>
           <w:tcPr>
-            <w:tcW w:type="dxa" w:w="4419"/>
+            <w:tcW w:type="dxa" w:w="4302"/>
             <w:vAlign w:val="center"/>
             <w:tcBorders>
               <w:top w:val="single" w:sz="4" w:space="0" w:color="D9E1EA"/>
@@ -17547,7 +17563,7 @@
         </w:tc>
         <w:tc>
           <w:tcPr>
-            <w:tcW w:type="dxa" w:w="3661"/>
+            <w:tcW w:type="dxa" w:w="3826"/>
             <w:vAlign w:val="center"/>
             <w:tcBorders>
               <w:top w:val="single" w:sz="4" w:space="0" w:color="D9E1EA"/>
@@ -17586,27 +17602,27 @@
         </w:trPr>
         <w:tc>
           <w:tcPr>
-            <w:tcW w:type="dxa" w:w="1280"/>
-            <w:vAlign w:val="center"/>
-            <w:tcBorders>
-              <w:top w:val="single" w:sz="4" w:space="0" w:color="D9E1EA"/>
-              <w:left w:val="single" w:sz="4" w:space="0" w:color="D9E1EA"/>
-              <w:bottom w:val="single" w:sz="4" w:space="0" w:color="D9E1EA"/>
-              <w:right w:val="single" w:sz="4" w:space="0" w:color="D9E1EA"/>
-            </w:tcBorders>
-            <w:tcMar>
-              <w:top w:w="80" w:type="dxa"/>
-              <w:bottom w:w="80" w:type="dxa"/>
-              <w:start w:w="120" w:type="dxa"/>
-              <w:end w:w="120" w:type="dxa"/>
-            </w:tcMar>
-          </w:tcPr>
-          <w:p>
-            <w:pPr>
-              <w:spacing w:after="0" w:line="252" w:lineRule="auto"/>
-              <w:jc w:val="left"/>
-            </w:pPr>
-            <w:hyperlink r:id="rId13">
+            <w:tcW w:type="dxa" w:w="1232"/>
+            <w:vAlign w:val="center"/>
+            <w:tcBorders>
+              <w:top w:val="single" w:sz="4" w:space="0" w:color="D9E1EA"/>
+              <w:left w:val="single" w:sz="4" w:space="0" w:color="D9E1EA"/>
+              <w:bottom w:val="single" w:sz="4" w:space="0" w:color="D9E1EA"/>
+              <w:right w:val="single" w:sz="4" w:space="0" w:color="D9E1EA"/>
+            </w:tcBorders>
+            <w:tcMar>
+              <w:top w:w="80" w:type="dxa"/>
+              <w:bottom w:w="80" w:type="dxa"/>
+              <w:start w:w="120" w:type="dxa"/>
+              <w:end w:w="120" w:type="dxa"/>
+            </w:tcMar>
+          </w:tcPr>
+          <w:p>
+            <w:pPr>
+              <w:spacing w:after="0" w:line="252" w:lineRule="auto"/>
+              <w:jc w:val="left"/>
+            </w:pPr>
+            <w:hyperlink r:id="rId14">
               <w:r>
                 <w:rPr>
                   <w:color w:val="2E74B5"/>
@@ -17621,7 +17637,7 @@
         </w:tc>
         <w:tc>
           <w:tcPr>
-            <w:tcW w:type="dxa" w:w="4419"/>
+            <w:tcW w:type="dxa" w:w="4302"/>
             <w:vAlign w:val="center"/>
             <w:tcBorders>
               <w:top w:val="single" w:sz="4" w:space="0" w:color="D9E1EA"/>
@@ -17653,7 +17669,7 @@
         </w:tc>
         <w:tc>
           <w:tcPr>
-            <w:tcW w:type="dxa" w:w="3661"/>
+            <w:tcW w:type="dxa" w:w="3826"/>
             <w:vAlign w:val="center"/>
             <w:tcBorders>
               <w:top w:val="single" w:sz="4" w:space="0" w:color="D9E1EA"/>
@@ -17690,27 +17706,27 @@
         </w:trPr>
         <w:tc>
           <w:tcPr>
-            <w:tcW w:type="dxa" w:w="1280"/>
-            <w:vAlign w:val="center"/>
-            <w:tcBorders>
-              <w:top w:val="single" w:sz="4" w:space="0" w:color="D9E1EA"/>
-              <w:left w:val="single" w:sz="4" w:space="0" w:color="D9E1EA"/>
-              <w:bottom w:val="single" w:sz="4" w:space="0" w:color="D9E1EA"/>
-              <w:right w:val="single" w:sz="4" w:space="0" w:color="D9E1EA"/>
-            </w:tcBorders>
-            <w:tcMar>
-              <w:top w:w="80" w:type="dxa"/>
-              <w:bottom w:w="80" w:type="dxa"/>
-              <w:start w:w="120" w:type="dxa"/>
-              <w:end w:w="120" w:type="dxa"/>
-            </w:tcMar>
-          </w:tcPr>
-          <w:p>
-            <w:pPr>
-              <w:spacing w:after="0" w:line="252" w:lineRule="auto"/>
-              <w:jc w:val="left"/>
-            </w:pPr>
-            <w:hyperlink r:id="rId16">
+            <w:tcW w:type="dxa" w:w="1232"/>
+            <w:vAlign w:val="center"/>
+            <w:tcBorders>
+              <w:top w:val="single" w:sz="4" w:space="0" w:color="D9E1EA"/>
+              <w:left w:val="single" w:sz="4" w:space="0" w:color="D9E1EA"/>
+              <w:bottom w:val="single" w:sz="4" w:space="0" w:color="D9E1EA"/>
+              <w:right w:val="single" w:sz="4" w:space="0" w:color="D9E1EA"/>
+            </w:tcBorders>
+            <w:tcMar>
+              <w:top w:w="80" w:type="dxa"/>
+              <w:bottom w:w="80" w:type="dxa"/>
+              <w:start w:w="120" w:type="dxa"/>
+              <w:end w:w="120" w:type="dxa"/>
+            </w:tcMar>
+          </w:tcPr>
+          <w:p>
+            <w:pPr>
+              <w:spacing w:after="0" w:line="252" w:lineRule="auto"/>
+              <w:jc w:val="left"/>
+            </w:pPr>
+            <w:hyperlink r:id="rId17">
               <w:r>
                 <w:rPr>
                   <w:color w:val="2E74B5"/>
@@ -17725,7 +17741,7 @@
         </w:tc>
         <w:tc>
           <w:tcPr>
-            <w:tcW w:type="dxa" w:w="4419"/>
+            <w:tcW w:type="dxa" w:w="4302"/>
             <w:vAlign w:val="center"/>
             <w:tcBorders>
               <w:top w:val="single" w:sz="4" w:space="0" w:color="D9E1EA"/>
@@ -17757,7 +17773,7 @@
         </w:tc>
         <w:tc>
           <w:tcPr>
-            <w:tcW w:type="dxa" w:w="3661"/>
+            <w:tcW w:type="dxa" w:w="3826"/>
             <w:vAlign w:val="center"/>
             <w:tcBorders>
               <w:top w:val="single" w:sz="4" w:space="0" w:color="D9E1EA"/>
@@ -17794,27 +17810,27 @@
         </w:trPr>
         <w:tc>
           <w:tcPr>
-            <w:tcW w:type="dxa" w:w="1280"/>
-            <w:vAlign w:val="center"/>
-            <w:tcBorders>
-              <w:top w:val="single" w:sz="4" w:space="0" w:color="D9E1EA"/>
-              <w:left w:val="single" w:sz="4" w:space="0" w:color="D9E1EA"/>
-              <w:bottom w:val="single" w:sz="4" w:space="0" w:color="D9E1EA"/>
-              <w:right w:val="single" w:sz="4" w:space="0" w:color="D9E1EA"/>
-            </w:tcBorders>
-            <w:tcMar>
-              <w:top w:w="80" w:type="dxa"/>
-              <w:bottom w:w="80" w:type="dxa"/>
-              <w:start w:w="120" w:type="dxa"/>
-              <w:end w:w="120" w:type="dxa"/>
-            </w:tcMar>
-          </w:tcPr>
-          <w:p>
-            <w:pPr>
-              <w:spacing w:after="0" w:line="252" w:lineRule="auto"/>
-              <w:jc w:val="left"/>
-            </w:pPr>
-            <w:hyperlink r:id="rId21">
+            <w:tcW w:type="dxa" w:w="1232"/>
+            <w:vAlign w:val="center"/>
+            <w:tcBorders>
+              <w:top w:val="single" w:sz="4" w:space="0" w:color="D9E1EA"/>
+              <w:left w:val="single" w:sz="4" w:space="0" w:color="D9E1EA"/>
+              <w:bottom w:val="single" w:sz="4" w:space="0" w:color="D9E1EA"/>
+              <w:right w:val="single" w:sz="4" w:space="0" w:color="D9E1EA"/>
+            </w:tcBorders>
+            <w:tcMar>
+              <w:top w:w="80" w:type="dxa"/>
+              <w:bottom w:w="80" w:type="dxa"/>
+              <w:start w:w="120" w:type="dxa"/>
+              <w:end w:w="120" w:type="dxa"/>
+            </w:tcMar>
+          </w:tcPr>
+          <w:p>
+            <w:pPr>
+              <w:spacing w:after="0" w:line="252" w:lineRule="auto"/>
+              <w:jc w:val="left"/>
+            </w:pPr>
+            <w:hyperlink r:id="rId22">
               <w:r>
                 <w:rPr>
                   <w:color w:val="2E74B5"/>
@@ -17829,7 +17845,7 @@
         </w:tc>
         <w:tc>
           <w:tcPr>
-            <w:tcW w:type="dxa" w:w="4419"/>
+            <w:tcW w:type="dxa" w:w="4302"/>
             <w:vAlign w:val="center"/>
             <w:tcBorders>
               <w:top w:val="single" w:sz="4" w:space="0" w:color="D9E1EA"/>
@@ -17861,7 +17877,7 @@
         </w:tc>
         <w:tc>
           <w:tcPr>
-            <w:tcW w:type="dxa" w:w="3661"/>
+            <w:tcW w:type="dxa" w:w="3826"/>
             <w:vAlign w:val="center"/>
             <w:tcBorders>
               <w:top w:val="single" w:sz="4" w:space="0" w:color="D9E1EA"/>
@@ -17898,27 +17914,27 @@
         </w:trPr>
         <w:tc>
           <w:tcPr>
-            <w:tcW w:type="dxa" w:w="1280"/>
-            <w:vAlign w:val="center"/>
-            <w:tcBorders>
-              <w:top w:val="single" w:sz="4" w:space="0" w:color="D9E1EA"/>
-              <w:left w:val="single" w:sz="4" w:space="0" w:color="D9E1EA"/>
-              <w:bottom w:val="single" w:sz="4" w:space="0" w:color="D9E1EA"/>
-              <w:right w:val="single" w:sz="4" w:space="0" w:color="D9E1EA"/>
-            </w:tcBorders>
-            <w:tcMar>
-              <w:top w:w="80" w:type="dxa"/>
-              <w:bottom w:w="80" w:type="dxa"/>
-              <w:start w:w="120" w:type="dxa"/>
-              <w:end w:w="120" w:type="dxa"/>
-            </w:tcMar>
-          </w:tcPr>
-          <w:p>
-            <w:pPr>
-              <w:spacing w:after="0" w:line="252" w:lineRule="auto"/>
-              <w:jc w:val="left"/>
-            </w:pPr>
-            <w:hyperlink r:id="rId20">
+            <w:tcW w:type="dxa" w:w="1232"/>
+            <w:vAlign w:val="center"/>
+            <w:tcBorders>
+              <w:top w:val="single" w:sz="4" w:space="0" w:color="D9E1EA"/>
+              <w:left w:val="single" w:sz="4" w:space="0" w:color="D9E1EA"/>
+              <w:bottom w:val="single" w:sz="4" w:space="0" w:color="D9E1EA"/>
+              <w:right w:val="single" w:sz="4" w:space="0" w:color="D9E1EA"/>
+            </w:tcBorders>
+            <w:tcMar>
+              <w:top w:w="80" w:type="dxa"/>
+              <w:bottom w:w="80" w:type="dxa"/>
+              <w:start w:w="120" w:type="dxa"/>
+              <w:end w:w="120" w:type="dxa"/>
+            </w:tcMar>
+          </w:tcPr>
+          <w:p>
+            <w:pPr>
+              <w:spacing w:after="0" w:line="252" w:lineRule="auto"/>
+              <w:jc w:val="left"/>
+            </w:pPr>
+            <w:hyperlink r:id="rId21">
               <w:r>
                 <w:rPr>
                   <w:color w:val="2E74B5"/>
@@ -17933,7 +17949,7 @@
         </w:tc>
         <w:tc>
           <w:tcPr>
-            <w:tcW w:type="dxa" w:w="4419"/>
+            <w:tcW w:type="dxa" w:w="4302"/>
             <w:vAlign w:val="center"/>
             <w:tcBorders>
               <w:top w:val="single" w:sz="4" w:space="0" w:color="D9E1EA"/>
@@ -17965,7 +17981,7 @@
         </w:tc>
         <w:tc>
           <w:tcPr>
-            <w:tcW w:type="dxa" w:w="3661"/>
+            <w:tcW w:type="dxa" w:w="3826"/>
             <w:vAlign w:val="center"/>
             <w:tcBorders>
               <w:top w:val="single" w:sz="4" w:space="0" w:color="D9E1EA"/>
@@ -18002,27 +18018,27 @@
         </w:trPr>
         <w:tc>
           <w:tcPr>
-            <w:tcW w:type="dxa" w:w="1280"/>
-            <w:vAlign w:val="center"/>
-            <w:tcBorders>
-              <w:top w:val="single" w:sz="4" w:space="0" w:color="D9E1EA"/>
-              <w:left w:val="single" w:sz="4" w:space="0" w:color="D9E1EA"/>
-              <w:bottom w:val="single" w:sz="4" w:space="0" w:color="D9E1EA"/>
-              <w:right w:val="single" w:sz="4" w:space="0" w:color="D9E1EA"/>
-            </w:tcBorders>
-            <w:tcMar>
-              <w:top w:w="80" w:type="dxa"/>
-              <w:bottom w:w="80" w:type="dxa"/>
-              <w:start w:w="120" w:type="dxa"/>
-              <w:end w:w="120" w:type="dxa"/>
-            </w:tcMar>
-          </w:tcPr>
-          <w:p>
-            <w:pPr>
-              <w:spacing w:after="0" w:line="252" w:lineRule="auto"/>
-              <w:jc w:val="left"/>
-            </w:pPr>
-            <w:hyperlink r:id="rId15">
+            <w:tcW w:type="dxa" w:w="1232"/>
+            <w:vAlign w:val="center"/>
+            <w:tcBorders>
+              <w:top w:val="single" w:sz="4" w:space="0" w:color="D9E1EA"/>
+              <w:left w:val="single" w:sz="4" w:space="0" w:color="D9E1EA"/>
+              <w:bottom w:val="single" w:sz="4" w:space="0" w:color="D9E1EA"/>
+              <w:right w:val="single" w:sz="4" w:space="0" w:color="D9E1EA"/>
+            </w:tcBorders>
+            <w:tcMar>
+              <w:top w:w="80" w:type="dxa"/>
+              <w:bottom w:w="80" w:type="dxa"/>
+              <w:start w:w="120" w:type="dxa"/>
+              <w:end w:w="120" w:type="dxa"/>
+            </w:tcMar>
+          </w:tcPr>
+          <w:p>
+            <w:pPr>
+              <w:spacing w:after="0" w:line="252" w:lineRule="auto"/>
+              <w:jc w:val="left"/>
+            </w:pPr>
+            <w:hyperlink r:id="rId16">
               <w:r>
                 <w:rPr>
                   <w:color w:val="2E74B5"/>
@@ -18041,7 +18057,7 @@
               </w:rPr>
               <w:t xml:space="preserve"> and </w:t>
             </w:r>
-            <w:hyperlink r:id="rId17">
+            <w:hyperlink r:id="rId18">
               <w:r>
                 <w:rPr>
                   <w:color w:val="2E74B5"/>
@@ -18060,7 +18076,7 @@
               </w:rPr>
               <w:t xml:space="preserve"> / </w:t>
             </w:r>
-            <w:hyperlink r:id="rId18">
+            <w:hyperlink r:id="rId19">
               <w:r>
                 <w:rPr>
                   <w:color w:val="2E74B5"/>
@@ -18075,7 +18091,7 @@
         </w:tc>
         <w:tc>
           <w:tcPr>
-            <w:tcW w:type="dxa" w:w="4419"/>
+            <w:tcW w:type="dxa" w:w="4302"/>
             <w:vAlign w:val="center"/>
             <w:tcBorders>
               <w:top w:val="single" w:sz="4" w:space="0" w:color="D9E1EA"/>
@@ -18107,7 +18123,7 @@
         </w:tc>
         <w:tc>
           <w:tcPr>
-            <w:tcW w:type="dxa" w:w="3661"/>
+            <w:tcW w:type="dxa" w:w="3826"/>
             <w:vAlign w:val="center"/>
             <w:tcBorders>
               <w:top w:val="single" w:sz="4" w:space="0" w:color="D9E1EA"/>
@@ -18144,27 +18160,27 @@
         </w:trPr>
         <w:tc>
           <w:tcPr>
-            <w:tcW w:type="dxa" w:w="1280"/>
-            <w:vAlign w:val="center"/>
-            <w:tcBorders>
-              <w:top w:val="single" w:sz="4" w:space="0" w:color="D9E1EA"/>
-              <w:left w:val="single" w:sz="4" w:space="0" w:color="D9E1EA"/>
-              <w:bottom w:val="single" w:sz="4" w:space="0" w:color="D9E1EA"/>
-              <w:right w:val="single" w:sz="4" w:space="0" w:color="D9E1EA"/>
-            </w:tcBorders>
-            <w:tcMar>
-              <w:top w:w="80" w:type="dxa"/>
-              <w:bottom w:w="80" w:type="dxa"/>
-              <w:start w:w="120" w:type="dxa"/>
-              <w:end w:w="120" w:type="dxa"/>
-            </w:tcMar>
-          </w:tcPr>
-          <w:p>
-            <w:pPr>
-              <w:spacing w:after="0" w:line="252" w:lineRule="auto"/>
-              <w:jc w:val="left"/>
-            </w:pPr>
-            <w:hyperlink r:id="rId19">
+            <w:tcW w:type="dxa" w:w="1232"/>
+            <w:vAlign w:val="center"/>
+            <w:tcBorders>
+              <w:top w:val="single" w:sz="4" w:space="0" w:color="D9E1EA"/>
+              <w:left w:val="single" w:sz="4" w:space="0" w:color="D9E1EA"/>
+              <w:bottom w:val="single" w:sz="4" w:space="0" w:color="D9E1EA"/>
+              <w:right w:val="single" w:sz="4" w:space="0" w:color="D9E1EA"/>
+            </w:tcBorders>
+            <w:tcMar>
+              <w:top w:w="80" w:type="dxa"/>
+              <w:bottom w:w="80" w:type="dxa"/>
+              <w:start w:w="120" w:type="dxa"/>
+              <w:end w:w="120" w:type="dxa"/>
+            </w:tcMar>
+          </w:tcPr>
+          <w:p>
+            <w:pPr>
+              <w:spacing w:after="0" w:line="252" w:lineRule="auto"/>
+              <w:jc w:val="left"/>
+            </w:pPr>
+            <w:hyperlink r:id="rId20">
               <w:r>
                 <w:rPr>
                   <w:color w:val="2E74B5"/>
@@ -18179,7 +18195,7 @@
         </w:tc>
         <w:tc>
           <w:tcPr>
-            <w:tcW w:type="dxa" w:w="4419"/>
+            <w:tcW w:type="dxa" w:w="4302"/>
             <w:vAlign w:val="center"/>
             <w:tcBorders>
               <w:top w:val="single" w:sz="4" w:space="0" w:color="D9E1EA"/>
@@ -18211,7 +18227,7 @@
         </w:tc>
         <w:tc>
           <w:tcPr>
-            <w:tcW w:type="dxa" w:w="3661"/>
+            <w:tcW w:type="dxa" w:w="3826"/>
             <w:vAlign w:val="center"/>
             <w:tcBorders>
               <w:top w:val="single" w:sz="4" w:space="0" w:color="D9E1EA"/>
@@ -18248,27 +18264,27 @@
         </w:trPr>
         <w:tc>
           <w:tcPr>
-            <w:tcW w:type="dxa" w:w="1280"/>
-            <w:vAlign w:val="center"/>
-            <w:tcBorders>
-              <w:top w:val="single" w:sz="4" w:space="0" w:color="D9E1EA"/>
-              <w:left w:val="single" w:sz="4" w:space="0" w:color="D9E1EA"/>
-              <w:bottom w:val="single" w:sz="4" w:space="0" w:color="D9E1EA"/>
-              <w:right w:val="single" w:sz="4" w:space="0" w:color="D9E1EA"/>
-            </w:tcBorders>
-            <w:tcMar>
-              <w:top w:w="80" w:type="dxa"/>
-              <w:bottom w:w="80" w:type="dxa"/>
-              <w:start w:w="120" w:type="dxa"/>
-              <w:end w:w="120" w:type="dxa"/>
-            </w:tcMar>
-          </w:tcPr>
-          <w:p>
-            <w:pPr>
-              <w:spacing w:after="0" w:line="252" w:lineRule="auto"/>
-              <w:jc w:val="left"/>
-            </w:pPr>
-            <w:hyperlink r:id="rId25">
+            <w:tcW w:type="dxa" w:w="1232"/>
+            <w:vAlign w:val="center"/>
+            <w:tcBorders>
+              <w:top w:val="single" w:sz="4" w:space="0" w:color="D9E1EA"/>
+              <w:left w:val="single" w:sz="4" w:space="0" w:color="D9E1EA"/>
+              <w:bottom w:val="single" w:sz="4" w:space="0" w:color="D9E1EA"/>
+              <w:right w:val="single" w:sz="4" w:space="0" w:color="D9E1EA"/>
+            </w:tcBorders>
+            <w:tcMar>
+              <w:top w:w="80" w:type="dxa"/>
+              <w:bottom w:w="80" w:type="dxa"/>
+              <w:start w:w="120" w:type="dxa"/>
+              <w:end w:w="120" w:type="dxa"/>
+            </w:tcMar>
+          </w:tcPr>
+          <w:p>
+            <w:pPr>
+              <w:spacing w:after="0" w:line="252" w:lineRule="auto"/>
+              <w:jc w:val="left"/>
+            </w:pPr>
+            <w:hyperlink r:id="rId26">
               <w:r>
                 <w:rPr>
                   <w:color w:val="2E74B5"/>
@@ -18287,7 +18303,7 @@
               </w:rPr>
               <w:t xml:space="preserve"> and </w:t>
             </w:r>
-            <w:hyperlink r:id="rId26">
+            <w:hyperlink r:id="rId27">
               <w:r>
                 <w:rPr>
                   <w:color w:val="2E74B5"/>
@@ -18302,7 +18318,7 @@
         </w:tc>
         <w:tc>
           <w:tcPr>
-            <w:tcW w:type="dxa" w:w="4419"/>
+            <w:tcW w:type="dxa" w:w="4302"/>
             <w:vAlign w:val="center"/>
             <w:tcBorders>
               <w:top w:val="single" w:sz="4" w:space="0" w:color="D9E1EA"/>
@@ -18334,7 +18350,7 @@
         </w:tc>
         <w:tc>
           <w:tcPr>
-            <w:tcW w:type="dxa" w:w="3661"/>
+            <w:tcW w:type="dxa" w:w="3826"/>
             <w:vAlign w:val="center"/>
             <w:tcBorders>
               <w:top w:val="single" w:sz="4" w:space="0" w:color="D9E1EA"/>
@@ -18371,27 +18387,27 @@
         </w:trPr>
         <w:tc>
           <w:tcPr>
-            <w:tcW w:type="dxa" w:w="1280"/>
-            <w:vAlign w:val="center"/>
-            <w:tcBorders>
-              <w:top w:val="single" w:sz="4" w:space="0" w:color="D9E1EA"/>
-              <w:left w:val="single" w:sz="4" w:space="0" w:color="D9E1EA"/>
-              <w:bottom w:val="single" w:sz="4" w:space="0" w:color="D9E1EA"/>
-              <w:right w:val="single" w:sz="4" w:space="0" w:color="D9E1EA"/>
-            </w:tcBorders>
-            <w:tcMar>
-              <w:top w:w="80" w:type="dxa"/>
-              <w:bottom w:w="80" w:type="dxa"/>
-              <w:start w:w="120" w:type="dxa"/>
-              <w:end w:w="120" w:type="dxa"/>
-            </w:tcMar>
-          </w:tcPr>
-          <w:p>
-            <w:pPr>
-              <w:spacing w:after="0" w:line="252" w:lineRule="auto"/>
-              <w:jc w:val="left"/>
-            </w:pPr>
-            <w:hyperlink r:id="rId27">
+            <w:tcW w:type="dxa" w:w="1232"/>
+            <w:vAlign w:val="center"/>
+            <w:tcBorders>
+              <w:top w:val="single" w:sz="4" w:space="0" w:color="D9E1EA"/>
+              <w:left w:val="single" w:sz="4" w:space="0" w:color="D9E1EA"/>
+              <w:bottom w:val="single" w:sz="4" w:space="0" w:color="D9E1EA"/>
+              <w:right w:val="single" w:sz="4" w:space="0" w:color="D9E1EA"/>
+            </w:tcBorders>
+            <w:tcMar>
+              <w:top w:w="80" w:type="dxa"/>
+              <w:bottom w:w="80" w:type="dxa"/>
+              <w:start w:w="120" w:type="dxa"/>
+              <w:end w:w="120" w:type="dxa"/>
+            </w:tcMar>
+          </w:tcPr>
+          <w:p>
+            <w:pPr>
+              <w:spacing w:after="0" w:line="252" w:lineRule="auto"/>
+              <w:jc w:val="left"/>
+            </w:pPr>
+            <w:hyperlink r:id="rId28">
               <w:r>
                 <w:rPr>
                   <w:color w:val="2E74B5"/>
@@ -18406,7 +18422,7 @@
         </w:tc>
         <w:tc>
           <w:tcPr>
-            <w:tcW w:type="dxa" w:w="4419"/>
+            <w:tcW w:type="dxa" w:w="4302"/>
             <w:vAlign w:val="center"/>
             <w:tcBorders>
               <w:top w:val="single" w:sz="4" w:space="0" w:color="D9E1EA"/>
@@ -18438,7 +18454,7 @@
         </w:tc>
         <w:tc>
           <w:tcPr>
-            <w:tcW w:type="dxa" w:w="3661"/>
+            <w:tcW w:type="dxa" w:w="3826"/>
             <w:vAlign w:val="center"/>
             <w:tcBorders>
               <w:top w:val="single" w:sz="4" w:space="0" w:color="D9E1EA"/>
@@ -18475,27 +18491,27 @@
         </w:trPr>
         <w:tc>
           <w:tcPr>
-            <w:tcW w:type="dxa" w:w="1280"/>
-            <w:vAlign w:val="center"/>
-            <w:tcBorders>
-              <w:top w:val="single" w:sz="4" w:space="0" w:color="D9E1EA"/>
-              <w:left w:val="single" w:sz="4" w:space="0" w:color="D9E1EA"/>
-              <w:bottom w:val="single" w:sz="4" w:space="0" w:color="D9E1EA"/>
-              <w:right w:val="single" w:sz="4" w:space="0" w:color="D9E1EA"/>
-            </w:tcBorders>
-            <w:tcMar>
-              <w:top w:w="80" w:type="dxa"/>
-              <w:bottom w:w="80" w:type="dxa"/>
-              <w:start w:w="120" w:type="dxa"/>
-              <w:end w:w="120" w:type="dxa"/>
-            </w:tcMar>
-          </w:tcPr>
-          <w:p>
-            <w:pPr>
-              <w:spacing w:after="0" w:line="252" w:lineRule="auto"/>
-              <w:jc w:val="left"/>
-            </w:pPr>
-            <w:hyperlink r:id="rId28">
+            <w:tcW w:type="dxa" w:w="1232"/>
+            <w:vAlign w:val="center"/>
+            <w:tcBorders>
+              <w:top w:val="single" w:sz="4" w:space="0" w:color="D9E1EA"/>
+              <w:left w:val="single" w:sz="4" w:space="0" w:color="D9E1EA"/>
+              <w:bottom w:val="single" w:sz="4" w:space="0" w:color="D9E1EA"/>
+              <w:right w:val="single" w:sz="4" w:space="0" w:color="D9E1EA"/>
+            </w:tcBorders>
+            <w:tcMar>
+              <w:top w:w="80" w:type="dxa"/>
+              <w:bottom w:w="80" w:type="dxa"/>
+              <w:start w:w="120" w:type="dxa"/>
+              <w:end w:w="120" w:type="dxa"/>
+            </w:tcMar>
+          </w:tcPr>
+          <w:p>
+            <w:pPr>
+              <w:spacing w:after="0" w:line="252" w:lineRule="auto"/>
+              <w:jc w:val="left"/>
+            </w:pPr>
+            <w:hyperlink r:id="rId29">
               <w:r>
                 <w:rPr>
                   <w:color w:val="2E74B5"/>
@@ -18506,30 +18522,43 @@
                 <w:t>Apple AVAudioSession</w:t>
               </w:r>
             </w:hyperlink>
+          </w:p>
+        </w:tc>
+        <w:tc>
+          <w:tcPr>
+            <w:tcW w:type="dxa" w:w="4302"/>
+            <w:vAlign w:val="center"/>
+            <w:tcBorders>
+              <w:top w:val="single" w:sz="4" w:space="0" w:color="D9E1EA"/>
+              <w:left w:val="single" w:sz="4" w:space="0" w:color="D9E1EA"/>
+              <w:bottom w:val="single" w:sz="4" w:space="0" w:color="D9E1EA"/>
+              <w:right w:val="single" w:sz="4" w:space="0" w:color="D9E1EA"/>
+            </w:tcBorders>
+            <w:tcMar>
+              <w:top w:w="80" w:type="dxa"/>
+              <w:bottom w:w="80" w:type="dxa"/>
+              <w:start w:w="120" w:type="dxa"/>
+              <w:end w:w="120" w:type="dxa"/>
+            </w:tcMar>
+          </w:tcPr>
+          <w:p>
+            <w:pPr>
+              <w:spacing w:after="0" w:line="252" w:lineRule="auto"/>
+              <w:jc w:val="left"/>
+            </w:pPr>
             <w:r>
               <w:rPr>
                 <w:rFonts w:ascii="Calibri" w:hAnsi="Calibri"/>
                 <w:color w:val="000000"/>
                 <w:sz w:val="18"/>
               </w:rPr>
-              <w:t xml:space="preserve"> and </w:t>
-            </w:r>
-            <w:hyperlink r:id="rId29">
-              <w:r>
-                <w:rPr>
-                  <w:color w:val="2E74B5"/>
-                  <w:u w:val="single"/>
-                  <w:rFonts w:ascii="Calibri" w:hAnsi="Calibri"/>
-                  <w:sz w:val="18"/>
-                </w:rPr>
-                <w:t>Apple AccessoryAccess</w:t>
-              </w:r>
-            </w:hyperlink>
-          </w:p>
-        </w:tc>
-        <w:tc>
-          <w:tcPr>
-            <w:tcW w:type="dxa" w:w="4419"/>
+              <w:t>iOS phone-only microphone and speaker path</w:t>
+            </w:r>
+          </w:p>
+        </w:tc>
+        <w:tc>
+          <w:tcPr>
+            <w:tcW w:type="dxa" w:w="3826"/>
             <w:vAlign w:val="center"/>
             <w:tcBorders>
               <w:top w:val="single" w:sz="4" w:space="0" w:color="D9E1EA"/>
@@ -18555,39 +18584,7 @@
                 <w:color w:val="000000"/>
                 <w:sz w:val="18"/>
               </w:rPr>
-              <w:t>iOS phone-audio path and preliminary connected-accessory framework</w:t>
-            </w:r>
-          </w:p>
-        </w:tc>
-        <w:tc>
-          <w:tcPr>
-            <w:tcW w:type="dxa" w:w="3661"/>
-            <w:vAlign w:val="center"/>
-            <w:tcBorders>
-              <w:top w:val="single" w:sz="4" w:space="0" w:color="D9E1EA"/>
-              <w:left w:val="single" w:sz="4" w:space="0" w:color="D9E1EA"/>
-              <w:bottom w:val="single" w:sz="4" w:space="0" w:color="D9E1EA"/>
-              <w:right w:val="single" w:sz="4" w:space="0" w:color="D9E1EA"/>
-            </w:tcBorders>
-            <w:tcMar>
-              <w:top w:w="80" w:type="dxa"/>
-              <w:bottom w:w="80" w:type="dxa"/>
-              <w:start w:w="120" w:type="dxa"/>
-              <w:end w:w="120" w:type="dxa"/>
-            </w:tcMar>
-          </w:tcPr>
-          <w:p>
-            <w:pPr>
-              <w:spacing w:after="0" w:line="252" w:lineRule="auto"/>
-              <w:jc w:val="left"/>
-            </w:pPr>
-            <w:r>
-              <w:rPr>
-                <w:rFonts w:ascii="Calibri" w:hAnsi="Calibri"/>
-                <w:color w:val="000000"/>
-                <w:sz w:val="18"/>
-              </w:rPr>
-              <w:t>A production custom USB-C iPhone path</w:t>
+              <w:t>A custom wired iPhone accessory or generic USB-C accessory route</w:t>
             </w:r>
           </w:p>
         </w:tc>
@@ -18598,27 +18595,27 @@
         </w:trPr>
         <w:tc>
           <w:tcPr>
-            <w:tcW w:type="dxa" w:w="1280"/>
-            <w:vAlign w:val="center"/>
-            <w:tcBorders>
-              <w:top w:val="single" w:sz="4" w:space="0" w:color="D9E1EA"/>
-              <w:left w:val="single" w:sz="4" w:space="0" w:color="D9E1EA"/>
-              <w:bottom w:val="single" w:sz="4" w:space="0" w:color="D9E1EA"/>
-              <w:right w:val="single" w:sz="4" w:space="0" w:color="D9E1EA"/>
-            </w:tcBorders>
-            <w:tcMar>
-              <w:top w:w="80" w:type="dxa"/>
-              <w:bottom w:w="80" w:type="dxa"/>
-              <w:start w:w="120" w:type="dxa"/>
-              <w:end w:w="120" w:type="dxa"/>
-            </w:tcMar>
-          </w:tcPr>
-          <w:p>
-            <w:pPr>
-              <w:spacing w:after="0" w:line="252" w:lineRule="auto"/>
-              <w:jc w:val="left"/>
-            </w:pPr>
-            <w:hyperlink r:id="rId22">
+            <w:tcW w:type="dxa" w:w="1232"/>
+            <w:vAlign w:val="center"/>
+            <w:tcBorders>
+              <w:top w:val="single" w:sz="4" w:space="0" w:color="D9E1EA"/>
+              <w:left w:val="single" w:sz="4" w:space="0" w:color="D9E1EA"/>
+              <w:bottom w:val="single" w:sz="4" w:space="0" w:color="D9E1EA"/>
+              <w:right w:val="single" w:sz="4" w:space="0" w:color="D9E1EA"/>
+            </w:tcBorders>
+            <w:tcMar>
+              <w:top w:w="80" w:type="dxa"/>
+              <w:bottom w:w="80" w:type="dxa"/>
+              <w:start w:w="120" w:type="dxa"/>
+              <w:end w:w="120" w:type="dxa"/>
+            </w:tcMar>
+          </w:tcPr>
+          <w:p>
+            <w:pPr>
+              <w:spacing w:after="0" w:line="252" w:lineRule="auto"/>
+              <w:jc w:val="left"/>
+            </w:pPr>
+            <w:hyperlink r:id="rId23">
               <w:r>
                 <w:rPr>
                   <w:color w:val="2E74B5"/>
@@ -18637,7 +18634,7 @@
               </w:rPr>
               <w:t xml:space="preserve"> and </w:t>
             </w:r>
-            <w:hyperlink r:id="rId23">
+            <w:hyperlink r:id="rId24">
               <w:r>
                 <w:rPr>
                   <w:color w:val="2E74B5"/>
@@ -18652,7 +18649,7 @@
         </w:tc>
         <w:tc>
           <w:tcPr>
-            <w:tcW w:type="dxa" w:w="4419"/>
+            <w:tcW w:type="dxa" w:w="4302"/>
             <w:vAlign w:val="center"/>
             <w:tcBorders>
               <w:top w:val="single" w:sz="4" w:space="0" w:color="D9E1EA"/>
@@ -18684,7 +18681,7 @@
         </w:tc>
         <w:tc>
           <w:tcPr>
-            <w:tcW w:type="dxa" w:w="3661"/>
+            <w:tcW w:type="dxa" w:w="3826"/>
             <w:vAlign w:val="center"/>
             <w:tcBorders>
               <w:top w:val="single" w:sz="4" w:space="0" w:color="D9E1EA"/>
@@ -18721,7 +18718,7 @@
         </w:trPr>
         <w:tc>
           <w:tcPr>
-            <w:tcW w:type="dxa" w:w="1280"/>
+            <w:tcW w:type="dxa" w:w="1232"/>
             <w:vAlign w:val="center"/>
             <w:tcBorders>
               <w:top w:val="single" w:sz="4" w:space="0" w:color="D9E1EA"/>
@@ -18756,7 +18753,7 @@
         </w:tc>
         <w:tc>
           <w:tcPr>
-            <w:tcW w:type="dxa" w:w="4419"/>
+            <w:tcW w:type="dxa" w:w="4302"/>
             <w:vAlign w:val="center"/>
             <w:tcBorders>
               <w:top w:val="single" w:sz="4" w:space="0" w:color="D9E1EA"/>
@@ -18788,7 +18785,7 @@
         </w:tc>
         <w:tc>
           <w:tcPr>
-            <w:tcW w:type="dxa" w:w="3661"/>
+            <w:tcW w:type="dxa" w:w="3826"/>
             <w:vAlign w:val="center"/>
             <w:tcBorders>
               <w:top w:val="single" w:sz="4" w:space="0" w:color="D9E1EA"/>
@@ -18824,6 +18821,115 @@
       <w:pPr>
         <w:spacing w:after="40"/>
       </w:pPr>
+    </w:p>
+    <w:p>
+      <w:pPr>
+        <w:pStyle w:val="Heading2"/>
+      </w:pPr>
+      <w:r>
+        <w:rPr>
+          <w:rFonts w:ascii="Calibri" w:hAnsi="Calibri"/>
+          <w:color w:val="2E74B5"/>
+          <w:sz w:val="26"/>
+        </w:rPr>
+        <w:t>Core academic references</w:t>
+      </w:r>
+    </w:p>
+    <w:p>
+      <w:pPr>
+        <w:pStyle w:val="ListBullet"/>
+      </w:pPr>
+      <w:r>
+        <w:rPr>
+          <w:rFonts w:ascii="Calibri" w:hAnsi="Calibri"/>
+          <w:color w:val="000000"/>
+          <w:sz w:val="22"/>
+        </w:rPr>
+        <w:t xml:space="preserve">Nguyen et al. (2022), </w:t>
+      </w:r>
+      <w:hyperlink r:id="rId14">
+        <w:r>
+          <w:rPr>
+            <w:color w:val="2E74B5"/>
+            <w:u w:val="single"/>
+            <w:rFonts w:ascii="Calibri" w:hAnsi="Calibri"/>
+            <w:sz w:val="22"/>
+          </w:rPr>
+          <w:t>"A High-Quality and Large-Scale Dataset for English-Vietnamese Speech Translation"</w:t>
+        </w:r>
+      </w:hyperlink>
+      <w:r>
+        <w:rPr>
+          <w:rFonts w:ascii="Calibri" w:hAnsi="Calibri"/>
+          <w:color w:val="000000"/>
+          <w:sz w:val="22"/>
+        </w:rPr>
+        <w:t>, INTERSPEECH 2022. Supports the 508-hour EN-VI benchmark and its cascade-versus-end-to-end result.</w:t>
+      </w:r>
+    </w:p>
+    <w:p>
+      <w:pPr>
+        <w:pStyle w:val="ListBullet"/>
+      </w:pPr>
+      <w:r>
+        <w:rPr>
+          <w:rFonts w:ascii="Calibri" w:hAnsi="Calibri"/>
+          <w:color w:val="000000"/>
+          <w:sz w:val="22"/>
+        </w:rPr>
+        <w:t xml:space="preserve">Le, Nguyen, and Nguyen (2024), </w:t>
+      </w:r>
+      <w:hyperlink r:id="rId17">
+        <w:r>
+          <w:rPr>
+            <w:color w:val="2E74B5"/>
+            <w:u w:val="single"/>
+            <w:rFonts w:ascii="Calibri" w:hAnsi="Calibri"/>
+            <w:sz w:val="22"/>
+          </w:rPr>
+          <w:t>"PhoWhisper: Automatic Speech Recognition for Vietnamese"</w:t>
+        </w:r>
+      </w:hyperlink>
+      <w:r>
+        <w:rPr>
+          <w:rFonts w:ascii="Calibri" w:hAnsi="Calibri"/>
+          <w:color w:val="000000"/>
+          <w:sz w:val="22"/>
+        </w:rPr>
+        <w:t>, ICLR 2024 Tiny Papers. Supports Vietnamese ASR candidate and evaluation context.</w:t>
+      </w:r>
+    </w:p>
+    <w:p>
+      <w:pPr>
+        <w:pStyle w:val="ListBullet"/>
+      </w:pPr>
+      <w:r>
+        <w:rPr>
+          <w:rFonts w:ascii="Calibri" w:hAnsi="Calibri"/>
+          <w:color w:val="000000"/>
+          <w:sz w:val="22"/>
+        </w:rPr>
+        <w:t xml:space="preserve">Doan et al. (2021), </w:t>
+      </w:r>
+      <w:hyperlink r:id="rId22">
+        <w:r>
+          <w:rPr>
+            <w:color w:val="2E74B5"/>
+            <w:u w:val="single"/>
+            <w:rFonts w:ascii="Calibri" w:hAnsi="Calibri"/>
+            <w:sz w:val="22"/>
+          </w:rPr>
+          <w:t>"PhoMT: A High-Quality and Large-Scale Benchmark Dataset for Vietnamese-English Machine Translation"</w:t>
+        </w:r>
+      </w:hyperlink>
+      <w:r>
+        <w:rPr>
+          <w:rFonts w:ascii="Calibri" w:hAnsi="Calibri"/>
+          <w:color w:val="000000"/>
+          <w:sz w:val="22"/>
+        </w:rPr>
+        <w:t>, EMNLP 2021. Supports Vietnamese-English text-MT evaluation context.</w:t>
+      </w:r>
     </w:p>
     <w:p>
       <w:pPr>
@@ -18859,10 +18965,10 @@
         <w:tblInd w:type="dxa" w:w="120"/>
       </w:tblPr>
       <w:tblGrid>
-        <w:gridCol w:w="1342"/>
-        <w:gridCol w:w="1233"/>
-        <w:gridCol w:w="3320"/>
-        <w:gridCol w:w="3465"/>
+        <w:gridCol w:w="1383"/>
+        <w:gridCol w:w="1266"/>
+        <w:gridCol w:w="3341"/>
+        <w:gridCol w:w="3370"/>
       </w:tblGrid>
       <w:tr>
         <w:trPr>
@@ -18871,7 +18977,7 @@
         </w:trPr>
         <w:tc>
           <w:tcPr>
-            <w:tcW w:type="dxa" w:w="1342"/>
+            <w:tcW w:type="dxa" w:w="1383"/>
             <w:vAlign w:val="center"/>
             <w:tcBorders>
               <w:top w:val="single" w:sz="4" w:space="0" w:color="D9E1EA"/>
@@ -18905,7 +19011,7 @@
         </w:tc>
         <w:tc>
           <w:tcPr>
-            <w:tcW w:type="dxa" w:w="1233"/>
+            <w:tcW w:type="dxa" w:w="1266"/>
             <w:vAlign w:val="center"/>
             <w:tcBorders>
               <w:top w:val="single" w:sz="4" w:space="0" w:color="D9E1EA"/>
@@ -18939,7 +19045,7 @@
         </w:tc>
         <w:tc>
           <w:tcPr>
-            <w:tcW w:type="dxa" w:w="3320"/>
+            <w:tcW w:type="dxa" w:w="3341"/>
             <w:vAlign w:val="center"/>
             <w:tcBorders>
               <w:top w:val="single" w:sz="4" w:space="0" w:color="D9E1EA"/>
@@ -18973,7 +19079,7 @@
         </w:tc>
         <w:tc>
           <w:tcPr>
-            <w:tcW w:type="dxa" w:w="3465"/>
+            <w:tcW w:type="dxa" w:w="3370"/>
             <w:vAlign w:val="center"/>
             <w:tcBorders>
               <w:top w:val="single" w:sz="4" w:space="0" w:color="D9E1EA"/>
@@ -19012,7 +19118,7 @@
         </w:trPr>
         <w:tc>
           <w:tcPr>
-            <w:tcW w:type="dxa" w:w="1342"/>
+            <w:tcW w:type="dxa" w:w="1383"/>
             <w:vAlign w:val="center"/>
             <w:tcBorders>
               <w:top w:val="single" w:sz="4" w:space="0" w:color="D9E1EA"/>
@@ -19038,13 +19144,149 @@
                 <w:color w:val="000000"/>
                 <w:sz w:val="17"/>
               </w:rPr>
+              <w:t>Product page</w:t>
+            </w:r>
+          </w:p>
+        </w:tc>
+        <w:tc>
+          <w:tcPr>
+            <w:tcW w:type="dxa" w:w="1266"/>
+            <w:vAlign w:val="center"/>
+            <w:tcBorders>
+              <w:top w:val="single" w:sz="4" w:space="0" w:color="D9E1EA"/>
+              <w:left w:val="single" w:sz="4" w:space="0" w:color="D9E1EA"/>
+              <w:bottom w:val="single" w:sz="4" w:space="0" w:color="D9E1EA"/>
+              <w:right w:val="single" w:sz="4" w:space="0" w:color="D9E1EA"/>
+            </w:tcBorders>
+            <w:tcMar>
+              <w:top w:w="80" w:type="dxa"/>
+              <w:bottom w:w="80" w:type="dxa"/>
+              <w:start w:w="120" w:type="dxa"/>
+              <w:end w:w="120" w:type="dxa"/>
+            </w:tcMar>
+          </w:tcPr>
+          <w:p>
+            <w:pPr>
+              <w:spacing w:after="0" w:line="252" w:lineRule="auto"/>
+              <w:jc w:val="left"/>
+            </w:pPr>
+            <w:hyperlink r:id="rId37">
+              <w:r>
+                <w:rPr>
+                  <w:color w:val="2E74B5"/>
+                  <w:u w:val="single"/>
+                  <w:rFonts w:ascii="Calibri" w:hAnsi="Calibri"/>
+                  <w:sz w:val="17"/>
+                </w:rPr>
+                <w:t>Timekettle W4 Pro</w:t>
+              </w:r>
+            </w:hyperlink>
+          </w:p>
+        </w:tc>
+        <w:tc>
+          <w:tcPr>
+            <w:tcW w:type="dxa" w:w="3341"/>
+            <w:vAlign w:val="center"/>
+            <w:tcBorders>
+              <w:top w:val="single" w:sz="4" w:space="0" w:color="D9E1EA"/>
+              <w:left w:val="single" w:sz="4" w:space="0" w:color="D9E1EA"/>
+              <w:bottom w:val="single" w:sz="4" w:space="0" w:color="D9E1EA"/>
+              <w:right w:val="single" w:sz="4" w:space="0" w:color="D9E1EA"/>
+            </w:tcBorders>
+            <w:tcMar>
+              <w:top w:w="80" w:type="dxa"/>
+              <w:bottom w:w="80" w:type="dxa"/>
+              <w:start w:w="120" w:type="dxa"/>
+              <w:end w:w="120" w:type="dxa"/>
+            </w:tcMar>
+          </w:tcPr>
+          <w:p>
+            <w:pPr>
+              <w:spacing w:after="0" w:line="252" w:lineRule="auto"/>
+              <w:jc w:val="left"/>
+            </w:pPr>
+            <w:r>
+              <w:rPr>
+                <w:rFonts w:ascii="Calibri" w:hAnsi="Calibri"/>
+                <w:color w:val="000000"/>
+                <w:sz w:val="17"/>
+              </w:rPr>
+              <w:t>Phone-coupled earbud form factor and vendor pack workflow</w:t>
+            </w:r>
+          </w:p>
+        </w:tc>
+        <w:tc>
+          <w:tcPr>
+            <w:tcW w:type="dxa" w:w="3370"/>
+            <w:vAlign w:val="center"/>
+            <w:tcBorders>
+              <w:top w:val="single" w:sz="4" w:space="0" w:color="D9E1EA"/>
+              <w:left w:val="single" w:sz="4" w:space="0" w:color="D9E1EA"/>
+              <w:bottom w:val="single" w:sz="4" w:space="0" w:color="D9E1EA"/>
+              <w:right w:val="single" w:sz="4" w:space="0" w:color="D9E1EA"/>
+            </w:tcBorders>
+            <w:tcMar>
+              <w:top w:w="80" w:type="dxa"/>
+              <w:bottom w:w="80" w:type="dxa"/>
+              <w:start w:w="120" w:type="dxa"/>
+              <w:end w:w="120" w:type="dxa"/>
+            </w:tcMar>
+          </w:tcPr>
+          <w:p>
+            <w:pPr>
+              <w:spacing w:after="0" w:line="252" w:lineRule="auto"/>
+              <w:jc w:val="left"/>
+            </w:pPr>
+            <w:r>
+              <w:rPr>
+                <w:rFonts w:ascii="Calibri" w:hAnsi="Calibri"/>
+                <w:color w:val="000000"/>
+                <w:sz w:val="17"/>
+              </w:rPr>
+              <w:t>Vendor product description only; not an EN-VI offline comparator or a benchmark</w:t>
+            </w:r>
+          </w:p>
+        </w:tc>
+      </w:tr>
+      <w:tr>
+        <w:trPr>
+          <w:cantSplit/>
+        </w:trPr>
+        <w:tc>
+          <w:tcPr>
+            <w:tcW w:type="dxa" w:w="1383"/>
+            <w:vAlign w:val="center"/>
+            <w:tcBorders>
+              <w:top w:val="single" w:sz="4" w:space="0" w:color="D9E1EA"/>
+              <w:left w:val="single" w:sz="4" w:space="0" w:color="D9E1EA"/>
+              <w:bottom w:val="single" w:sz="4" w:space="0" w:color="D9E1EA"/>
+              <w:right w:val="single" w:sz="4" w:space="0" w:color="D9E1EA"/>
+            </w:tcBorders>
+            <w:tcMar>
+              <w:top w:w="80" w:type="dxa"/>
+              <w:bottom w:w="80" w:type="dxa"/>
+              <w:start w:w="120" w:type="dxa"/>
+              <w:end w:w="120" w:type="dxa"/>
+            </w:tcMar>
+          </w:tcPr>
+          <w:p>
+            <w:pPr>
+              <w:spacing w:after="0" w:line="252" w:lineRule="auto"/>
+              <w:jc w:val="left"/>
+            </w:pPr>
+            <w:r>
+              <w:rPr>
+                <w:rFonts w:ascii="Calibri" w:hAnsi="Calibri"/>
+                <w:color w:val="000000"/>
+                <w:sz w:val="17"/>
+              </w:rPr>
               <w:t>YouTube</w:t>
             </w:r>
           </w:p>
         </w:tc>
         <w:tc>
           <w:tcPr>
-            <w:tcW w:type="dxa" w:w="1233"/>
+            <w:tcW w:type="dxa" w:w="1266"/>
             <w:vAlign w:val="center"/>
             <w:tcBorders>
               <w:top w:val="single" w:sz="4" w:space="0" w:color="D9E1EA"/>
@@ -19079,7 +19321,7 @@
         </w:tc>
         <w:tc>
           <w:tcPr>
-            <w:tcW w:type="dxa" w:w="3320"/>
+            <w:tcW w:type="dxa" w:w="3341"/>
             <w:vAlign w:val="center"/>
             <w:tcBorders>
               <w:top w:val="single" w:sz="4" w:space="0" w:color="D9E1EA"/>
@@ -19111,7 +19353,7 @@
         </w:tc>
         <w:tc>
           <w:tcPr>
-            <w:tcW w:type="dxa" w:w="3465"/>
+            <w:tcW w:type="dxa" w:w="3370"/>
             <w:vAlign w:val="center"/>
             <w:tcBorders>
               <w:top w:val="single" w:sz="4" w:space="0" w:color="D9E1EA"/>
@@ -19148,7 +19390,7 @@
         </w:trPr>
         <w:tc>
           <w:tcPr>
-            <w:tcW w:type="dxa" w:w="1342"/>
+            <w:tcW w:type="dxa" w:w="1383"/>
             <w:vAlign w:val="center"/>
             <w:tcBorders>
               <w:top w:val="single" w:sz="4" w:space="0" w:color="D9E1EA"/>
@@ -19174,149 +19416,13 @@
                 <w:color w:val="000000"/>
                 <w:sz w:val="17"/>
               </w:rPr>
-              <w:t>YouTube</w:t>
-            </w:r>
-          </w:p>
-        </w:tc>
-        <w:tc>
-          <w:tcPr>
-            <w:tcW w:type="dxa" w:w="1233"/>
-            <w:vAlign w:val="center"/>
-            <w:tcBorders>
-              <w:top w:val="single" w:sz="4" w:space="0" w:color="D9E1EA"/>
-              <w:left w:val="single" w:sz="4" w:space="0" w:color="D9E1EA"/>
-              <w:bottom w:val="single" w:sz="4" w:space="0" w:color="D9E1EA"/>
-              <w:right w:val="single" w:sz="4" w:space="0" w:color="D9E1EA"/>
-            </w:tcBorders>
-            <w:tcMar>
-              <w:top w:w="80" w:type="dxa"/>
-              <w:bottom w:w="80" w:type="dxa"/>
-              <w:start w:w="120" w:type="dxa"/>
-              <w:end w:w="120" w:type="dxa"/>
-            </w:tcMar>
-          </w:tcPr>
-          <w:p>
-            <w:pPr>
-              <w:spacing w:after="0" w:line="252" w:lineRule="auto"/>
-              <w:jc w:val="left"/>
-            </w:pPr>
-            <w:hyperlink r:id="rId37">
-              <w:r>
-                <w:rPr>
-                  <w:color w:val="2E74B5"/>
-                  <w:u w:val="single"/>
-                  <w:rFonts w:ascii="Calibri" w:hAnsi="Calibri"/>
-                  <w:sz w:val="17"/>
-                </w:rPr>
-                <w:t>Timekettle M3 phone-pairing tutorial</w:t>
-              </w:r>
-            </w:hyperlink>
-          </w:p>
-        </w:tc>
-        <w:tc>
-          <w:tcPr>
-            <w:tcW w:type="dxa" w:w="3320"/>
-            <w:vAlign w:val="center"/>
-            <w:tcBorders>
-              <w:top w:val="single" w:sz="4" w:space="0" w:color="D9E1EA"/>
-              <w:left w:val="single" w:sz="4" w:space="0" w:color="D9E1EA"/>
-              <w:bottom w:val="single" w:sz="4" w:space="0" w:color="D9E1EA"/>
-              <w:right w:val="single" w:sz="4" w:space="0" w:color="D9E1EA"/>
-            </w:tcBorders>
-            <w:tcMar>
-              <w:top w:w="80" w:type="dxa"/>
-              <w:bottom w:w="80" w:type="dxa"/>
-              <w:start w:w="120" w:type="dxa"/>
-              <w:end w:w="120" w:type="dxa"/>
-            </w:tcMar>
-          </w:tcPr>
-          <w:p>
-            <w:pPr>
-              <w:spacing w:after="0" w:line="252" w:lineRule="auto"/>
-              <w:jc w:val="left"/>
-            </w:pPr>
-            <w:r>
-              <w:rPr>
-                <w:rFonts w:ascii="Calibri" w:hAnsi="Calibri"/>
-                <w:color w:val="000000"/>
-                <w:sz w:val="17"/>
-              </w:rPr>
-              <w:t>App coupling and pairing flow</w:t>
-            </w:r>
-          </w:p>
-        </w:tc>
-        <w:tc>
-          <w:tcPr>
-            <w:tcW w:type="dxa" w:w="3465"/>
-            <w:vAlign w:val="center"/>
-            <w:tcBorders>
-              <w:top w:val="single" w:sz="4" w:space="0" w:color="D9E1EA"/>
-              <w:left w:val="single" w:sz="4" w:space="0" w:color="D9E1EA"/>
-              <w:bottom w:val="single" w:sz="4" w:space="0" w:color="D9E1EA"/>
-              <w:right w:val="single" w:sz="4" w:space="0" w:color="D9E1EA"/>
-            </w:tcBorders>
-            <w:tcMar>
-              <w:top w:w="80" w:type="dxa"/>
-              <w:bottom w:w="80" w:type="dxa"/>
-              <w:start w:w="120" w:type="dxa"/>
-              <w:end w:w="120" w:type="dxa"/>
-            </w:tcMar>
-          </w:tcPr>
-          <w:p>
-            <w:pPr>
-              <w:spacing w:after="0" w:line="252" w:lineRule="auto"/>
-              <w:jc w:val="left"/>
-            </w:pPr>
-            <w:r>
-              <w:rPr>
-                <w:rFonts w:ascii="Calibri" w:hAnsi="Calibri"/>
-                <w:color w:val="000000"/>
-                <w:sz w:val="17"/>
-              </w:rPr>
-              <w:t>Official vendor workflow only</w:t>
-            </w:r>
-          </w:p>
-        </w:tc>
-      </w:tr>
-      <w:tr>
-        <w:trPr>
-          <w:cantSplit/>
-        </w:trPr>
-        <w:tc>
-          <w:tcPr>
-            <w:tcW w:type="dxa" w:w="1342"/>
-            <w:vAlign w:val="center"/>
-            <w:tcBorders>
-              <w:top w:val="single" w:sz="4" w:space="0" w:color="D9E1EA"/>
-              <w:left w:val="single" w:sz="4" w:space="0" w:color="D9E1EA"/>
-              <w:bottom w:val="single" w:sz="4" w:space="0" w:color="D9E1EA"/>
-              <w:right w:val="single" w:sz="4" w:space="0" w:color="D9E1EA"/>
-            </w:tcBorders>
-            <w:tcMar>
-              <w:top w:w="80" w:type="dxa"/>
-              <w:bottom w:w="80" w:type="dxa"/>
-              <w:start w:w="120" w:type="dxa"/>
-              <w:end w:w="120" w:type="dxa"/>
-            </w:tcMar>
-          </w:tcPr>
-          <w:p>
-            <w:pPr>
-              <w:spacing w:after="0" w:line="252" w:lineRule="auto"/>
-              <w:jc w:val="left"/>
-            </w:pPr>
-            <w:r>
-              <w:rPr>
-                <w:rFonts w:ascii="Calibri" w:hAnsi="Calibri"/>
-                <w:color w:val="000000"/>
-                <w:sz w:val="17"/>
-              </w:rPr>
-              <w:t>YouTube</w:t>
-            </w:r>
-          </w:p>
-        </w:tc>
-        <w:tc>
-          <w:tcPr>
-            <w:tcW w:type="dxa" w:w="1233"/>
+              <w:t>Product page and manual</w:t>
+            </w:r>
+          </w:p>
+        </w:tc>
+        <w:tc>
+          <w:tcPr>
+            <w:tcW w:type="dxa" w:w="1266"/>
             <w:vAlign w:val="center"/>
             <w:tcBorders>
               <w:top w:val="single" w:sz="4" w:space="0" w:color="D9E1EA"/>
@@ -19344,270 +19450,17 @@
                   <w:rFonts w:ascii="Calibri" w:hAnsi="Calibri"/>
                   <w:sz w:val="17"/>
                 </w:rPr>
-                <w:t>Timekettle offline-resource activation</w:t>
+                <w:t>Pocketalk S2 Plus</w:t>
               </w:r>
             </w:hyperlink>
-          </w:p>
-        </w:tc>
-        <w:tc>
-          <w:tcPr>
-            <w:tcW w:type="dxa" w:w="3320"/>
-            <w:vAlign w:val="center"/>
-            <w:tcBorders>
-              <w:top w:val="single" w:sz="4" w:space="0" w:color="D9E1EA"/>
-              <w:left w:val="single" w:sz="4" w:space="0" w:color="D9E1EA"/>
-              <w:bottom w:val="single" w:sz="4" w:space="0" w:color="D9E1EA"/>
-              <w:right w:val="single" w:sz="4" w:space="0" w:color="D9E1EA"/>
-            </w:tcBorders>
-            <w:tcMar>
-              <w:top w:w="80" w:type="dxa"/>
-              <w:bottom w:w="80" w:type="dxa"/>
-              <w:start w:w="120" w:type="dxa"/>
-              <w:end w:w="120" w:type="dxa"/>
-            </w:tcMar>
-          </w:tcPr>
-          <w:p>
-            <w:pPr>
-              <w:spacing w:after="0" w:line="252" w:lineRule="auto"/>
-              <w:jc w:val="left"/>
-            </w:pPr>
             <w:r>
               <w:rPr>
                 <w:rFonts w:ascii="Calibri" w:hAnsi="Calibri"/>
                 <w:color w:val="000000"/>
                 <w:sz w:val="17"/>
               </w:rPr>
-              <w:t>Language-pack activation pattern</w:t>
-            </w:r>
-          </w:p>
-        </w:tc>
-        <w:tc>
-          <w:tcPr>
-            <w:tcW w:type="dxa" w:w="3465"/>
-            <w:vAlign w:val="center"/>
-            <w:tcBorders>
-              <w:top w:val="single" w:sz="4" w:space="0" w:color="D9E1EA"/>
-              <w:left w:val="single" w:sz="4" w:space="0" w:color="D9E1EA"/>
-              <w:bottom w:val="single" w:sz="4" w:space="0" w:color="D9E1EA"/>
-              <w:right w:val="single" w:sz="4" w:space="0" w:color="D9E1EA"/>
-            </w:tcBorders>
-            <w:tcMar>
-              <w:top w:w="80" w:type="dxa"/>
-              <w:bottom w:w="80" w:type="dxa"/>
-              <w:start w:w="120" w:type="dxa"/>
-              <w:end w:w="120" w:type="dxa"/>
-            </w:tcMar>
-          </w:tcPr>
-          <w:p>
-            <w:pPr>
-              <w:spacing w:after="0" w:line="252" w:lineRule="auto"/>
-              <w:jc w:val="left"/>
-            </w:pPr>
-            <w:r>
-              <w:rPr>
-                <w:rFonts w:ascii="Calibri" w:hAnsi="Calibri"/>
-                <w:color w:val="000000"/>
-                <w:sz w:val="17"/>
-              </w:rPr>
-              <w:t>Does not prove VoiceKey offline quality</w:t>
-            </w:r>
-          </w:p>
-        </w:tc>
-      </w:tr>
-      <w:tr>
-        <w:trPr>
-          <w:cantSplit/>
-        </w:trPr>
-        <w:tc>
-          <w:tcPr>
-            <w:tcW w:type="dxa" w:w="1342"/>
-            <w:vAlign w:val="center"/>
-            <w:tcBorders>
-              <w:top w:val="single" w:sz="4" w:space="0" w:color="D9E1EA"/>
-              <w:left w:val="single" w:sz="4" w:space="0" w:color="D9E1EA"/>
-              <w:bottom w:val="single" w:sz="4" w:space="0" w:color="D9E1EA"/>
-              <w:right w:val="single" w:sz="4" w:space="0" w:color="D9E1EA"/>
-            </w:tcBorders>
-            <w:tcMar>
-              <w:top w:w="80" w:type="dxa"/>
-              <w:bottom w:w="80" w:type="dxa"/>
-              <w:start w:w="120" w:type="dxa"/>
-              <w:end w:w="120" w:type="dxa"/>
-            </w:tcMar>
-          </w:tcPr>
-          <w:p>
-            <w:pPr>
-              <w:spacing w:after="0" w:line="252" w:lineRule="auto"/>
-              <w:jc w:val="left"/>
-            </w:pPr>
-            <w:r>
-              <w:rPr>
-                <w:rFonts w:ascii="Calibri" w:hAnsi="Calibri"/>
-                <w:color w:val="000000"/>
-                <w:sz w:val="17"/>
-              </w:rPr>
-              <w:t>YouTube</w:t>
-            </w:r>
-          </w:p>
-        </w:tc>
-        <w:tc>
-          <w:tcPr>
-            <w:tcW w:type="dxa" w:w="1233"/>
-            <w:vAlign w:val="center"/>
-            <w:tcBorders>
-              <w:top w:val="single" w:sz="4" w:space="0" w:color="D9E1EA"/>
-              <w:left w:val="single" w:sz="4" w:space="0" w:color="D9E1EA"/>
-              <w:bottom w:val="single" w:sz="4" w:space="0" w:color="D9E1EA"/>
-              <w:right w:val="single" w:sz="4" w:space="0" w:color="D9E1EA"/>
-            </w:tcBorders>
-            <w:tcMar>
-              <w:top w:w="80" w:type="dxa"/>
-              <w:bottom w:w="80" w:type="dxa"/>
-              <w:start w:w="120" w:type="dxa"/>
-              <w:end w:w="120" w:type="dxa"/>
-            </w:tcMar>
-          </w:tcPr>
-          <w:p>
-            <w:pPr>
-              <w:spacing w:after="0" w:line="252" w:lineRule="auto"/>
-              <w:jc w:val="left"/>
-            </w:pPr>
-            <w:hyperlink r:id="rId12">
-              <w:r>
-                <w:rPr>
-                  <w:color w:val="2E74B5"/>
-                  <w:u w:val="single"/>
-                  <w:rFonts w:ascii="Calibri" w:hAnsi="Calibri"/>
-                  <w:sz w:val="17"/>
-                </w:rPr>
-                <w:t>Pocketalk getting started</w:t>
-              </w:r>
-            </w:hyperlink>
-          </w:p>
-        </w:tc>
-        <w:tc>
-          <w:tcPr>
-            <w:tcW w:type="dxa" w:w="3320"/>
-            <w:vAlign w:val="center"/>
-            <w:tcBorders>
-              <w:top w:val="single" w:sz="4" w:space="0" w:color="D9E1EA"/>
-              <w:left w:val="single" w:sz="4" w:space="0" w:color="D9E1EA"/>
-              <w:bottom w:val="single" w:sz="4" w:space="0" w:color="D9E1EA"/>
-              <w:right w:val="single" w:sz="4" w:space="0" w:color="D9E1EA"/>
-            </w:tcBorders>
-            <w:tcMar>
-              <w:top w:w="80" w:type="dxa"/>
-              <w:bottom w:w="80" w:type="dxa"/>
-              <w:start w:w="120" w:type="dxa"/>
-              <w:end w:w="120" w:type="dxa"/>
-            </w:tcMar>
-          </w:tcPr>
-          <w:p>
-            <w:pPr>
-              <w:spacing w:after="0" w:line="252" w:lineRule="auto"/>
-              <w:jc w:val="left"/>
-            </w:pPr>
-            <w:r>
-              <w:rPr>
-                <w:rFonts w:ascii="Calibri" w:hAnsi="Calibri"/>
-                <w:color w:val="000000"/>
-                <w:sz w:val="17"/>
-              </w:rPr>
-              <w:t>Handheld startup and translation flow</w:t>
-            </w:r>
-          </w:p>
-        </w:tc>
-        <w:tc>
-          <w:tcPr>
-            <w:tcW w:type="dxa" w:w="3465"/>
-            <w:vAlign w:val="center"/>
-            <w:tcBorders>
-              <w:top w:val="single" w:sz="4" w:space="0" w:color="D9E1EA"/>
-              <w:left w:val="single" w:sz="4" w:space="0" w:color="D9E1EA"/>
-              <w:bottom w:val="single" w:sz="4" w:space="0" w:color="D9E1EA"/>
-              <w:right w:val="single" w:sz="4" w:space="0" w:color="D9E1EA"/>
-            </w:tcBorders>
-            <w:tcMar>
-              <w:top w:w="80" w:type="dxa"/>
-              <w:bottom w:w="80" w:type="dxa"/>
-              <w:start w:w="120" w:type="dxa"/>
-              <w:end w:w="120" w:type="dxa"/>
-            </w:tcMar>
-          </w:tcPr>
-          <w:p>
-            <w:pPr>
-              <w:spacing w:after="0" w:line="252" w:lineRule="auto"/>
-              <w:jc w:val="left"/>
-            </w:pPr>
-            <w:r>
-              <w:rPr>
-                <w:rFonts w:ascii="Calibri" w:hAnsi="Calibri"/>
-                <w:color w:val="000000"/>
-                <w:sz w:val="17"/>
-              </w:rPr>
-              <w:t>Official vendor workflow only</w:t>
-            </w:r>
-          </w:p>
-        </w:tc>
-      </w:tr>
-      <w:tr>
-        <w:trPr>
-          <w:cantSplit/>
-        </w:trPr>
-        <w:tc>
-          <w:tcPr>
-            <w:tcW w:type="dxa" w:w="1342"/>
-            <w:vAlign w:val="center"/>
-            <w:tcBorders>
-              <w:top w:val="single" w:sz="4" w:space="0" w:color="D9E1EA"/>
-              <w:left w:val="single" w:sz="4" w:space="0" w:color="D9E1EA"/>
-              <w:bottom w:val="single" w:sz="4" w:space="0" w:color="D9E1EA"/>
-              <w:right w:val="single" w:sz="4" w:space="0" w:color="D9E1EA"/>
-            </w:tcBorders>
-            <w:tcMar>
-              <w:top w:w="80" w:type="dxa"/>
-              <w:bottom w:w="80" w:type="dxa"/>
-              <w:start w:w="120" w:type="dxa"/>
-              <w:end w:w="120" w:type="dxa"/>
-            </w:tcMar>
-          </w:tcPr>
-          <w:p>
-            <w:pPr>
-              <w:spacing w:after="0" w:line="252" w:lineRule="auto"/>
-              <w:jc w:val="left"/>
-            </w:pPr>
-            <w:r>
-              <w:rPr>
-                <w:rFonts w:ascii="Calibri" w:hAnsi="Calibri"/>
-                <w:color w:val="000000"/>
-                <w:sz w:val="17"/>
-              </w:rPr>
-              <w:t>YouTube</w:t>
-            </w:r>
-          </w:p>
-        </w:tc>
-        <w:tc>
-          <w:tcPr>
-            <w:tcW w:type="dxa" w:w="1233"/>
-            <w:vAlign w:val="center"/>
-            <w:tcBorders>
-              <w:top w:val="single" w:sz="4" w:space="0" w:color="D9E1EA"/>
-              <w:left w:val="single" w:sz="4" w:space="0" w:color="D9E1EA"/>
-              <w:bottom w:val="single" w:sz="4" w:space="0" w:color="D9E1EA"/>
-              <w:right w:val="single" w:sz="4" w:space="0" w:color="D9E1EA"/>
-            </w:tcBorders>
-            <w:tcMar>
-              <w:top w:w="80" w:type="dxa"/>
-              <w:bottom w:w="80" w:type="dxa"/>
-              <w:start w:w="120" w:type="dxa"/>
-              <w:end w:w="120" w:type="dxa"/>
-            </w:tcMar>
-          </w:tcPr>
-          <w:p>
-            <w:pPr>
-              <w:spacing w:after="0" w:line="252" w:lineRule="auto"/>
-              <w:jc w:val="left"/>
-            </w:pPr>
+              <w:t xml:space="preserve"> and </w:t>
+            </w:r>
             <w:hyperlink r:id="rId39">
               <w:r>
                 <w:rPr>
@@ -19616,14 +19469,14 @@
                   <w:rFonts w:ascii="Calibri" w:hAnsi="Calibri"/>
                   <w:sz w:val="17"/>
                 </w:rPr>
-                <w:t>Vasco E1 conversation-start tutorial</w:t>
+                <w:t>S2 setup manual</w:t>
               </w:r>
             </w:hyperlink>
           </w:p>
         </w:tc>
         <w:tc>
           <w:tcPr>
-            <w:tcW w:type="dxa" w:w="3320"/>
+            <w:tcW w:type="dxa" w:w="3341"/>
             <w:vAlign w:val="center"/>
             <w:tcBorders>
               <w:top w:val="single" w:sz="4" w:space="0" w:color="D9E1EA"/>
@@ -19649,13 +19502,13 @@
                 <w:color w:val="000000"/>
                 <w:sz w:val="17"/>
               </w:rPr>
-              <w:t>Wearable two-person conversation flow</w:t>
-            </w:r>
-          </w:p>
-        </w:tc>
-        <w:tc>
-          <w:tcPr>
-            <w:tcW w:type="dxa" w:w="3465"/>
+              <w:t>Screen-first handheld workflow and connectivity setup</w:t>
+            </w:r>
+          </w:p>
+        </w:tc>
+        <w:tc>
+          <w:tcPr>
+            <w:tcW w:type="dxa" w:w="3370"/>
             <w:vAlign w:val="center"/>
             <w:tcBorders>
               <w:top w:val="single" w:sz="4" w:space="0" w:color="D9E1EA"/>
@@ -19681,7 +19534,7 @@
                 <w:color w:val="000000"/>
                 <w:sz w:val="17"/>
               </w:rPr>
-              <w:t>Official vendor workflow only</w:t>
+              <w:t>Vendor documentation, not a benchmark</w:t>
             </w:r>
           </w:p>
         </w:tc>
@@ -19692,7 +19545,7 @@
         </w:trPr>
         <w:tc>
           <w:tcPr>
-            <w:tcW w:type="dxa" w:w="1342"/>
+            <w:tcW w:type="dxa" w:w="1383"/>
             <w:vAlign w:val="center"/>
             <w:tcBorders>
               <w:top w:val="single" w:sz="4" w:space="0" w:color="D9E1EA"/>
@@ -19718,13 +19571,13 @@
                 <w:color w:val="000000"/>
                 <w:sz w:val="17"/>
               </w:rPr>
-              <w:t>Facebook</w:t>
-            </w:r>
-          </w:p>
-        </w:tc>
-        <w:tc>
-          <w:tcPr>
-            <w:tcW w:type="dxa" w:w="1233"/>
+              <w:t>YouTube</w:t>
+            </w:r>
+          </w:p>
+        </w:tc>
+        <w:tc>
+          <w:tcPr>
+            <w:tcW w:type="dxa" w:w="1266"/>
             <w:vAlign w:val="center"/>
             <w:tcBorders>
               <w:top w:val="single" w:sz="4" w:space="0" w:color="D9E1EA"/>
@@ -19752,14 +19605,14 @@
                   <w:rFonts w:ascii="Calibri" w:hAnsi="Calibri"/>
                   <w:sz w:val="17"/>
                 </w:rPr>
-                <w:t>Timekettle M3 official video</w:t>
+                <w:t>Pocketalk How to Translate</w:t>
               </w:r>
             </w:hyperlink>
           </w:p>
         </w:tc>
         <w:tc>
           <w:tcPr>
-            <w:tcW w:type="dxa" w:w="3320"/>
+            <w:tcW w:type="dxa" w:w="3341"/>
             <w:vAlign w:val="center"/>
             <w:tcBorders>
               <w:top w:val="single" w:sz="4" w:space="0" w:color="D9E1EA"/>
@@ -19785,13 +19638,13 @@
                 <w:color w:val="000000"/>
                 <w:sz w:val="17"/>
               </w:rPr>
-              <w:t>Social product presentation</w:t>
-            </w:r>
-          </w:p>
-        </w:tc>
-        <w:tc>
-          <w:tcPr>
-            <w:tcW w:type="dxa" w:w="3465"/>
+              <w:t>Hands-on handheld translation steps</w:t>
+            </w:r>
+          </w:p>
+        </w:tc>
+        <w:tc>
+          <w:tcPr>
+            <w:tcW w:type="dxa" w:w="3370"/>
             <w:vAlign w:val="center"/>
             <w:tcBorders>
               <w:top w:val="single" w:sz="4" w:space="0" w:color="D9E1EA"/>
@@ -19817,7 +19670,7 @@
                 <w:color w:val="000000"/>
                 <w:sz w:val="17"/>
               </w:rPr>
-              <w:t>May be region or login restricted; vendor marketing only</w:t>
+              <w:t>Official vendor workflow only</w:t>
             </w:r>
           </w:p>
         </w:tc>
@@ -19828,7 +19681,7 @@
         </w:trPr>
         <w:tc>
           <w:tcPr>
-            <w:tcW w:type="dxa" w:w="1342"/>
+            <w:tcW w:type="dxa" w:w="1383"/>
             <w:vAlign w:val="center"/>
             <w:tcBorders>
               <w:top w:val="single" w:sz="4" w:space="0" w:color="D9E1EA"/>
@@ -19854,13 +19707,13 @@
                 <w:color w:val="000000"/>
                 <w:sz w:val="17"/>
               </w:rPr>
-              <w:t>Douyin</w:t>
-            </w:r>
-          </w:p>
-        </w:tc>
-        <w:tc>
-          <w:tcPr>
-            <w:tcW w:type="dxa" w:w="1233"/>
+              <w:t>Product page</w:t>
+            </w:r>
+          </w:p>
+        </w:tc>
+        <w:tc>
+          <w:tcPr>
+            <w:tcW w:type="dxa" w:w="1266"/>
             <w:vAlign w:val="center"/>
             <w:tcBorders>
               <w:top w:val="single" w:sz="4" w:space="0" w:color="D9E1EA"/>
@@ -19888,134 +19741,17 @@
                   <w:rFonts w:ascii="Calibri" w:hAnsi="Calibri"/>
                   <w:sz w:val="17"/>
                 </w:rPr>
-                <w:t>Timekettle store/tutorial collection</w:t>
+                <w:t>Vasco Translator E1</w:t>
               </w:r>
             </w:hyperlink>
-          </w:p>
-        </w:tc>
-        <w:tc>
-          <w:tcPr>
-            <w:tcW w:type="dxa" w:w="3320"/>
-            <w:vAlign w:val="center"/>
-            <w:tcBorders>
-              <w:top w:val="single" w:sz="4" w:space="0" w:color="D9E1EA"/>
-              <w:left w:val="single" w:sz="4" w:space="0" w:color="D9E1EA"/>
-              <w:bottom w:val="single" w:sz="4" w:space="0" w:color="D9E1EA"/>
-              <w:right w:val="single" w:sz="4" w:space="0" w:color="D9E1EA"/>
-            </w:tcBorders>
-            <w:tcMar>
-              <w:top w:w="80" w:type="dxa"/>
-              <w:bottom w:w="80" w:type="dxa"/>
-              <w:start w:w="120" w:type="dxa"/>
-              <w:end w:w="120" w:type="dxa"/>
-            </w:tcMar>
-          </w:tcPr>
-          <w:p>
-            <w:pPr>
-              <w:spacing w:after="0" w:line="252" w:lineRule="auto"/>
-              <w:jc w:val="left"/>
-            </w:pPr>
             <w:r>
               <w:rPr>
                 <w:rFonts w:ascii="Calibri" w:hAnsi="Calibri"/>
                 <w:color w:val="000000"/>
                 <w:sz w:val="17"/>
               </w:rPr>
-              <w:t>Public app-pairing and conversation-format discovery</w:t>
-            </w:r>
-          </w:p>
-        </w:tc>
-        <w:tc>
-          <w:tcPr>
-            <w:tcW w:type="dxa" w:w="3465"/>
-            <w:vAlign w:val="center"/>
-            <w:tcBorders>
-              <w:top w:val="single" w:sz="4" w:space="0" w:color="D9E1EA"/>
-              <w:left w:val="single" w:sz="4" w:space="0" w:color="D9E1EA"/>
-              <w:bottom w:val="single" w:sz="4" w:space="0" w:color="D9E1EA"/>
-              <w:right w:val="single" w:sz="4" w:space="0" w:color="D9E1EA"/>
-            </w:tcBorders>
-            <w:tcMar>
-              <w:top w:w="80" w:type="dxa"/>
-              <w:bottom w:w="80" w:type="dxa"/>
-              <w:start w:w="120" w:type="dxa"/>
-              <w:end w:w="120" w:type="dxa"/>
-            </w:tcMar>
-          </w:tcPr>
-          <w:p>
-            <w:pPr>
-              <w:spacing w:after="0" w:line="252" w:lineRule="auto"/>
-              <w:jc w:val="left"/>
-            </w:pPr>
-            <w:r>
-              <w:rPr>
-                <w:rFonts w:ascii="Calibri" w:hAnsi="Calibri"/>
-                <w:color w:val="000000"/>
-                <w:sz w:val="17"/>
-              </w:rPr>
-              <w:t>Social or store content; no performance claim</w:t>
-            </w:r>
-          </w:p>
-        </w:tc>
-      </w:tr>
-      <w:tr>
-        <w:trPr>
-          <w:cantSplit/>
-        </w:trPr>
-        <w:tc>
-          <w:tcPr>
-            <w:tcW w:type="dxa" w:w="1342"/>
-            <w:vAlign w:val="center"/>
-            <w:tcBorders>
-              <w:top w:val="single" w:sz="4" w:space="0" w:color="D9E1EA"/>
-              <w:left w:val="single" w:sz="4" w:space="0" w:color="D9E1EA"/>
-              <w:bottom w:val="single" w:sz="4" w:space="0" w:color="D9E1EA"/>
-              <w:right w:val="single" w:sz="4" w:space="0" w:color="D9E1EA"/>
-            </w:tcBorders>
-            <w:tcMar>
-              <w:top w:w="80" w:type="dxa"/>
-              <w:bottom w:w="80" w:type="dxa"/>
-              <w:start w:w="120" w:type="dxa"/>
-              <w:end w:w="120" w:type="dxa"/>
-            </w:tcMar>
-          </w:tcPr>
-          <w:p>
-            <w:pPr>
-              <w:spacing w:after="0" w:line="252" w:lineRule="auto"/>
-              <w:jc w:val="left"/>
-            </w:pPr>
-            <w:r>
-              <w:rPr>
-                <w:rFonts w:ascii="Calibri" w:hAnsi="Calibri"/>
-                <w:color w:val="000000"/>
-                <w:sz w:val="17"/>
-              </w:rPr>
-              <w:t>TikTok Shop</w:t>
-            </w:r>
-          </w:p>
-        </w:tc>
-        <w:tc>
-          <w:tcPr>
-            <w:tcW w:type="dxa" w:w="1233"/>
-            <w:vAlign w:val="center"/>
-            <w:tcBorders>
-              <w:top w:val="single" w:sz="4" w:space="0" w:color="D9E1EA"/>
-              <w:left w:val="single" w:sz="4" w:space="0" w:color="D9E1EA"/>
-              <w:bottom w:val="single" w:sz="4" w:space="0" w:color="D9E1EA"/>
-              <w:right w:val="single" w:sz="4" w:space="0" w:color="D9E1EA"/>
-            </w:tcBorders>
-            <w:tcMar>
-              <w:top w:w="80" w:type="dxa"/>
-              <w:bottom w:w="80" w:type="dxa"/>
-              <w:start w:w="120" w:type="dxa"/>
-              <w:end w:w="120" w:type="dxa"/>
-            </w:tcMar>
-          </w:tcPr>
-          <w:p>
-            <w:pPr>
-              <w:spacing w:after="0" w:line="252" w:lineRule="auto"/>
-              <w:jc w:val="left"/>
-            </w:pPr>
+              <w:t xml:space="preserve"> and </w:t>
+            </w:r>
             <w:hyperlink r:id="rId42">
               <w:r>
                 <w:rPr>
@@ -20024,14 +19760,14 @@
                   <w:rFonts w:ascii="Calibri" w:hAnsi="Calibri"/>
                   <w:sz w:val="17"/>
                 </w:rPr>
-                <w:t>Timekettle W4 Pro listing</w:t>
+                <w:t>Vasco Translator V4</w:t>
               </w:r>
             </w:hyperlink>
           </w:p>
         </w:tc>
         <w:tc>
           <w:tcPr>
-            <w:tcW w:type="dxa" w:w="3320"/>
+            <w:tcW w:type="dxa" w:w="3341"/>
             <w:vAlign w:val="center"/>
             <w:tcBorders>
               <w:top w:val="single" w:sz="4" w:space="0" w:color="D9E1EA"/>
@@ -20057,13 +19793,13 @@
                 <w:color w:val="000000"/>
                 <w:sz w:val="17"/>
               </w:rPr>
-              <w:t>Retail category and product language</w:t>
-            </w:r>
-          </w:p>
-        </w:tc>
-        <w:tc>
-          <w:tcPr>
-            <w:tcW w:type="dxa" w:w="3465"/>
+              <w:t>Wearable and handheld product formats</w:t>
+            </w:r>
+          </w:p>
+        </w:tc>
+        <w:tc>
+          <w:tcPr>
+            <w:tcW w:type="dxa" w:w="3370"/>
             <w:vAlign w:val="center"/>
             <w:tcBorders>
               <w:top w:val="single" w:sz="4" w:space="0" w:color="D9E1EA"/>
@@ -20089,7 +19825,415 @@
                 <w:color w:val="000000"/>
                 <w:sz w:val="17"/>
               </w:rPr>
-              <w:t>Retail listing, not a demo or technical source</w:t>
+              <w:t>Vendor product descriptions, not a benchmark</w:t>
+            </w:r>
+          </w:p>
+        </w:tc>
+      </w:tr>
+      <w:tr>
+        <w:trPr>
+          <w:cantSplit/>
+        </w:trPr>
+        <w:tc>
+          <w:tcPr>
+            <w:tcW w:type="dxa" w:w="1383"/>
+            <w:vAlign w:val="center"/>
+            <w:tcBorders>
+              <w:top w:val="single" w:sz="4" w:space="0" w:color="D9E1EA"/>
+              <w:left w:val="single" w:sz="4" w:space="0" w:color="D9E1EA"/>
+              <w:bottom w:val="single" w:sz="4" w:space="0" w:color="D9E1EA"/>
+              <w:right w:val="single" w:sz="4" w:space="0" w:color="D9E1EA"/>
+            </w:tcBorders>
+            <w:tcMar>
+              <w:top w:w="80" w:type="dxa"/>
+              <w:bottom w:w="80" w:type="dxa"/>
+              <w:start w:w="120" w:type="dxa"/>
+              <w:end w:w="120" w:type="dxa"/>
+            </w:tcMar>
+          </w:tcPr>
+          <w:p>
+            <w:pPr>
+              <w:spacing w:after="0" w:line="252" w:lineRule="auto"/>
+              <w:jc w:val="left"/>
+            </w:pPr>
+            <w:r>
+              <w:rPr>
+                <w:rFonts w:ascii="Calibri" w:hAnsi="Calibri"/>
+                <w:color w:val="000000"/>
+                <w:sz w:val="17"/>
+              </w:rPr>
+              <w:t>YouTube</w:t>
+            </w:r>
+          </w:p>
+        </w:tc>
+        <w:tc>
+          <w:tcPr>
+            <w:tcW w:type="dxa" w:w="1266"/>
+            <w:vAlign w:val="center"/>
+            <w:tcBorders>
+              <w:top w:val="single" w:sz="4" w:space="0" w:color="D9E1EA"/>
+              <w:left w:val="single" w:sz="4" w:space="0" w:color="D9E1EA"/>
+              <w:bottom w:val="single" w:sz="4" w:space="0" w:color="D9E1EA"/>
+              <w:right w:val="single" w:sz="4" w:space="0" w:color="D9E1EA"/>
+            </w:tcBorders>
+            <w:tcMar>
+              <w:top w:w="80" w:type="dxa"/>
+              <w:bottom w:w="80" w:type="dxa"/>
+              <w:start w:w="120" w:type="dxa"/>
+              <w:end w:w="120" w:type="dxa"/>
+            </w:tcMar>
+          </w:tcPr>
+          <w:p>
+            <w:pPr>
+              <w:spacing w:after="0" w:line="252" w:lineRule="auto"/>
+              <w:jc w:val="left"/>
+            </w:pPr>
+            <w:hyperlink r:id="rId43">
+              <w:r>
+                <w:rPr>
+                  <w:color w:val="2E74B5"/>
+                  <w:u w:val="single"/>
+                  <w:rFonts w:ascii="Calibri" w:hAnsi="Calibri"/>
+                  <w:sz w:val="17"/>
+                </w:rPr>
+                <w:t>Vasco Translator E1 official demo</w:t>
+              </w:r>
+            </w:hyperlink>
+          </w:p>
+        </w:tc>
+        <w:tc>
+          <w:tcPr>
+            <w:tcW w:type="dxa" w:w="3341"/>
+            <w:vAlign w:val="center"/>
+            <w:tcBorders>
+              <w:top w:val="single" w:sz="4" w:space="0" w:color="D9E1EA"/>
+              <w:left w:val="single" w:sz="4" w:space="0" w:color="D9E1EA"/>
+              <w:bottom w:val="single" w:sz="4" w:space="0" w:color="D9E1EA"/>
+              <w:right w:val="single" w:sz="4" w:space="0" w:color="D9E1EA"/>
+            </w:tcBorders>
+            <w:tcMar>
+              <w:top w:w="80" w:type="dxa"/>
+              <w:bottom w:w="80" w:type="dxa"/>
+              <w:start w:w="120" w:type="dxa"/>
+              <w:end w:w="120" w:type="dxa"/>
+            </w:tcMar>
+          </w:tcPr>
+          <w:p>
+            <w:pPr>
+              <w:spacing w:after="0" w:line="252" w:lineRule="auto"/>
+              <w:jc w:val="left"/>
+            </w:pPr>
+            <w:r>
+              <w:rPr>
+                <w:rFonts w:ascii="Calibri" w:hAnsi="Calibri"/>
+                <w:color w:val="000000"/>
+                <w:sz w:val="17"/>
+              </w:rPr>
+              <w:t>Wearable conversation framing</w:t>
+            </w:r>
+          </w:p>
+        </w:tc>
+        <w:tc>
+          <w:tcPr>
+            <w:tcW w:type="dxa" w:w="3370"/>
+            <w:vAlign w:val="center"/>
+            <w:tcBorders>
+              <w:top w:val="single" w:sz="4" w:space="0" w:color="D9E1EA"/>
+              <w:left w:val="single" w:sz="4" w:space="0" w:color="D9E1EA"/>
+              <w:bottom w:val="single" w:sz="4" w:space="0" w:color="D9E1EA"/>
+              <w:right w:val="single" w:sz="4" w:space="0" w:color="D9E1EA"/>
+            </w:tcBorders>
+            <w:tcMar>
+              <w:top w:w="80" w:type="dxa"/>
+              <w:bottom w:w="80" w:type="dxa"/>
+              <w:start w:w="120" w:type="dxa"/>
+              <w:end w:w="120" w:type="dxa"/>
+            </w:tcMar>
+          </w:tcPr>
+          <w:p>
+            <w:pPr>
+              <w:spacing w:after="0" w:line="252" w:lineRule="auto"/>
+              <w:jc w:val="left"/>
+            </w:pPr>
+            <w:r>
+              <w:rPr>
+                <w:rFonts w:ascii="Calibri" w:hAnsi="Calibri"/>
+                <w:color w:val="000000"/>
+                <w:sz w:val="17"/>
+              </w:rPr>
+              <w:t>Official vendor workflow only</w:t>
+            </w:r>
+          </w:p>
+        </w:tc>
+      </w:tr>
+      <w:tr>
+        <w:trPr>
+          <w:cantSplit/>
+        </w:trPr>
+        <w:tc>
+          <w:tcPr>
+            <w:tcW w:type="dxa" w:w="1383"/>
+            <w:vAlign w:val="center"/>
+            <w:tcBorders>
+              <w:top w:val="single" w:sz="4" w:space="0" w:color="D9E1EA"/>
+              <w:left w:val="single" w:sz="4" w:space="0" w:color="D9E1EA"/>
+              <w:bottom w:val="single" w:sz="4" w:space="0" w:color="D9E1EA"/>
+              <w:right w:val="single" w:sz="4" w:space="0" w:color="D9E1EA"/>
+            </w:tcBorders>
+            <w:tcMar>
+              <w:top w:w="80" w:type="dxa"/>
+              <w:bottom w:w="80" w:type="dxa"/>
+              <w:start w:w="120" w:type="dxa"/>
+              <w:end w:w="120" w:type="dxa"/>
+            </w:tcMar>
+          </w:tcPr>
+          <w:p>
+            <w:pPr>
+              <w:spacing w:after="0" w:line="252" w:lineRule="auto"/>
+              <w:jc w:val="left"/>
+            </w:pPr>
+            <w:r>
+              <w:rPr>
+                <w:rFonts w:ascii="Calibri" w:hAnsi="Calibri"/>
+                <w:color w:val="000000"/>
+                <w:sz w:val="17"/>
+              </w:rPr>
+              <w:t>Facebook</w:t>
+            </w:r>
+          </w:p>
+        </w:tc>
+        <w:tc>
+          <w:tcPr>
+            <w:tcW w:type="dxa" w:w="1266"/>
+            <w:vAlign w:val="center"/>
+            <w:tcBorders>
+              <w:top w:val="single" w:sz="4" w:space="0" w:color="D9E1EA"/>
+              <w:left w:val="single" w:sz="4" w:space="0" w:color="D9E1EA"/>
+              <w:bottom w:val="single" w:sz="4" w:space="0" w:color="D9E1EA"/>
+              <w:right w:val="single" w:sz="4" w:space="0" w:color="D9E1EA"/>
+            </w:tcBorders>
+            <w:tcMar>
+              <w:top w:w="80" w:type="dxa"/>
+              <w:bottom w:w="80" w:type="dxa"/>
+              <w:start w:w="120" w:type="dxa"/>
+              <w:end w:w="120" w:type="dxa"/>
+            </w:tcMar>
+          </w:tcPr>
+          <w:p>
+            <w:pPr>
+              <w:spacing w:after="0" w:line="252" w:lineRule="auto"/>
+              <w:jc w:val="left"/>
+            </w:pPr>
+            <w:hyperlink r:id="rId44">
+              <w:r>
+                <w:rPr>
+                  <w:color w:val="2E74B5"/>
+                  <w:u w:val="single"/>
+                  <w:rFonts w:ascii="Calibri" w:hAnsi="Calibri"/>
+                  <w:sz w:val="17"/>
+                </w:rPr>
+                <w:t>Timekettle W4 Pro vendor video</w:t>
+              </w:r>
+            </w:hyperlink>
+          </w:p>
+        </w:tc>
+        <w:tc>
+          <w:tcPr>
+            <w:tcW w:type="dxa" w:w="3341"/>
+            <w:vAlign w:val="center"/>
+            <w:tcBorders>
+              <w:top w:val="single" w:sz="4" w:space="0" w:color="D9E1EA"/>
+              <w:left w:val="single" w:sz="4" w:space="0" w:color="D9E1EA"/>
+              <w:bottom w:val="single" w:sz="4" w:space="0" w:color="D9E1EA"/>
+              <w:right w:val="single" w:sz="4" w:space="0" w:color="D9E1EA"/>
+            </w:tcBorders>
+            <w:tcMar>
+              <w:top w:w="80" w:type="dxa"/>
+              <w:bottom w:w="80" w:type="dxa"/>
+              <w:start w:w="120" w:type="dxa"/>
+              <w:end w:w="120" w:type="dxa"/>
+            </w:tcMar>
+          </w:tcPr>
+          <w:p>
+            <w:pPr>
+              <w:spacing w:after="0" w:line="252" w:lineRule="auto"/>
+              <w:jc w:val="left"/>
+            </w:pPr>
+            <w:r>
+              <w:rPr>
+                <w:rFonts w:ascii="Calibri" w:hAnsi="Calibri"/>
+                <w:color w:val="000000"/>
+                <w:sz w:val="17"/>
+              </w:rPr>
+              <w:t>Secondary social workflow example</w:t>
+            </w:r>
+          </w:p>
+        </w:tc>
+        <w:tc>
+          <w:tcPr>
+            <w:tcW w:type="dxa" w:w="3370"/>
+            <w:vAlign w:val="center"/>
+            <w:tcBorders>
+              <w:top w:val="single" w:sz="4" w:space="0" w:color="D9E1EA"/>
+              <w:left w:val="single" w:sz="4" w:space="0" w:color="D9E1EA"/>
+              <w:bottom w:val="single" w:sz="4" w:space="0" w:color="D9E1EA"/>
+              <w:right w:val="single" w:sz="4" w:space="0" w:color="D9E1EA"/>
+            </w:tcBorders>
+            <w:tcMar>
+              <w:top w:w="80" w:type="dxa"/>
+              <w:bottom w:w="80" w:type="dxa"/>
+              <w:start w:w="120" w:type="dxa"/>
+              <w:end w:w="120" w:type="dxa"/>
+            </w:tcMar>
+          </w:tcPr>
+          <w:p>
+            <w:pPr>
+              <w:spacing w:after="0" w:line="252" w:lineRule="auto"/>
+              <w:jc w:val="left"/>
+            </w:pPr>
+            <w:r>
+              <w:rPr>
+                <w:rFonts w:ascii="Calibri" w:hAnsi="Calibri"/>
+                <w:color w:val="000000"/>
+                <w:sz w:val="17"/>
+              </w:rPr>
+              <w:t>May be region or login restricted; vendor marketing only</w:t>
+            </w:r>
+          </w:p>
+        </w:tc>
+      </w:tr>
+      <w:tr>
+        <w:trPr>
+          <w:cantSplit/>
+        </w:trPr>
+        <w:tc>
+          <w:tcPr>
+            <w:tcW w:type="dxa" w:w="1383"/>
+            <w:vAlign w:val="center"/>
+            <w:tcBorders>
+              <w:top w:val="single" w:sz="4" w:space="0" w:color="D9E1EA"/>
+              <w:left w:val="single" w:sz="4" w:space="0" w:color="D9E1EA"/>
+              <w:bottom w:val="single" w:sz="4" w:space="0" w:color="D9E1EA"/>
+              <w:right w:val="single" w:sz="4" w:space="0" w:color="D9E1EA"/>
+            </w:tcBorders>
+            <w:tcMar>
+              <w:top w:w="80" w:type="dxa"/>
+              <w:bottom w:w="80" w:type="dxa"/>
+              <w:start w:w="120" w:type="dxa"/>
+              <w:end w:w="120" w:type="dxa"/>
+            </w:tcMar>
+          </w:tcPr>
+          <w:p>
+            <w:pPr>
+              <w:spacing w:after="0" w:line="252" w:lineRule="auto"/>
+              <w:jc w:val="left"/>
+            </w:pPr>
+            <w:r>
+              <w:rPr>
+                <w:rFonts w:ascii="Calibri" w:hAnsi="Calibri"/>
+                <w:color w:val="000000"/>
+                <w:sz w:val="17"/>
+              </w:rPr>
+              <w:t>Douyin</w:t>
+            </w:r>
+          </w:p>
+        </w:tc>
+        <w:tc>
+          <w:tcPr>
+            <w:tcW w:type="dxa" w:w="1266"/>
+            <w:vAlign w:val="center"/>
+            <w:tcBorders>
+              <w:top w:val="single" w:sz="4" w:space="0" w:color="D9E1EA"/>
+              <w:left w:val="single" w:sz="4" w:space="0" w:color="D9E1EA"/>
+              <w:bottom w:val="single" w:sz="4" w:space="0" w:color="D9E1EA"/>
+              <w:right w:val="single" w:sz="4" w:space="0" w:color="D9E1EA"/>
+            </w:tcBorders>
+            <w:tcMar>
+              <w:top w:w="80" w:type="dxa"/>
+              <w:bottom w:w="80" w:type="dxa"/>
+              <w:start w:w="120" w:type="dxa"/>
+              <w:end w:w="120" w:type="dxa"/>
+            </w:tcMar>
+          </w:tcPr>
+          <w:p>
+            <w:pPr>
+              <w:spacing w:after="0" w:line="252" w:lineRule="auto"/>
+              <w:jc w:val="left"/>
+            </w:pPr>
+            <w:hyperlink r:id="rId45">
+              <w:r>
+                <w:rPr>
+                  <w:color w:val="2E74B5"/>
+                  <w:u w:val="single"/>
+                  <w:rFonts w:ascii="Calibri" w:hAnsi="Calibri"/>
+                  <w:sz w:val="17"/>
+                </w:rPr>
+                <w:t>Timekettle W3 versus M3 official-store video</w:t>
+              </w:r>
+            </w:hyperlink>
+          </w:p>
+        </w:tc>
+        <w:tc>
+          <w:tcPr>
+            <w:tcW w:type="dxa" w:w="3341"/>
+            <w:vAlign w:val="center"/>
+            <w:tcBorders>
+              <w:top w:val="single" w:sz="4" w:space="0" w:color="D9E1EA"/>
+              <w:left w:val="single" w:sz="4" w:space="0" w:color="D9E1EA"/>
+              <w:bottom w:val="single" w:sz="4" w:space="0" w:color="D9E1EA"/>
+              <w:right w:val="single" w:sz="4" w:space="0" w:color="D9E1EA"/>
+            </w:tcBorders>
+            <w:tcMar>
+              <w:top w:w="80" w:type="dxa"/>
+              <w:bottom w:w="80" w:type="dxa"/>
+              <w:start w:w="120" w:type="dxa"/>
+              <w:end w:w="120" w:type="dxa"/>
+            </w:tcMar>
+          </w:tcPr>
+          <w:p>
+            <w:pPr>
+              <w:spacing w:after="0" w:line="252" w:lineRule="auto"/>
+              <w:jc w:val="left"/>
+            </w:pPr>
+            <w:r>
+              <w:rPr>
+                <w:rFonts w:ascii="Calibri" w:hAnsi="Calibri"/>
+                <w:color w:val="000000"/>
+                <w:sz w:val="17"/>
+              </w:rPr>
+              <w:t>Vendor-described interaction difference: W3 hands-free speaking versus M3 button-triggered turns</w:t>
+            </w:r>
+          </w:p>
+        </w:tc>
+        <w:tc>
+          <w:tcPr>
+            <w:tcW w:type="dxa" w:w="3370"/>
+            <w:vAlign w:val="center"/>
+            <w:tcBorders>
+              <w:top w:val="single" w:sz="4" w:space="0" w:color="D9E1EA"/>
+              <w:left w:val="single" w:sz="4" w:space="0" w:color="D9E1EA"/>
+              <w:bottom w:val="single" w:sz="4" w:space="0" w:color="D9E1EA"/>
+              <w:right w:val="single" w:sz="4" w:space="0" w:color="D9E1EA"/>
+            </w:tcBorders>
+            <w:tcMar>
+              <w:top w:w="80" w:type="dxa"/>
+              <w:bottom w:w="80" w:type="dxa"/>
+              <w:start w:w="120" w:type="dxa"/>
+              <w:end w:w="120" w:type="dxa"/>
+            </w:tcMar>
+          </w:tcPr>
+          <w:p>
+            <w:pPr>
+              <w:spacing w:after="0" w:line="252" w:lineRule="auto"/>
+              <w:jc w:val="left"/>
+            </w:pPr>
+            <w:r>
+              <w:rPr>
+                <w:rFonts w:ascii="Calibri" w:hAnsi="Calibri"/>
+                <w:color w:val="000000"/>
+                <w:sz w:val="17"/>
+              </w:rPr>
+              <w:t>Social store content; no accuracy, latency, or offline claim</w:t>
             </w:r>
           </w:p>
         </w:tc>
@@ -20123,9 +20267,9 @@
         <w:tblInd w:type="dxa" w:w="120"/>
       </w:tblPr>
       <w:tblGrid>
-        <w:gridCol w:w="1686"/>
-        <w:gridCol w:w="4856"/>
-        <w:gridCol w:w="2818"/>
+        <w:gridCol w:w="1684"/>
+        <w:gridCol w:w="4863"/>
+        <w:gridCol w:w="2813"/>
       </w:tblGrid>
       <w:tr>
         <w:trPr>
@@ -20134,7 +20278,7 @@
         </w:trPr>
         <w:tc>
           <w:tcPr>
-            <w:tcW w:type="dxa" w:w="1686"/>
+            <w:tcW w:type="dxa" w:w="1684"/>
             <w:vAlign w:val="center"/>
             <w:tcBorders>
               <w:top w:val="single" w:sz="4" w:space="0" w:color="D9E1EA"/>
@@ -20168,7 +20312,7 @@
         </w:tc>
         <w:tc>
           <w:tcPr>
-            <w:tcW w:type="dxa" w:w="4856"/>
+            <w:tcW w:type="dxa" w:w="4863"/>
             <w:vAlign w:val="center"/>
             <w:tcBorders>
               <w:top w:val="single" w:sz="4" w:space="0" w:color="D9E1EA"/>
@@ -20202,7 +20346,7 @@
         </w:tc>
         <w:tc>
           <w:tcPr>
-            <w:tcW w:type="dxa" w:w="2818"/>
+            <w:tcW w:type="dxa" w:w="2813"/>
             <w:vAlign w:val="center"/>
             <w:tcBorders>
               <w:top w:val="single" w:sz="4" w:space="0" w:color="D9E1EA"/>
@@ -20241,7 +20385,7 @@
         </w:trPr>
         <w:tc>
           <w:tcPr>
-            <w:tcW w:type="dxa" w:w="1686"/>
+            <w:tcW w:type="dxa" w:w="1684"/>
             <w:vAlign w:val="center"/>
             <w:tcBorders>
               <w:top w:val="single" w:sz="4" w:space="0" w:color="D9E1EA"/>
@@ -20273,7 +20417,7 @@
         </w:tc>
         <w:tc>
           <w:tcPr>
-            <w:tcW w:type="dxa" w:w="4856"/>
+            <w:tcW w:type="dxa" w:w="4863"/>
             <w:vAlign w:val="center"/>
             <w:tcBorders>
               <w:top w:val="single" w:sz="4" w:space="0" w:color="D9E1EA"/>
@@ -20299,13 +20443,13 @@
                 <w:color w:val="000000"/>
                 <w:sz w:val="18"/>
               </w:rPr>
-              <w:t>Show the exact Android phone, app build, EN-VI pack version, and Airplane Mode</w:t>
-            </w:r>
-          </w:p>
-        </w:tc>
-        <w:tc>
-          <w:tcPr>
-            <w:tcW w:type="dxa" w:w="2818"/>
+              <w:t>Show the exact Android phone, app build, EN-VI pack version, and Airplane Mode. Include the recorded result of the network-enabled no-egress test.</w:t>
+            </w:r>
+          </w:p>
+        </w:tc>
+        <w:tc>
+          <w:tcPr>
+            <w:tcW w:type="dxa" w:w="2813"/>
             <w:vAlign w:val="center"/>
             <w:tcBorders>
               <w:top w:val="single" w:sz="4" w:space="0" w:color="D9E1EA"/>
@@ -20342,7 +20486,7 @@
         </w:trPr>
         <w:tc>
           <w:tcPr>
-            <w:tcW w:type="dxa" w:w="1686"/>
+            <w:tcW w:type="dxa" w:w="1684"/>
             <w:vAlign w:val="center"/>
             <w:tcBorders>
               <w:top w:val="single" w:sz="4" w:space="0" w:color="D9E1EA"/>
@@ -20374,7 +20518,7 @@
         </w:tc>
         <w:tc>
           <w:tcPr>
-            <w:tcW w:type="dxa" w:w="4856"/>
+            <w:tcW w:type="dxa" w:w="4863"/>
             <w:vAlign w:val="center"/>
             <w:tcBorders>
               <w:top w:val="single" w:sz="4" w:space="0" w:color="D9E1EA"/>
@@ -20406,7 +20550,7 @@
         </w:tc>
         <w:tc>
           <w:tcPr>
-            <w:tcW w:type="dxa" w:w="2818"/>
+            <w:tcW w:type="dxa" w:w="2813"/>
             <w:vAlign w:val="center"/>
             <w:tcBorders>
               <w:top w:val="single" w:sz="4" w:space="0" w:color="D9E1EA"/>
@@ -20443,7 +20587,7 @@
         </w:trPr>
         <w:tc>
           <w:tcPr>
-            <w:tcW w:type="dxa" w:w="1686"/>
+            <w:tcW w:type="dxa" w:w="1684"/>
             <w:vAlign w:val="center"/>
             <w:tcBorders>
               <w:top w:val="single" w:sz="4" w:space="0" w:color="D9E1EA"/>
@@ -20475,7 +20619,7 @@
         </w:tc>
         <w:tc>
           <w:tcPr>
-            <w:tcW w:type="dxa" w:w="4856"/>
+            <w:tcW w:type="dxa" w:w="4863"/>
             <w:vAlign w:val="center"/>
             <w:tcBorders>
               <w:top w:val="single" w:sz="4" w:space="0" w:color="D9E1EA"/>
@@ -20507,7 +20651,7 @@
         </w:tc>
         <w:tc>
           <w:tcPr>
-            <w:tcW w:type="dxa" w:w="2818"/>
+            <w:tcW w:type="dxa" w:w="2813"/>
             <w:vAlign w:val="center"/>
             <w:tcBorders>
               <w:top w:val="single" w:sz="4" w:space="0" w:color="D9E1EA"/>
@@ -20544,7 +20688,7 @@
         </w:trPr>
         <w:tc>
           <w:tcPr>
-            <w:tcW w:type="dxa" w:w="1686"/>
+            <w:tcW w:type="dxa" w:w="1684"/>
             <w:vAlign w:val="center"/>
             <w:tcBorders>
               <w:top w:val="single" w:sz="4" w:space="0" w:color="D9E1EA"/>
@@ -20576,7 +20720,7 @@
         </w:tc>
         <w:tc>
           <w:tcPr>
-            <w:tcW w:type="dxa" w:w="4856"/>
+            <w:tcW w:type="dxa" w:w="4863"/>
             <w:vAlign w:val="center"/>
             <w:tcBorders>
               <w:top w:val="single" w:sz="4" w:space="0" w:color="D9E1EA"/>
@@ -20608,7 +20752,7 @@
         </w:tc>
         <w:tc>
           <w:tcPr>
-            <w:tcW w:type="dxa" w:w="2818"/>
+            <w:tcW w:type="dxa" w:w="2813"/>
             <w:vAlign w:val="center"/>
             <w:tcBorders>
               <w:top w:val="single" w:sz="4" w:space="0" w:color="D9E1EA"/>
@@ -20645,7 +20789,7 @@
         </w:trPr>
         <w:tc>
           <w:tcPr>
-            <w:tcW w:type="dxa" w:w="1686"/>
+            <w:tcW w:type="dxa" w:w="1684"/>
             <w:vAlign w:val="center"/>
             <w:tcBorders>
               <w:top w:val="single" w:sz="4" w:space="0" w:color="D9E1EA"/>
@@ -20677,7 +20821,7 @@
         </w:tc>
         <w:tc>
           <w:tcPr>
-            <w:tcW w:type="dxa" w:w="4856"/>
+            <w:tcW w:type="dxa" w:w="4863"/>
             <w:vAlign w:val="center"/>
             <w:tcBorders>
               <w:top w:val="single" w:sz="4" w:space="0" w:color="D9E1EA"/>
@@ -20709,7 +20853,7 @@
         </w:tc>
         <w:tc>
           <w:tcPr>
-            <w:tcW w:type="dxa" w:w="2818"/>
+            <w:tcW w:type="dxa" w:w="2813"/>
             <w:vAlign w:val="center"/>
             <w:tcBorders>
               <w:top w:val="single" w:sz="4" w:space="0" w:color="D9E1EA"/>
@@ -20746,7 +20890,7 @@
         </w:trPr>
         <w:tc>
           <w:tcPr>
-            <w:tcW w:type="dxa" w:w="1686"/>
+            <w:tcW w:type="dxa" w:w="1684"/>
             <w:vAlign w:val="center"/>
             <w:tcBorders>
               <w:top w:val="single" w:sz="4" w:space="0" w:color="D9E1EA"/>
@@ -20778,7 +20922,7 @@
         </w:tc>
         <w:tc>
           <w:tcPr>
-            <w:tcW w:type="dxa" w:w="4856"/>
+            <w:tcW w:type="dxa" w:w="4863"/>
             <w:vAlign w:val="center"/>
             <w:tcBorders>
               <w:top w:val="single" w:sz="4" w:space="0" w:color="D9E1EA"/>
@@ -20810,7 +20954,7 @@
         </w:tc>
         <w:tc>
           <w:tcPr>
-            <w:tcW w:type="dxa" w:w="2818"/>
+            <w:tcW w:type="dxa" w:w="2813"/>
             <w:vAlign w:val="center"/>
             <w:tcBorders>
               <w:top w:val="single" w:sz="4" w:space="0" w:color="D9E1EA"/>

</xml_diff>

<commit_message>
docs(voicekey): refine judge-facing proposal
</commit_message>
<xml_diff>
--- a/docs/voicekey/proposal/voicekey-technical-proposal-v2.1.docx
+++ b/docs/voicekey/proposal/voicekey-technical-proposal-v2.1.docx
@@ -435,7 +435,7 @@
           <w:color w:val="000000"/>
           <w:sz w:val="22"/>
         </w:rPr>
-        <w:t>VoiceKey is a proposed offline translation system for short English-Vietnamese conversations. It is intended for a Vietnamese frontline worker and an English-speaking trainer, supervisor, technician, or visitor who need to understand each other without waiting for an interpreter or relying on a stable network connection. The first use case is a two-person conversation in an indoor operational setting such as onboarding, maintenance, warehouse work, or field service. VoiceKey is a communication aid. It is not a safety system, and important instructions still need local procedures and human read-back.</w:t>
+        <w:t>VoiceKey is a proposed offline English-Vietnamese translation system for short, face-to-face conversations. It helps Vietnamese frontline workers communicate with English-speaking trainers, supervisors, technicians, or visitors without waiting for an interpreter or relying on stable internet access. The first use case is a two-person conversation in an indoor setting such as onboarding, maintenance, warehouse work, or field service. VoiceKey is a communication aid, not a safety system. Critical instructions still need local procedures and human read-back.</w:t>
       </w:r>
     </w:p>
     <w:p>
@@ -446,7 +446,7 @@
           <w:color w:val="000000"/>
           <w:sz w:val="22"/>
         </w:rPr>
-        <w:t>The first prototype is an Android app that runs the speech, translation, and optional speech-output models locally on the phone. It shows partial text while a person speaks. After a natural pause, it shows a large bilingual result and can read it aloud. In the first version, the conversation is automatic and turn-based. It does not claim to interpret two people speaking at the same time.</w:t>
+        <w:t>The first prototype is an Android app. It runs speech recognition, translation, and optional text-to-speech (TTS) locally on the phone. It shows partial text while someone speaks and a large bilingual result after a natural pause. Conversation is automatic and turn-based. VoiceKey v1 does not interpret two people speaking at the same time.</w:t>
       </w:r>
     </w:p>
     <w:p>
@@ -457,7 +457,7 @@
           <w:color w:val="000000"/>
           <w:sz w:val="22"/>
         </w:rPr>
-        <w:t>VoiceKey also evaluates a small USB-C companion with two close microphones, an optional button, and a recording LED. The phone still supplies the screen, battery, storage, speaker, and AI compute. A USB drive that only stores models does not by itself improve translation speed or conversation quality. A small USB accessory can earn its cost only if it improves real audio capture, turn control, or trust over the phone-only baseline. A full AI compute module is a later research track that requires a real processor, memory, power, and thermal design.</w:t>
+        <w:t>The team will also test a small USB-C companion with two close microphones, an optional button, and a recording LED. The phone provides the screen, battery, storage, speaker, and AI compute. A USB drive that only stores models does not improve translation speed or conversation quality by itself. The companion stays only if it improves audio capture, turn control, or user trust over the phone-only baseline. A full AI compute module is a later research track that needs its own processor, memory, power, and thermal design.</w:t>
       </w:r>
     </w:p>
     <w:p>
@@ -468,7 +468,7 @@
           <w:color w:val="000000"/>
           <w:sz w:val="22"/>
         </w:rPr>
-        <w:t>The proposal therefore makes a narrow, testable claim: prove useful offline English-Vietnamese translation on Android first, compare phone-only and companion-assisted use under the same conditions, then keep or remove the hardware based on the measured result.</w:t>
+        <w:t>The central question is simple: can VoiceKey provide useful offline English-Vietnamese translation on Android? It compares phone-only and companion-assisted use under the same conditions, then keeps the hardware only if the measurements support it.</w:t>
       </w:r>
     </w:p>
     <w:p>
@@ -516,7 +516,7 @@
           <w:color w:val="000000"/>
           <w:sz w:val="22"/>
         </w:rPr>
-        <w:t>VoiceKey is an Android-first, offline, turn-based English-Vietnamese translation app. A possible USB-C companion adds close microphones, a visible recording state, and optional physical control, while the Android phone runs the local AI and shows the bilingual transcript.</w:t>
+        <w:t>VoiceKey is an Android-first, offline, turn-based English-Vietnamese translation app. An optional USB-C companion can add close microphones, a visible recording state, and a physical control; the Android phone runs the local models and shows the bilingual text.</w:t>
       </w:r>
     </w:p>
     <w:p>
@@ -551,7 +551,7 @@
           <w:color w:val="000000"/>
           <w:sz w:val="22"/>
         </w:rPr>
-        <w:t xml:space="preserve"> After a signed language pack is installed, the release requirement is that speech recognition, translation, and optional speech output run with the network disabled.</w:t>
+        <w:t xml:space="preserve"> After a signed language pack is installed, speech recognition, translation, and optional TTS must run with the network disabled.</w:t>
       </w:r>
     </w:p>
     <w:p>
@@ -654,7 +654,7 @@
           <w:color w:val="000000"/>
           <w:sz w:val="22"/>
         </w:rPr>
-        <w:t>The first target situation is a short face-to-face conversation between a Vietnamese worker and an English-speaking colleague. The user needs quick bilingual text, not a long meeting transcript or a general business assistant. They may be in a noisy indoor setting, may not have reliable internet, and may need to check names, numbers, instructions, or technical terms. Existing translator categories show useful interaction patterns, but they do not prove that VoiceKey will be faster, more accurate, or more useful in this setting. That must be tested.</w:t>
+        <w:t>The first target situation is a short face-to-face conversation between a Vietnamese worker and an English-speaking colleague. The user needs quick bilingual text, not a long meeting transcript or a general business assistant. They may be in a noisy indoor setting, may not have reliable internet, and may need to check names, numbers, instructions, or technical terms. Existing translator products show useful interaction patterns, but VoiceKey still has to prove that it helps in this setting.</w:t>
       </w:r>
     </w:p>
     <w:p>
@@ -680,10 +680,10 @@
         <w:tblInd w:type="dxa" w:w="120"/>
       </w:tblPr>
       <w:tblGrid>
-        <w:gridCol w:w="1274"/>
-        <w:gridCol w:w="2988"/>
-        <w:gridCol w:w="2235"/>
-        <w:gridCol w:w="2863"/>
+        <w:gridCol w:w="1270"/>
+        <w:gridCol w:w="2970"/>
+        <w:gridCol w:w="2275"/>
+        <w:gridCol w:w="2845"/>
       </w:tblGrid>
       <w:tr>
         <w:trPr>
@@ -692,7 +692,7 @@
         </w:trPr>
         <w:tc>
           <w:tcPr>
-            <w:tcW w:type="dxa" w:w="1274"/>
+            <w:tcW w:type="dxa" w:w="1270"/>
             <w:vAlign w:val="center"/>
             <w:tcBorders>
               <w:top w:val="single" w:sz="4" w:space="0" w:color="D9E1EA"/>
@@ -726,7 +726,7 @@
         </w:tc>
         <w:tc>
           <w:tcPr>
-            <w:tcW w:type="dxa" w:w="2988"/>
+            <w:tcW w:type="dxa" w:w="2970"/>
             <w:vAlign w:val="center"/>
             <w:tcBorders>
               <w:top w:val="single" w:sz="4" w:space="0" w:color="D9E1EA"/>
@@ -760,7 +760,7 @@
         </w:tc>
         <w:tc>
           <w:tcPr>
-            <w:tcW w:type="dxa" w:w="2235"/>
+            <w:tcW w:type="dxa" w:w="2275"/>
             <w:vAlign w:val="center"/>
             <w:tcBorders>
               <w:top w:val="single" w:sz="4" w:space="0" w:color="D9E1EA"/>
@@ -794,7 +794,7 @@
         </w:tc>
         <w:tc>
           <w:tcPr>
-            <w:tcW w:type="dxa" w:w="2863"/>
+            <w:tcW w:type="dxa" w:w="2845"/>
             <w:vAlign w:val="center"/>
             <w:tcBorders>
               <w:top w:val="single" w:sz="4" w:space="0" w:color="D9E1EA"/>
@@ -833,7 +833,7 @@
         </w:trPr>
         <w:tc>
           <w:tcPr>
-            <w:tcW w:type="dxa" w:w="1274"/>
+            <w:tcW w:type="dxa" w:w="1270"/>
             <w:vAlign w:val="center"/>
             <w:tcBorders>
               <w:top w:val="single" w:sz="4" w:space="0" w:color="D9E1EA"/>
@@ -865,7 +865,7 @@
         </w:tc>
         <w:tc>
           <w:tcPr>
-            <w:tcW w:type="dxa" w:w="2988"/>
+            <w:tcW w:type="dxa" w:w="2970"/>
             <w:vAlign w:val="center"/>
             <w:tcBorders>
               <w:top w:val="single" w:sz="4" w:space="0" w:color="D9E1EA"/>
@@ -897,7 +897,7 @@
         </w:tc>
         <w:tc>
           <w:tcPr>
-            <w:tcW w:type="dxa" w:w="2235"/>
+            <w:tcW w:type="dxa" w:w="2275"/>
             <w:vAlign w:val="center"/>
             <w:tcBorders>
               <w:top w:val="single" w:sz="4" w:space="0" w:color="D9E1EA"/>
@@ -929,7 +929,7 @@
         </w:tc>
         <w:tc>
           <w:tcPr>
-            <w:tcW w:type="dxa" w:w="2863"/>
+            <w:tcW w:type="dxa" w:w="2845"/>
             <w:vAlign w:val="center"/>
             <w:tcBorders>
               <w:top w:val="single" w:sz="4" w:space="0" w:color="D9E1EA"/>
@@ -966,7 +966,7 @@
         </w:trPr>
         <w:tc>
           <w:tcPr>
-            <w:tcW w:type="dxa" w:w="1274"/>
+            <w:tcW w:type="dxa" w:w="1270"/>
             <w:vAlign w:val="center"/>
             <w:tcBorders>
               <w:top w:val="single" w:sz="4" w:space="0" w:color="D9E1EA"/>
@@ -998,7 +998,7 @@
         </w:tc>
         <w:tc>
           <w:tcPr>
-            <w:tcW w:type="dxa" w:w="2988"/>
+            <w:tcW w:type="dxa" w:w="2970"/>
             <w:vAlign w:val="center"/>
             <w:tcBorders>
               <w:top w:val="single" w:sz="4" w:space="0" w:color="D9E1EA"/>
@@ -1030,7 +1030,7 @@
         </w:tc>
         <w:tc>
           <w:tcPr>
-            <w:tcW w:type="dxa" w:w="2235"/>
+            <w:tcW w:type="dxa" w:w="2275"/>
             <w:vAlign w:val="center"/>
             <w:tcBorders>
               <w:top w:val="single" w:sz="4" w:space="0" w:color="D9E1EA"/>
@@ -1062,7 +1062,7 @@
         </w:tc>
         <w:tc>
           <w:tcPr>
-            <w:tcW w:type="dxa" w:w="2863"/>
+            <w:tcW w:type="dxa" w:w="2845"/>
             <w:vAlign w:val="center"/>
             <w:tcBorders>
               <w:top w:val="single" w:sz="4" w:space="0" w:color="D9E1EA"/>
@@ -1099,7 +1099,7 @@
         </w:trPr>
         <w:tc>
           <w:tcPr>
-            <w:tcW w:type="dxa" w:w="1274"/>
+            <w:tcW w:type="dxa" w:w="1270"/>
             <w:vAlign w:val="center"/>
             <w:tcBorders>
               <w:top w:val="single" w:sz="4" w:space="0" w:color="D9E1EA"/>
@@ -1131,7 +1131,7 @@
         </w:tc>
         <w:tc>
           <w:tcPr>
-            <w:tcW w:type="dxa" w:w="2988"/>
+            <w:tcW w:type="dxa" w:w="2970"/>
             <w:vAlign w:val="center"/>
             <w:tcBorders>
               <w:top w:val="single" w:sz="4" w:space="0" w:color="D9E1EA"/>
@@ -1163,7 +1163,7 @@
         </w:tc>
         <w:tc>
           <w:tcPr>
-            <w:tcW w:type="dxa" w:w="2235"/>
+            <w:tcW w:type="dxa" w:w="2275"/>
             <w:vAlign w:val="center"/>
             <w:tcBorders>
               <w:top w:val="single" w:sz="4" w:space="0" w:color="D9E1EA"/>
@@ -1189,13 +1189,13 @@
                 <w:color w:val="000000"/>
                 <w:sz w:val="17"/>
               </w:rPr>
-              <w:t>Cloud-dependent flow may stop</w:t>
-            </w:r>
-          </w:p>
-        </w:tc>
-        <w:tc>
-          <w:tcPr>
-            <w:tcW w:type="dxa" w:w="2863"/>
+              <w:t>Cloud-dependent translation may stop</w:t>
+            </w:r>
+          </w:p>
+        </w:tc>
+        <w:tc>
+          <w:tcPr>
+            <w:tcW w:type="dxa" w:w="2845"/>
             <w:vAlign w:val="center"/>
             <w:tcBorders>
               <w:top w:val="single" w:sz="4" w:space="0" w:color="D9E1EA"/>
@@ -1232,7 +1232,7 @@
         </w:trPr>
         <w:tc>
           <w:tcPr>
-            <w:tcW w:type="dxa" w:w="1274"/>
+            <w:tcW w:type="dxa" w:w="1270"/>
             <w:vAlign w:val="center"/>
             <w:tcBorders>
               <w:top w:val="single" w:sz="4" w:space="0" w:color="D9E1EA"/>
@@ -1264,7 +1264,7 @@
         </w:tc>
         <w:tc>
           <w:tcPr>
-            <w:tcW w:type="dxa" w:w="2988"/>
+            <w:tcW w:type="dxa" w:w="2970"/>
             <w:vAlign w:val="center"/>
             <w:tcBorders>
               <w:top w:val="single" w:sz="4" w:space="0" w:color="D9E1EA"/>
@@ -1296,7 +1296,7 @@
         </w:tc>
         <w:tc>
           <w:tcPr>
-            <w:tcW w:type="dxa" w:w="2235"/>
+            <w:tcW w:type="dxa" w:w="2275"/>
             <w:vAlign w:val="center"/>
             <w:tcBorders>
               <w:top w:val="single" w:sz="4" w:space="0" w:color="D9E1EA"/>
@@ -1328,7 +1328,7 @@
         </w:tc>
         <w:tc>
           <w:tcPr>
-            <w:tcW w:type="dxa" w:w="2863"/>
+            <w:tcW w:type="dxa" w:w="2845"/>
             <w:vAlign w:val="center"/>
             <w:tcBorders>
               <w:top w:val="single" w:sz="4" w:space="0" w:color="D9E1EA"/>
@@ -1365,7 +1365,7 @@
         </w:trPr>
         <w:tc>
           <w:tcPr>
-            <w:tcW w:type="dxa" w:w="1274"/>
+            <w:tcW w:type="dxa" w:w="1270"/>
             <w:vAlign w:val="center"/>
             <w:tcBorders>
               <w:top w:val="single" w:sz="4" w:space="0" w:color="D9E1EA"/>
@@ -1397,7 +1397,7 @@
         </w:tc>
         <w:tc>
           <w:tcPr>
-            <w:tcW w:type="dxa" w:w="2988"/>
+            <w:tcW w:type="dxa" w:w="2970"/>
             <w:vAlign w:val="center"/>
             <w:tcBorders>
               <w:top w:val="single" w:sz="4" w:space="0" w:color="D9E1EA"/>
@@ -1429,7 +1429,7 @@
         </w:tc>
         <w:tc>
           <w:tcPr>
-            <w:tcW w:type="dxa" w:w="2235"/>
+            <w:tcW w:type="dxa" w:w="2275"/>
             <w:vAlign w:val="center"/>
             <w:tcBorders>
               <w:top w:val="single" w:sz="4" w:space="0" w:color="D9E1EA"/>
@@ -1461,7 +1461,7 @@
         </w:tc>
         <w:tc>
           <w:tcPr>
-            <w:tcW w:type="dxa" w:w="2863"/>
+            <w:tcW w:type="dxa" w:w="2845"/>
             <w:vAlign w:val="center"/>
             <w:tcBorders>
               <w:top w:val="single" w:sz="4" w:space="0" w:color="D9E1EA"/>
@@ -2392,8 +2392,8 @@
         <w:tblInd w:type="dxa" w:w="120"/>
       </w:tblPr>
       <w:tblGrid>
-        <w:gridCol w:w="1992"/>
-        <w:gridCol w:w="7368"/>
+        <w:gridCol w:w="2006"/>
+        <w:gridCol w:w="7354"/>
       </w:tblGrid>
       <w:tr>
         <w:trPr>
@@ -2402,7 +2402,7 @@
         </w:trPr>
         <w:tc>
           <w:tcPr>
-            <w:tcW w:type="dxa" w:w="1992"/>
+            <w:tcW w:type="dxa" w:w="2006"/>
             <w:vAlign w:val="center"/>
             <w:tcBorders>
               <w:top w:val="single" w:sz="4" w:space="0" w:color="D9E1EA"/>
@@ -2436,7 +2436,7 @@
         </w:tc>
         <w:tc>
           <w:tcPr>
-            <w:tcW w:type="dxa" w:w="7368"/>
+            <w:tcW w:type="dxa" w:w="7354"/>
             <w:vAlign w:val="center"/>
             <w:tcBorders>
               <w:top w:val="single" w:sz="4" w:space="0" w:color="D9E1EA"/>
@@ -2475,7 +2475,7 @@
         </w:trPr>
         <w:tc>
           <w:tcPr>
-            <w:tcW w:type="dxa" w:w="1992"/>
+            <w:tcW w:type="dxa" w:w="2006"/>
             <w:vAlign w:val="center"/>
             <w:tcBorders>
               <w:top w:val="single" w:sz="4" w:space="0" w:color="D9E1EA"/>
@@ -2507,7 +2507,7 @@
         </w:tc>
         <w:tc>
           <w:tcPr>
-            <w:tcW w:type="dxa" w:w="7368"/>
+            <w:tcW w:type="dxa" w:w="7354"/>
             <w:vAlign w:val="center"/>
             <w:tcBorders>
               <w:top w:val="single" w:sz="4" w:space="0" w:color="D9E1EA"/>
@@ -2544,7 +2544,7 @@
         </w:trPr>
         <w:tc>
           <w:tcPr>
-            <w:tcW w:type="dxa" w:w="1992"/>
+            <w:tcW w:type="dxa" w:w="2006"/>
             <w:vAlign w:val="center"/>
             <w:tcBorders>
               <w:top w:val="single" w:sz="4" w:space="0" w:color="D9E1EA"/>
@@ -2576,7 +2576,7 @@
         </w:tc>
         <w:tc>
           <w:tcPr>
-            <w:tcW w:type="dxa" w:w="7368"/>
+            <w:tcW w:type="dxa" w:w="7354"/>
             <w:vAlign w:val="center"/>
             <w:tcBorders>
               <w:top w:val="single" w:sz="4" w:space="0" w:color="D9E1EA"/>
@@ -2613,7 +2613,7 @@
         </w:trPr>
         <w:tc>
           <w:tcPr>
-            <w:tcW w:type="dxa" w:w="1992"/>
+            <w:tcW w:type="dxa" w:w="2006"/>
             <w:vAlign w:val="center"/>
             <w:tcBorders>
               <w:top w:val="single" w:sz="4" w:space="0" w:color="D9E1EA"/>
@@ -2645,7 +2645,7 @@
         </w:tc>
         <w:tc>
           <w:tcPr>
-            <w:tcW w:type="dxa" w:w="7368"/>
+            <w:tcW w:type="dxa" w:w="7354"/>
             <w:vAlign w:val="center"/>
             <w:tcBorders>
               <w:top w:val="single" w:sz="4" w:space="0" w:color="D9E1EA"/>
@@ -2671,7 +2671,7 @@
                 <w:color w:val="000000"/>
                 <w:sz w:val="18"/>
               </w:rPr>
-              <w:t>Target: P50 &lt;= 2.0 seconds and P95 &lt;= 3.5 seconds from speech endpoint to final translated text for a short 2 to 6 second turn. This is a target, not a result.</w:t>
+              <w:t>P50 &lt;= 2.0 seconds and P95 &lt;= 3.5 seconds from speech endpoint to final translated text for a 2 to 6 second turn</w:t>
             </w:r>
           </w:p>
         </w:tc>
@@ -2682,7 +2682,7 @@
         </w:trPr>
         <w:tc>
           <w:tcPr>
-            <w:tcW w:type="dxa" w:w="1992"/>
+            <w:tcW w:type="dxa" w:w="2006"/>
             <w:vAlign w:val="center"/>
             <w:tcBorders>
               <w:top w:val="single" w:sz="4" w:space="0" w:color="D9E1EA"/>
@@ -2714,7 +2714,7 @@
         </w:tc>
         <w:tc>
           <w:tcPr>
-            <w:tcW w:type="dxa" w:w="7368"/>
+            <w:tcW w:type="dxa" w:w="7354"/>
             <w:vAlign w:val="center"/>
             <w:tcBorders>
               <w:top w:val="single" w:sz="4" w:space="0" w:color="D9E1EA"/>
@@ -2740,7 +2740,7 @@
                 <w:color w:val="000000"/>
                 <w:sz w:val="18"/>
               </w:rPr>
-              <w:t>English &lt;-&gt; Vietnamese text, speech recognition, and optional local speech output</w:t>
+              <w:t>English &lt;-&gt; Vietnamese text, speech recognition, and optional local TTS</w:t>
             </w:r>
           </w:p>
         </w:tc>
@@ -2751,7 +2751,7 @@
         </w:trPr>
         <w:tc>
           <w:tcPr>
-            <w:tcW w:type="dxa" w:w="1992"/>
+            <w:tcW w:type="dxa" w:w="2006"/>
             <w:vAlign w:val="center"/>
             <w:tcBorders>
               <w:top w:val="single" w:sz="4" w:space="0" w:color="D9E1EA"/>
@@ -2783,7 +2783,7 @@
         </w:tc>
         <w:tc>
           <w:tcPr>
-            <w:tcW w:type="dxa" w:w="7368"/>
+            <w:tcW w:type="dxa" w:w="7354"/>
             <w:vAlign w:val="center"/>
             <w:tcBorders>
               <w:top w:val="single" w:sz="4" w:space="0" w:color="D9E1EA"/>
@@ -2809,7 +2809,7 @@
                 <w:color w:val="000000"/>
                 <w:sz w:val="18"/>
               </w:rPr>
-              <w:t>Indoor pilot setting; 70 to 85 dBA noise slices are included in test. Outdoor and very loud use need a separate decision.</w:t>
+              <w:t>Indoor pilot; test 70 to 85 dBA noise. Outdoor and very loud use are out of scope for v1.</w:t>
             </w:r>
           </w:p>
         </w:tc>
@@ -2820,7 +2820,7 @@
         </w:trPr>
         <w:tc>
           <w:tcPr>
-            <w:tcW w:type="dxa" w:w="1992"/>
+            <w:tcW w:type="dxa" w:w="2006"/>
             <w:vAlign w:val="center"/>
             <w:tcBorders>
               <w:top w:val="single" w:sz="4" w:space="0" w:color="D9E1EA"/>
@@ -2852,7 +2852,7 @@
         </w:tc>
         <w:tc>
           <w:tcPr>
-            <w:tcW w:type="dxa" w:w="7368"/>
+            <w:tcW w:type="dxa" w:w="7354"/>
             <w:vAlign w:val="center"/>
             <w:tcBorders>
               <w:top w:val="single" w:sz="4" w:space="0" w:color="D9E1EA"/>
@@ -2889,7 +2889,7 @@
         </w:trPr>
         <w:tc>
           <w:tcPr>
-            <w:tcW w:type="dxa" w:w="1992"/>
+            <w:tcW w:type="dxa" w:w="2006"/>
             <w:vAlign w:val="center"/>
             <w:tcBorders>
               <w:top w:val="single" w:sz="4" w:space="0" w:color="D9E1EA"/>
@@ -2921,7 +2921,7 @@
         </w:tc>
         <w:tc>
           <w:tcPr>
-            <w:tcW w:type="dxa" w:w="7368"/>
+            <w:tcW w:type="dxa" w:w="7354"/>
             <w:vAlign w:val="center"/>
             <w:tcBorders>
               <w:top w:val="single" w:sz="4" w:space="0" w:color="D9E1EA"/>
@@ -2958,7 +2958,7 @@
         </w:trPr>
         <w:tc>
           <w:tcPr>
-            <w:tcW w:type="dxa" w:w="1992"/>
+            <w:tcW w:type="dxa" w:w="2006"/>
             <w:vAlign w:val="center"/>
             <w:tcBorders>
               <w:top w:val="single" w:sz="4" w:space="0" w:color="D9E1EA"/>
@@ -2990,7 +2990,7 @@
         </w:tc>
         <w:tc>
           <w:tcPr>
-            <w:tcW w:type="dxa" w:w="7368"/>
+            <w:tcW w:type="dxa" w:w="7354"/>
             <w:vAlign w:val="center"/>
             <w:tcBorders>
               <w:top w:val="single" w:sz="4" w:space="0" w:color="D9E1EA"/>
@@ -3016,7 +3016,7 @@
                 <w:color w:val="000000"/>
                 <w:sz w:val="18"/>
               </w:rPr>
-              <w:t>Android first. iOS begins as a phone-only validation path. A custom USB-C iPhone path is not promised.</w:t>
+              <w:t>Android first. Evaluate iOS as phone-only; do not promise a custom USB-C iPhone path.</w:t>
             </w:r>
           </w:p>
         </w:tc>
@@ -3061,7 +3061,7 @@
           <w:color w:val="000000"/>
           <w:sz w:val="22"/>
         </w:rPr>
-        <w:t>VoiceKey is not trying to replace every translation product. It is a focused response to a short, face-to-face conversation where visible bilingual text, offline behavior, and clear device state matter more than broad language coverage or travel features.</w:t>
+        <w:t>VoiceKey focuses on short, face-to-face conversations where visible bilingual text, offline behavior, and clear device state matter more than broad language coverage or travel features.</w:t>
       </w:r>
     </w:p>
     <w:tbl>
@@ -3767,7 +3767,7 @@
           <w:color w:val="000000"/>
           <w:sz w:val="22"/>
         </w:rPr>
-        <w:t xml:space="preserve">For example, the </w:t>
+        <w:t xml:space="preserve">The </w:t>
       </w:r>
       <w:hyperlink r:id="rId11">
         <w:r>
@@ -3805,7 +3805,7 @@
           <w:color w:val="000000"/>
           <w:sz w:val="22"/>
         </w:rPr>
-        <w:t xml:space="preserve"> shows a dedicated handheld workflow. VoiceKey does not claim a better benchmark from those videos. It tests a different choice: phone-visible bilingual text and an offline Android runtime. Direct demos are listed in Appendix B.</w:t>
+        <w:t xml:space="preserve"> shows a dedicated handheld workflow. These videos demonstrate workflows, not whether VoiceKey performs better. VoiceKey instead tests phone-visible bilingual text and an offline Android runtime. Direct demos are listed in Appendix B.</w:t>
       </w:r>
     </w:p>
     <w:p>
@@ -4563,7 +4563,7 @@
           <w:color w:val="000000"/>
           <w:sz w:val="22"/>
         </w:rPr>
-        <w:t>The main innovation is not a claim that a USB accessory alone makes translation better. It is a disciplined split of work: the phone handles AI and the user interface; the companion is tested only for the parts that hardware can improve. This avoids paying for a second computer before its value is clear.</w:t>
+        <w:t>The USB companion is not assumed to improve translation on its own. The phone handles AI and the user interface; the companion is tested only for tasks hardware can improve. This avoids paying for a second computer before it proves its value.</w:t>
       </w:r>
     </w:p>
     <w:p>
@@ -4587,7 +4587,7 @@
           <w:color w:val="000000"/>
           <w:sz w:val="22"/>
         </w:rPr>
-        <w:t>The product has two separate cost layers. The companion is a low-power audio accessory. The app, offline model integration, testing, and support are the larger early investment. Public component prices and labor data are planning anchors, not supplier quotes or a selling price.</w:t>
+        <w:t>VoiceKey has two cost layers. The companion is a low-power audio accessory. The app, offline model integration, testing, and support are the larger early investment. Public component prices and labor data are for planning only, not supplier quotes or selling prices.</w:t>
       </w:r>
     </w:p>
     <w:tbl>
@@ -5433,7 +5433,7 @@
           <w:color w:val="000000"/>
           <w:sz w:val="22"/>
         </w:rPr>
-        <w:t xml:space="preserve">The pilot should measure repeated explanations, time to confirmed understanding, support requests, and user acceptance. It should not claim a return on investment before those values are observed. Before procurement, the team needs a selected schematic, two comparable manufacturing quotes, a warranty and replacement plan, and a clear policy for customer-provided versus loaner phones. Component and cost anchors are listed in Section 5.3. Calculation and exclusion detail is in the </w:t>
+        <w:t xml:space="preserve">The pilot should measure repeated explanations, time until both people confirm understanding, support requests, and user acceptance. Do not estimate return on investment until those values are measured. Before procurement, the team needs a selected schematic, two comparable manufacturing quotes, a warranty and replacement plan, and a clear policy for customer-provided versus loaner phones. Section 5.3 gives component and cost anchors. The </w:t>
       </w:r>
       <w:hyperlink r:id="rId13">
         <w:r>
@@ -5452,7 +5452,7 @@
           <w:color w:val="000000"/>
           <w:sz w:val="22"/>
         </w:rPr>
-        <w:t>: direct pilot cash includes dongles, fixtures, labels or shipping, replacement reserve, and field support; it excludes NRE, loaner phones, formal certification, and lab capital unless a row explicitly states otherwise.</w:t>
+        <w:t xml:space="preserve"> lists direct pilot cash: dongles, fixtures, labels or shipping, replacement reserve, and field support. It excludes NRE, loaner phones, formal certification, and lab capital unless a row explicitly says otherwise.</w:t>
       </w:r>
     </w:p>
     <w:p>
@@ -5476,7 +5476,7 @@
           <w:color w:val="000000"/>
           <w:sz w:val="22"/>
         </w:rPr>
-        <w:t>The first route is a small business pilot, not a mass-market travel gadget launch. A pilot kit would include the companion if it passes the baseline comparison, the Android app, an English-Vietnamese pack, setup guidance, and a test report. A later commercial offer could separate hardware, site onboarding, and an optional support service for signed pack updates and glossary governance. The offline translation core should not depend on a recurring cloud-inference fee.</w:t>
+        <w:t>Start with a small business pilot, not a mass-market travel gadget. The pilot kit includes the companion only if it passes the baseline comparison, plus the Android app, an English-Vietnamese pack, setup guidance, and a test report. A later commercial offer could separate hardware, site onboarding, and an optional support service for signed pack updates and glossary governance. The offline translation core should not depend on a recurring cloud-inference fee.</w:t>
       </w:r>
     </w:p>
     <w:p>
@@ -5487,7 +5487,7 @@
           <w:color w:val="000000"/>
           <w:sz w:val="22"/>
         </w:rPr>
-        <w:t>VoiceKey does not publish a retail price in this proposal. Comparator retail prices are category anchors only. They bundle different phones, connectivity, warranty, language-pack, support, tax, and distribution terms. The base case assumes a customer-provided Android phone from a supported-device list.</w:t>
+        <w:t>This proposal does not set a retail price. Comparator retail prices are for context only because they bundle different phones, connectivity, warranty, language packs, support, tax, and distribution terms. The base case assumes a customer-provided Android phone from a supported-device list.</w:t>
       </w:r>
     </w:p>
     <w:p>
@@ -5524,7 +5524,7 @@
           <w:color w:val="000000"/>
           <w:sz w:val="22"/>
         </w:rPr>
-        <w:t xml:space="preserve">VoiceKey uses a cascade because each stage can be inspected and replaced independently. A cascade is also a sensible starting point for English-Vietnamese: the </w:t>
+        <w:t xml:space="preserve">VoiceKey uses a cascade so each stage can be inspected and replaced independently. This is a sensible starting point for English-Vietnamese: the </w:t>
       </w:r>
       <w:hyperlink r:id="rId14">
         <w:r>
@@ -5543,7 +5543,7 @@
           <w:color w:val="000000"/>
           <w:sz w:val="22"/>
         </w:rPr>
-        <w:t xml:space="preserve"> reports an English-Vietnamese cascade result that outperformed its end-to-end comparison in that study. This supports the architecture choice. It does not prove VoiceKey performance.</w:t>
+        <w:t xml:space="preserve"> reports an English-Vietnamese cascade result that outperformed its end-to-end comparison. This supports the architecture choice, not VoiceKey performance.</w:t>
       </w:r>
     </w:p>
     <w:p>
@@ -5963,7 +5963,7 @@
                 <w:color w:val="1F4D78"/>
                 <w:sz w:val="19"/>
               </w:rPr>
-              <w:t>Optional local speech output</w:t>
+              <w:t>Optional local TTS</w:t>
             </w:r>
           </w:p>
         </w:tc>
@@ -5981,7 +5981,7 @@
           <w:color w:val="666666"/>
           <w:sz w:val="17"/>
         </w:rPr>
-        <w:t>The signed local language pack supplies speech, translation, and optional speech-output resources.</w:t>
+        <w:t>The signed local language pack supplies speech, translation, and optional TTS resources.</w:t>
       </w:r>
     </w:p>
     <w:p>
@@ -6016,7 +6016,7 @@
           <w:color w:val="000000"/>
           <w:sz w:val="22"/>
         </w:rPr>
-        <w:t>The following are engineering budgets and candidate classes. They are not measured VoiceKey results and do not select a shipping model or voice.</w:t>
+        <w:t>The following are engineering budgets and candidate classes, not measured VoiceKey results. They do not select a final model or voice.</w:t>
       </w:r>
     </w:p>
     <w:tbl>
@@ -6451,7 +6451,7 @@
                 <w:color w:val="000000"/>
                 <w:sz w:val="17"/>
               </w:rPr>
-              <w:t xml:space="preserve">Benchmark multilingual Whisper base and small variants through </w:t>
+              <w:t xml:space="preserve">Benchmark Whisper base and small variants through </w:t>
             </w:r>
             <w:hyperlink r:id="rId16">
               <w:r>
@@ -6470,7 +6470,7 @@
                 <w:color w:val="000000"/>
                 <w:sz w:val="17"/>
               </w:rPr>
-              <w:t xml:space="preserve">; compare them with </w:t>
+              <w:t xml:space="preserve">, then compare them with </w:t>
             </w:r>
             <w:hyperlink r:id="rId17">
               <w:r>
@@ -7167,7 +7167,7 @@
           <w:color w:val="000000"/>
           <w:sz w:val="22"/>
         </w:rPr>
-        <w:t xml:space="preserve"> says the released models are not real-time out of the box. VoiceKey therefore treats every model, quantization level, runtime, phone, and language pack as a benchmark decision. </w:t>
+        <w:t xml:space="preserve"> says the released models are not real-time out of the box. Treat every model, quantization level, runtime, phone, and language pack as a separate benchmark candidate. </w:t>
       </w:r>
       <w:hyperlink r:id="rId22">
         <w:r>
@@ -7186,7 +7186,7 @@
           <w:color w:val="000000"/>
           <w:sz w:val="22"/>
         </w:rPr>
-        <w:t xml:space="preserve"> and PhoWhisper support Vietnamese evaluation planning; they do not grant automatic commercial rights to model weights, voices, or runtimes.</w:t>
+        <w:t xml:space="preserve"> and PhoWhisper guide Vietnamese evaluation; they do not grant automatic commercial rights to model weights, voices, or runtimes.</w:t>
       </w:r>
     </w:p>
     <w:p>
@@ -7210,7 +7210,7 @@
           <w:color w:val="000000"/>
           <w:sz w:val="22"/>
         </w:rPr>
-        <w:t>The v1 design keeps one pipeline in memory at a time. It streams audio in short chunks, keeps partial speech text small, loads only the selected English-Vietnamese pack, and releases optional text-to-speech resources when they are not needed. The initial engineering target is a peak AI-memory budget of 1.5 GB on the reference phone, with a measured pack-size, startup-time, temperature, and battery report for every candidate stack.</w:t>
+        <w:t>v1 keeps one pipeline in memory at a time. It streams short audio chunks, keeps partial text small, loads only the selected English-Vietnamese pack, and releases TTS resources when they are not needed. The initial engineering target is 1.5 GB of peak AI memory on the reference phone. Record pack size, startup time, temperature, and battery use for every candidate stack.</w:t>
       </w:r>
     </w:p>
     <w:p>
@@ -7221,7 +7221,7 @@
           <w:color w:val="000000"/>
           <w:sz w:val="22"/>
         </w:rPr>
-        <w:t>The quantization plan is simple. Start with a float baseline, then evaluate INT8 model variants where the selected mobile runtime supports them. A weight-only low-bit variant may be evaluated only when it reduces memory or heat without a meaningful quality loss. A quantized candidate is eligible for pilot only if its held-out bilingual adequacy result is no more than two percentage points below its float baseline, it passes the 30-minute thermal test, and it meets the response-time target. These are prototype gates, not results.</w:t>
+        <w:t>Start with a float baseline, then test INT8 candidates where the mobile runtime supports them. Test a weight-only, low-bit variant only if it reduces memory use or heat without a meaningful quality loss. A quantized candidate can enter the pilot only if bilingual adequacy is no more than two percentage points below its float baseline, it passes the 30-minute thermal test, and it meets the response-time target. These are prototype gates, not results.</w:t>
       </w:r>
     </w:p>
     <w:p>
@@ -7232,7 +7232,7 @@
           <w:color w:val="000000"/>
           <w:sz w:val="22"/>
         </w:rPr>
-        <w:t>The build begins with a reliable CPU path. A GPU or vendor acceleration path is accepted only if the same model, pack, and phone pass accuracy, latency, heat, and stability tests. The USB companion never receives direct access to the phone NPU and is not a shortcut to hardware acceleration.</w:t>
+        <w:t>Start with a CPU implementation. Add GPU or vendor acceleration only if the same model, pack, and phone pass accuracy, latency, heat, and stability tests. The USB companion has no direct access to the phone NPU, so it is not a shortcut to hardware acceleration.</w:t>
       </w:r>
     </w:p>
     <w:p>
@@ -7914,7 +7914,7 @@
           <w:color w:val="000000"/>
           <w:sz w:val="22"/>
         </w:rPr>
-        <w:t>The test set combines public research data with consented short conversations from the intended setting. It includes quiet speech, 70 to 85 dBA noise, Northern, Central, and Southern Vietnamese accents, names, numbers, technical terms, and code-switching. The team reports speech accuracy, bilingual human review of translation adequacy, P50/P95 response time, task completion, and failure rate. Use public test slices such as PhoMT only as one part of the evaluation. Do not publish a product accuracy claim until the consented target-context test passes.</w:t>
+        <w:t>The test set combines public research data with consented short conversations from the intended setting. It covers quiet speech, 70 to 85 dBA noise, Northern, Central, and Southern Vietnamese accents, names, numbers, technical terms, and code-switching. Report speech accuracy, bilingual review of translation adequacy, P50/P95 response time, task completion, and failure rate. Use public slices such as PhoMT as one part of the evaluation. Do not publish an accuracy claim until the target-context test passes.</w:t>
       </w:r>
     </w:p>
     <w:tbl>
@@ -8344,7 +8344,7 @@
                 <w:color w:val="000000"/>
                 <w:sz w:val="18"/>
               </w:rPr>
-              <w:t>All required turns pass both in Airplane Mode and in a network-enabled capture test that records zero VoiceKey outbound connections after the verified local pack is installed. Report the pack version and hash, capture method, crashes, and route losses for the 30-minute session.</w:t>
+              <w:t>All required turns pass in Airplane Mode and in a network-enabled test that records zero VoiceKey outbound connections after the local pack is installed and verified. For the 30-minute session, report the pack version and hash, capture method, crashes, and route losses.</w:t>
             </w:r>
           </w:p>
         </w:tc>
@@ -8389,7 +8389,7 @@
           <w:color w:val="000000"/>
           <w:sz w:val="22"/>
         </w:rPr>
-        <w:t>The selected v1 platform is phone-hosted local AI plus an optional low-power USB audio companion. It is selected because it proves the translation experience without pretending that a small USB peripheral can hold a complete AI computer.</w:t>
+        <w:t>v1 puts the local AI on the phone and uses an optional low-power USB audio companion. It lets the team test the translation experience without assuming that a small USB peripheral can contain a full AI computer.</w:t>
       </w:r>
     </w:p>
     <w:tbl>
@@ -10341,7 +10341,7 @@
           <w:color w:val="000000"/>
           <w:sz w:val="22"/>
         </w:rPr>
-        <w:t xml:space="preserve">Android is the first platform because it documents USB host and accessory communication, USB audio, and microphone capture APIs. Actual behavior still needs a supported-phone matrix and route verification. </w:t>
+        <w:t xml:space="preserve">Android is first because its documented APIs cover USB host and accessory communication, USB audio, and microphone capture. A supported-phone matrix and route verification are still required. </w:t>
       </w:r>
       <w:hyperlink r:id="rId26">
         <w:r>
@@ -10401,7 +10401,7 @@
           <w:color w:val="000000"/>
           <w:sz w:val="22"/>
         </w:rPr>
-        <w:t xml:space="preserve">iOS can first be evaluated as a phone-only app using the built-in microphone and speaker through </w:t>
+        <w:t xml:space="preserve">iOS starts as a phone-only app using the built-in microphone and speaker through </w:t>
       </w:r>
       <w:hyperlink r:id="rId29">
         <w:r>
@@ -10439,7 +10439,7 @@
           <w:color w:val="000000"/>
           <w:sz w:val="22"/>
         </w:rPr>
-        <w:t xml:space="preserve"> is for macOS USB access, not an iOS USB-accessory path. A custom wired iPhone accessory is out of scope until it is demonstrated on a current Apple-supported iOS framework and hardware.</w:t>
+        <w:t xml:space="preserve"> is for macOS USB access, not iOS accessories. A wired iPhone companion is outside v1 until a current Apple-supported iOS framework and hardware demonstrate it.</w:t>
       </w:r>
     </w:p>
     <w:p>
@@ -10463,7 +10463,7 @@
           <w:color w:val="000000"/>
           <w:sz w:val="22"/>
         </w:rPr>
-        <w:t>The v1 companion is a prototype target, not a finished industrial product: less than 20 g, about 45 x 22 x 9 mm, and connected by a short flexible USB-C pigtail to reduce strain on the phone port. It has no display, battery, cellular radio, or model-storage data plane.</w:t>
+        <w:t>The v1 companion is a prototype, not a finished industrial product. It targets less than 20 g, about 45 x 22 x 9 mm, and a short flexible USB-C pigtail to reduce strain on the phone port. It has no display, battery, cellular radio, or model storage.</w:t>
       </w:r>
     </w:p>
     <w:tbl>
@@ -11568,7 +11568,7 @@
           <w:color w:val="000000"/>
           <w:sz w:val="22"/>
         </w:rPr>
-        <w:t>The target is deliberately low because the phone is the power source and the AI computer. The project makes no all-day battery-life claim. The acceptance test is three 30-minute active sessions on each reference phone: phone-only, companion attached but idle, and companion attached with active translation. Each result records battery-percent change, surface temperature, reconnects, actual audio route, and failures. Brownout, repeated USB enumeration, route loss, or unsafe heat fails the configuration.</w:t>
+        <w:t>The limit is low because the phone supplies the power and AI compute. No all-day battery-life claim is made. Test three 30-minute active sessions on each reference phone: phone-only, companion attached but idle, and companion attached with active translation. Record battery-percent change, surface temperature, reconnects, actual audio route, and failures. Brownout, repeated USB enumeration, route loss, or unsafe heat fails the configuration.</w:t>
       </w:r>
     </w:p>
     <w:p>
@@ -11592,7 +11592,7 @@
           <w:color w:val="000000"/>
           <w:sz w:val="22"/>
         </w:rPr>
-        <w:t>All figures are USD planning estimates or public component-listing anchors. They are not a supplier quote, final bill of materials, or selling price.</w:t>
+        <w:t>All figures are USD planning estimates based on public component listings. They are not supplier quotes, a final bill of materials, or a selling price.</w:t>
       </w:r>
     </w:p>
     <w:p>
@@ -12424,7 +12424,7 @@
           <w:color w:val="000000"/>
           <w:sz w:val="22"/>
         </w:rPr>
-        <w:t>The schematic must select one Type-C configuration: a passive USB-device CC path or a named controller design. It must not count both. The complete-unit bands in Section 3.3 are used for pilot planning until a selected configuration and two manufacturing quotes exist.</w:t>
+        <w:t>The schematic must choose one Type-C configuration: a passive USB-device CC path or a named controller design. Never count both. Use the complete-unit bands in Section 3.3 for pilot planning until a configuration and two manufacturing quotes are selected.</w:t>
       </w:r>
     </w:p>
     <w:tbl>
@@ -13184,7 +13184,7 @@
           <w:color w:val="000000"/>
           <w:sz w:val="22"/>
         </w:rPr>
-        <w:t>Attach, detach, reconnect, screen lock, app restart, microphone permission revoke, and Airplane Mode all work on the supported phone list.</w:t>
+        <w:t>Every supported phone passes tests for attachment, detachment, reconnection, screen lock, app restart, microphone-permission revocation, and Airplane Mode.</w:t>
       </w:r>
     </w:p>
     <w:p>
@@ -13994,7 +13994,7 @@
           <w:color w:val="000000"/>
           <w:sz w:val="22"/>
         </w:rPr>
-        <w:t xml:space="preserve">Android capture must follow the documented microphone permission and foreground-service requirements. If permission or the service is not available, VoiceKey stops capture and tells the user. </w:t>
+        <w:t xml:space="preserve">Android capture follows documented microphone-permission and foreground-service requirements. If either is unavailable, VoiceKey stops capture and tells the user. </w:t>
       </w:r>
       <w:hyperlink r:id="rId35">
         <w:r>
@@ -14438,7 +14438,7 @@
                 <w:color w:val="1F4D78"/>
                 <w:sz w:val="19"/>
               </w:rPr>
-              <w:t>Optional local speech output</w:t>
+              <w:t>Optional local TTS</w:t>
             </w:r>
           </w:p>
         </w:tc>
@@ -14456,7 +14456,7 @@
           <w:color w:val="666666"/>
           <w:sz w:val="17"/>
         </w:rPr>
-        <w:t>The signed local language pack supplies speech, translation, and optional speech-output resources.</w:t>
+        <w:t>The signed local language pack supplies speech, translation, and optional TTS resources.</w:t>
       </w:r>
     </w:p>
     <w:p>
@@ -14467,7 +14467,7 @@
           <w:color w:val="000000"/>
           <w:sz w:val="22"/>
         </w:rPr>
-        <w:t>The USB companion does not process the full AI pipeline in v1. The phone app owns the microphone state, language pack, model runtime, transcript, and all user-visible errors. This makes it possible to test the translation system without hardware and to make a clear keep-or-remove decision on the companion.</w:t>
+        <w:t>The USB companion does not process the full AI pipeline in v1. The phone app manages the microphone state, language pack, model runtime, transcript, and all user-visible errors. This lets the team test translation without hardware and decide whether to keep the companion.</w:t>
       </w:r>
     </w:p>
     <w:p>
@@ -14493,7 +14493,7 @@
           <w:color w:val="000000"/>
           <w:sz w:val="22"/>
         </w:rPr>
-        <w:t>Each pack contains a versioned manifest signed by a release key pinned in the app. Before activation, the app verifies the manifest signature and listed file hashes and rejects unsigned, tampered, or revoked packs. Key rotation and rollback behavior are release tests.</w:t>
+        <w:t>Each pack has a versioned manifest signed with a release key pinned in the app. Before activation, the app verifies the signature, file hashes, and revocation status. Key rotation and rollback are release tests.</w:t>
       </w:r>
     </w:p>
     <w:p>
@@ -14506,7 +14506,7 @@
           <w:color w:val="000000"/>
           <w:sz w:val="22"/>
         </w:rPr>
-        <w:t>Runtime audio, speech recognition, translation, and optional speech output do not require a network connection.</w:t>
+        <w:t>Runtime audio, speech recognition, translation, and optional TTS run without a network connection.</w:t>
       </w:r>
     </w:p>
     <w:p>
@@ -14545,7 +14545,7 @@
           <w:color w:val="000000"/>
           <w:sz w:val="22"/>
         </w:rPr>
-        <w:t>Every pack has a version, hash, model/voice provenance record, and release-license review before it is shipped.</w:t>
+        <w:t>Every pack records its version, hash, model and voice provenance, and release-license review.</w:t>
       </w:r>
     </w:p>
     <w:p>
@@ -14582,7 +14582,7 @@
           <w:color w:val="000000"/>
           <w:sz w:val="22"/>
         </w:rPr>
-        <w:t>The final submission must replace the role labels below with real names, short qualifications, and contact details. The proposal does not invent team credentials.</w:t>
+        <w:t>Before filing, replace these placeholders with real names, short qualifications, and contact details.</w:t>
       </w:r>
     </w:p>
     <w:tbl>
@@ -14595,10 +14595,10 @@
         <w:tblInd w:type="dxa" w:w="120"/>
       </w:tblPr>
       <w:tblGrid>
-        <w:gridCol w:w="1967"/>
-        <w:gridCol w:w="1564"/>
-        <w:gridCol w:w="2474"/>
-        <w:gridCol w:w="3355"/>
+        <w:gridCol w:w="1964"/>
+        <w:gridCol w:w="1563"/>
+        <w:gridCol w:w="2470"/>
+        <w:gridCol w:w="3363"/>
       </w:tblGrid>
       <w:tr>
         <w:trPr>
@@ -14607,7 +14607,7 @@
         </w:trPr>
         <w:tc>
           <w:tcPr>
-            <w:tcW w:type="dxa" w:w="1967"/>
+            <w:tcW w:type="dxa" w:w="1964"/>
             <w:vAlign w:val="center"/>
             <w:tcBorders>
               <w:top w:val="single" w:sz="4" w:space="0" w:color="D9E1EA"/>
@@ -14641,7 +14641,7 @@
         </w:tc>
         <w:tc>
           <w:tcPr>
-            <w:tcW w:type="dxa" w:w="1564"/>
+            <w:tcW w:type="dxa" w:w="1563"/>
             <w:vAlign w:val="center"/>
             <w:tcBorders>
               <w:top w:val="single" w:sz="4" w:space="0" w:color="D9E1EA"/>
@@ -14675,7 +14675,7 @@
         </w:tc>
         <w:tc>
           <w:tcPr>
-            <w:tcW w:type="dxa" w:w="2474"/>
+            <w:tcW w:type="dxa" w:w="2470"/>
             <w:vAlign w:val="center"/>
             <w:tcBorders>
               <w:top w:val="single" w:sz="4" w:space="0" w:color="D9E1EA"/>
@@ -14709,7 +14709,7 @@
         </w:tc>
         <w:tc>
           <w:tcPr>
-            <w:tcW w:type="dxa" w:w="3355"/>
+            <w:tcW w:type="dxa" w:w="3363"/>
             <w:vAlign w:val="center"/>
             <w:tcBorders>
               <w:top w:val="single" w:sz="4" w:space="0" w:color="D9E1EA"/>
@@ -14748,7 +14748,7 @@
         </w:trPr>
         <w:tc>
           <w:tcPr>
-            <w:tcW w:type="dxa" w:w="1967"/>
+            <w:tcW w:type="dxa" w:w="1964"/>
             <w:vAlign w:val="center"/>
             <w:tcBorders>
               <w:top w:val="single" w:sz="4" w:space="0" w:color="D9E1EA"/>
@@ -14780,7 +14780,7 @@
         </w:tc>
         <w:tc>
           <w:tcPr>
-            <w:tcW w:type="dxa" w:w="1564"/>
+            <w:tcW w:type="dxa" w:w="1563"/>
             <w:vAlign w:val="center"/>
             <w:tcBorders>
               <w:top w:val="single" w:sz="4" w:space="0" w:color="D9E1EA"/>
@@ -14812,7 +14812,7 @@
         </w:tc>
         <w:tc>
           <w:tcPr>
-            <w:tcW w:type="dxa" w:w="2474"/>
+            <w:tcW w:type="dxa" w:w="2470"/>
             <w:vAlign w:val="center"/>
             <w:tcBorders>
               <w:top w:val="single" w:sz="4" w:space="0" w:color="D9E1EA"/>
@@ -14844,7 +14844,7 @@
         </w:tc>
         <w:tc>
           <w:tcPr>
-            <w:tcW w:type="dxa" w:w="3355"/>
+            <w:tcW w:type="dxa" w:w="3363"/>
             <w:vAlign w:val="center"/>
             <w:tcBorders>
               <w:top w:val="single" w:sz="4" w:space="0" w:color="D9E1EA"/>
@@ -14881,7 +14881,7 @@
         </w:trPr>
         <w:tc>
           <w:tcPr>
-            <w:tcW w:type="dxa" w:w="1967"/>
+            <w:tcW w:type="dxa" w:w="1964"/>
             <w:vAlign w:val="center"/>
             <w:tcBorders>
               <w:top w:val="single" w:sz="4" w:space="0" w:color="D9E1EA"/>
@@ -14913,7 +14913,7 @@
         </w:tc>
         <w:tc>
           <w:tcPr>
-            <w:tcW w:type="dxa" w:w="1564"/>
+            <w:tcW w:type="dxa" w:w="1563"/>
             <w:vAlign w:val="center"/>
             <w:tcBorders>
               <w:top w:val="single" w:sz="4" w:space="0" w:color="D9E1EA"/>
@@ -14945,7 +14945,7 @@
         </w:tc>
         <w:tc>
           <w:tcPr>
-            <w:tcW w:type="dxa" w:w="2474"/>
+            <w:tcW w:type="dxa" w:w="2470"/>
             <w:vAlign w:val="center"/>
             <w:tcBorders>
               <w:top w:val="single" w:sz="4" w:space="0" w:color="D9E1EA"/>
@@ -14977,7 +14977,7 @@
         </w:tc>
         <w:tc>
           <w:tcPr>
-            <w:tcW w:type="dxa" w:w="3355"/>
+            <w:tcW w:type="dxa" w:w="3363"/>
             <w:vAlign w:val="center"/>
             <w:tcBorders>
               <w:top w:val="single" w:sz="4" w:space="0" w:color="D9E1EA"/>
@@ -15003,7 +15003,7 @@
                 <w:color w:val="000000"/>
                 <w:sz w:val="17"/>
               </w:rPr>
-              <w:t>Model bake-off, English-Vietnamese quality review, pack release ledger</w:t>
+              <w:t>Model comparison, English-Vietnamese quality review, pack release ledger</w:t>
             </w:r>
           </w:p>
         </w:tc>
@@ -15014,7 +15014,7 @@
         </w:trPr>
         <w:tc>
           <w:tcPr>
-            <w:tcW w:type="dxa" w:w="1967"/>
+            <w:tcW w:type="dxa" w:w="1964"/>
             <w:vAlign w:val="center"/>
             <w:tcBorders>
               <w:top w:val="single" w:sz="4" w:space="0" w:color="D9E1EA"/>
@@ -15046,7 +15046,7 @@
         </w:tc>
         <w:tc>
           <w:tcPr>
-            <w:tcW w:type="dxa" w:w="1564"/>
+            <w:tcW w:type="dxa" w:w="1563"/>
             <w:vAlign w:val="center"/>
             <w:tcBorders>
               <w:top w:val="single" w:sz="4" w:space="0" w:color="D9E1EA"/>
@@ -15078,7 +15078,7 @@
         </w:tc>
         <w:tc>
           <w:tcPr>
-            <w:tcW w:type="dxa" w:w="2474"/>
+            <w:tcW w:type="dxa" w:w="2470"/>
             <w:vAlign w:val="center"/>
             <w:tcBorders>
               <w:top w:val="single" w:sz="4" w:space="0" w:color="D9E1EA"/>
@@ -15110,7 +15110,7 @@
         </w:tc>
         <w:tc>
           <w:tcPr>
-            <w:tcW w:type="dxa" w:w="3355"/>
+            <w:tcW w:type="dxa" w:w="3363"/>
             <w:vAlign w:val="center"/>
             <w:tcBorders>
               <w:top w:val="single" w:sz="4" w:space="0" w:color="D9E1EA"/>
@@ -15147,7 +15147,7 @@
         </w:trPr>
         <w:tc>
           <w:tcPr>
-            <w:tcW w:type="dxa" w:w="1967"/>
+            <w:tcW w:type="dxa" w:w="1964"/>
             <w:vAlign w:val="center"/>
             <w:tcBorders>
               <w:top w:val="single" w:sz="4" w:space="0" w:color="D9E1EA"/>
@@ -15179,7 +15179,7 @@
         </w:tc>
         <w:tc>
           <w:tcPr>
-            <w:tcW w:type="dxa" w:w="1564"/>
+            <w:tcW w:type="dxa" w:w="1563"/>
             <w:vAlign w:val="center"/>
             <w:tcBorders>
               <w:top w:val="single" w:sz="4" w:space="0" w:color="D9E1EA"/>
@@ -15211,7 +15211,7 @@
         </w:tc>
         <w:tc>
           <w:tcPr>
-            <w:tcW w:type="dxa" w:w="2474"/>
+            <w:tcW w:type="dxa" w:w="2470"/>
             <w:vAlign w:val="center"/>
             <w:tcBorders>
               <w:top w:val="single" w:sz="4" w:space="0" w:color="D9E1EA"/>
@@ -15243,7 +15243,7 @@
         </w:tc>
         <w:tc>
           <w:tcPr>
-            <w:tcW w:type="dxa" w:w="3355"/>
+            <w:tcW w:type="dxa" w:w="3363"/>
             <w:vAlign w:val="center"/>
             <w:tcBorders>
               <w:top w:val="single" w:sz="4" w:space="0" w:color="D9E1EA"/>
@@ -15280,7 +15280,7 @@
         </w:trPr>
         <w:tc>
           <w:tcPr>
-            <w:tcW w:type="dxa" w:w="1967"/>
+            <w:tcW w:type="dxa" w:w="1964"/>
             <w:vAlign w:val="center"/>
             <w:tcBorders>
               <w:top w:val="single" w:sz="4" w:space="0" w:color="D9E1EA"/>
@@ -15312,7 +15312,7 @@
         </w:tc>
         <w:tc>
           <w:tcPr>
-            <w:tcW w:type="dxa" w:w="1564"/>
+            <w:tcW w:type="dxa" w:w="1563"/>
             <w:vAlign w:val="center"/>
             <w:tcBorders>
               <w:top w:val="single" w:sz="4" w:space="0" w:color="D9E1EA"/>
@@ -15344,7 +15344,7 @@
         </w:tc>
         <w:tc>
           <w:tcPr>
-            <w:tcW w:type="dxa" w:w="2474"/>
+            <w:tcW w:type="dxa" w:w="2470"/>
             <w:vAlign w:val="center"/>
             <w:tcBorders>
               <w:top w:val="single" w:sz="4" w:space="0" w:color="D9E1EA"/>
@@ -15376,7 +15376,7 @@
         </w:tc>
         <w:tc>
           <w:tcPr>
-            <w:tcW w:type="dxa" w:w="3355"/>
+            <w:tcW w:type="dxa" w:w="3363"/>
             <w:vAlign w:val="center"/>
             <w:tcBorders>
               <w:top w:val="single" w:sz="4" w:space="0" w:color="D9E1EA"/>
@@ -15437,9 +15437,9 @@
       </w:tblPr>
       <w:tblGrid>
         <w:gridCol w:w="871"/>
-        <w:gridCol w:w="1799"/>
-        <w:gridCol w:w="5149"/>
-        <w:gridCol w:w="1541"/>
+        <w:gridCol w:w="1814"/>
+        <w:gridCol w:w="5136"/>
+        <w:gridCol w:w="1539"/>
       </w:tblGrid>
       <w:tr>
         <w:trPr>
@@ -15482,7 +15482,7 @@
         </w:tc>
         <w:tc>
           <w:tcPr>
-            <w:tcW w:type="dxa" w:w="1799"/>
+            <w:tcW w:type="dxa" w:w="1814"/>
             <w:vAlign w:val="center"/>
             <w:tcBorders>
               <w:top w:val="single" w:sz="4" w:space="0" w:color="D9E1EA"/>
@@ -15516,7 +15516,7 @@
         </w:tc>
         <w:tc>
           <w:tcPr>
-            <w:tcW w:type="dxa" w:w="5149"/>
+            <w:tcW w:type="dxa" w:w="5136"/>
             <w:vAlign w:val="center"/>
             <w:tcBorders>
               <w:top w:val="single" w:sz="4" w:space="0" w:color="D9E1EA"/>
@@ -15550,7 +15550,7 @@
         </w:tc>
         <w:tc>
           <w:tcPr>
-            <w:tcW w:type="dxa" w:w="1541"/>
+            <w:tcW w:type="dxa" w:w="1539"/>
             <w:vAlign w:val="center"/>
             <w:tcBorders>
               <w:top w:val="single" w:sz="4" w:space="0" w:color="D9E1EA"/>
@@ -15621,7 +15621,7 @@
         </w:tc>
         <w:tc>
           <w:tcPr>
-            <w:tcW w:type="dxa" w:w="1799"/>
+            <w:tcW w:type="dxa" w:w="1814"/>
             <w:vAlign w:val="center"/>
             <w:tcBorders>
               <w:top w:val="single" w:sz="4" w:space="0" w:color="D9E1EA"/>
@@ -15653,7 +15653,7 @@
         </w:tc>
         <w:tc>
           <w:tcPr>
-            <w:tcW w:type="dxa" w:w="5149"/>
+            <w:tcW w:type="dxa" w:w="5136"/>
             <w:vAlign w:val="center"/>
             <w:tcBorders>
               <w:top w:val="single" w:sz="4" w:space="0" w:color="D9E1EA"/>
@@ -15685,7 +15685,7 @@
         </w:tc>
         <w:tc>
           <w:tcPr>
-            <w:tcW w:type="dxa" w:w="1541"/>
+            <w:tcW w:type="dxa" w:w="1539"/>
             <w:vAlign w:val="center"/>
             <w:tcBorders>
               <w:top w:val="single" w:sz="4" w:space="0" w:color="D9E1EA"/>
@@ -15754,7 +15754,7 @@
         </w:tc>
         <w:tc>
           <w:tcPr>
-            <w:tcW w:type="dxa" w:w="1799"/>
+            <w:tcW w:type="dxa" w:w="1814"/>
             <w:vAlign w:val="center"/>
             <w:tcBorders>
               <w:top w:val="single" w:sz="4" w:space="0" w:color="D9E1EA"/>
@@ -15780,13 +15780,13 @@
                 <w:color w:val="000000"/>
                 <w:sz w:val="17"/>
               </w:rPr>
-              <w:t>Model bake-off</w:t>
-            </w:r>
-          </w:p>
-        </w:tc>
-        <w:tc>
-          <w:tcPr>
-            <w:tcW w:type="dxa" w:w="5149"/>
+              <w:t>Model comparison</w:t>
+            </w:r>
+          </w:p>
+        </w:tc>
+        <w:tc>
+          <w:tcPr>
+            <w:tcW w:type="dxa" w:w="5136"/>
             <w:vAlign w:val="center"/>
             <w:tcBorders>
               <w:top w:val="single" w:sz="4" w:space="0" w:color="D9E1EA"/>
@@ -15818,7 +15818,7 @@
         </w:tc>
         <w:tc>
           <w:tcPr>
-            <w:tcW w:type="dxa" w:w="1541"/>
+            <w:tcW w:type="dxa" w:w="1539"/>
             <w:vAlign w:val="center"/>
             <w:tcBorders>
               <w:top w:val="single" w:sz="4" w:space="0" w:color="D9E1EA"/>
@@ -15887,7 +15887,7 @@
         </w:tc>
         <w:tc>
           <w:tcPr>
-            <w:tcW w:type="dxa" w:w="1799"/>
+            <w:tcW w:type="dxa" w:w="1814"/>
             <w:vAlign w:val="center"/>
             <w:tcBorders>
               <w:top w:val="single" w:sz="4" w:space="0" w:color="D9E1EA"/>
@@ -15919,7 +15919,7 @@
         </w:tc>
         <w:tc>
           <w:tcPr>
-            <w:tcW w:type="dxa" w:w="5149"/>
+            <w:tcW w:type="dxa" w:w="5136"/>
             <w:vAlign w:val="center"/>
             <w:tcBorders>
               <w:top w:val="single" w:sz="4" w:space="0" w:color="D9E1EA"/>
@@ -15951,7 +15951,7 @@
         </w:tc>
         <w:tc>
           <w:tcPr>
-            <w:tcW w:type="dxa" w:w="1541"/>
+            <w:tcW w:type="dxa" w:w="1539"/>
             <w:vAlign w:val="center"/>
             <w:tcBorders>
               <w:top w:val="single" w:sz="4" w:space="0" w:color="D9E1EA"/>
@@ -16020,7 +16020,7 @@
         </w:tc>
         <w:tc>
           <w:tcPr>
-            <w:tcW w:type="dxa" w:w="1799"/>
+            <w:tcW w:type="dxa" w:w="1814"/>
             <w:vAlign w:val="center"/>
             <w:tcBorders>
               <w:top w:val="single" w:sz="4" w:space="0" w:color="D9E1EA"/>
@@ -16052,7 +16052,7 @@
         </w:tc>
         <w:tc>
           <w:tcPr>
-            <w:tcW w:type="dxa" w:w="5149"/>
+            <w:tcW w:type="dxa" w:w="5136"/>
             <w:vAlign w:val="center"/>
             <w:tcBorders>
               <w:top w:val="single" w:sz="4" w:space="0" w:color="D9E1EA"/>
@@ -16078,13 +16078,13 @@
                 <w:color w:val="000000"/>
                 <w:sz w:val="17"/>
               </w:rPr>
-              <w:t>Run short two-person turns in Airplane Mode and the network-enabled no-egress capture test, with visible source text, translation, and timing</w:t>
-            </w:r>
-          </w:p>
-        </w:tc>
-        <w:tc>
-          <w:tcPr>
-            <w:tcW w:type="dxa" w:w="1541"/>
+              <w:t>Run short two-person turns in Airplane Mode and in a network-enabled test that records zero VoiceKey outbound connections, with visible source text, translation, and timing</w:t>
+            </w:r>
+          </w:p>
+        </w:tc>
+        <w:tc>
+          <w:tcPr>
+            <w:tcW w:type="dxa" w:w="1539"/>
             <w:vAlign w:val="center"/>
             <w:tcBorders>
               <w:top w:val="single" w:sz="4" w:space="0" w:color="D9E1EA"/>
@@ -16153,7 +16153,7 @@
         </w:tc>
         <w:tc>
           <w:tcPr>
-            <w:tcW w:type="dxa" w:w="1799"/>
+            <w:tcW w:type="dxa" w:w="1814"/>
             <w:vAlign w:val="center"/>
             <w:tcBorders>
               <w:top w:val="single" w:sz="4" w:space="0" w:color="D9E1EA"/>
@@ -16185,7 +16185,7 @@
         </w:tc>
         <w:tc>
           <w:tcPr>
-            <w:tcW w:type="dxa" w:w="5149"/>
+            <w:tcW w:type="dxa" w:w="5136"/>
             <w:vAlign w:val="center"/>
             <w:tcBorders>
               <w:top w:val="single" w:sz="4" w:space="0" w:color="D9E1EA"/>
@@ -16217,7 +16217,7 @@
         </w:tc>
         <w:tc>
           <w:tcPr>
-            <w:tcW w:type="dxa" w:w="1541"/>
+            <w:tcW w:type="dxa" w:w="1539"/>
             <w:vAlign w:val="center"/>
             <w:tcBorders>
               <w:top w:val="single" w:sz="4" w:space="0" w:color="D9E1EA"/>
@@ -16286,7 +16286,7 @@
         </w:tc>
         <w:tc>
           <w:tcPr>
-            <w:tcW w:type="dxa" w:w="1799"/>
+            <w:tcW w:type="dxa" w:w="1814"/>
             <w:vAlign w:val="center"/>
             <w:tcBorders>
               <w:top w:val="single" w:sz="4" w:space="0" w:color="D9E1EA"/>
@@ -16318,7 +16318,7 @@
         </w:tc>
         <w:tc>
           <w:tcPr>
-            <w:tcW w:type="dxa" w:w="5149"/>
+            <w:tcW w:type="dxa" w:w="5136"/>
             <w:vAlign w:val="center"/>
             <w:tcBorders>
               <w:top w:val="single" w:sz="4" w:space="0" w:color="D9E1EA"/>
@@ -16350,7 +16350,7 @@
         </w:tc>
         <w:tc>
           <w:tcPr>
-            <w:tcW w:type="dxa" w:w="1541"/>
+            <w:tcW w:type="dxa" w:w="1539"/>
             <w:vAlign w:val="center"/>
             <w:tcBorders>
               <w:top w:val="single" w:sz="4" w:space="0" w:color="D9E1EA"/>
@@ -16408,7 +16408,7 @@
           <w:color w:val="000000"/>
           <w:sz w:val="22"/>
         </w:rPr>
-        <w:t>The project should not submit a scripted marketing clip as its technical evidence. The judge demo should show the exact phone, Android build, app build, pack version, Airplane Mode, actual microphone route, source text, translated text, timing, one noisy turn, and one visible failure or fallback. A suggested shot list is in Appendix C.</w:t>
+        <w:t>The technical demo should be a real test, not a scripted marketing clip. Show the exact phone, Android build, app build, pack version, Airplane Mode, and actual microphone route. Also show source text, translated text, timing, one noisy turn, and one visible failure or fallback. Appendix C has a suggested shot list.</w:t>
       </w:r>
     </w:p>
     <w:p>
@@ -17450,7 +17450,7 @@
                 <w:color w:val="000000"/>
                 <w:sz w:val="18"/>
               </w:rPr>
-              <w:t>DOCX generated with this proposal; final PDF is a submission step after team details and demo are added</w:t>
+              <w:t>DOCX generated with this proposal; final PDF is pending team details and demo evidence</w:t>
             </w:r>
           </w:p>
         </w:tc>
@@ -17484,9 +17484,9 @@
         <w:tblInd w:type="dxa" w:w="120"/>
       </w:tblPr>
       <w:tblGrid>
-        <w:gridCol w:w="1232"/>
-        <w:gridCol w:w="4302"/>
-        <w:gridCol w:w="3826"/>
+        <w:gridCol w:w="1229"/>
+        <w:gridCol w:w="4280"/>
+        <w:gridCol w:w="3851"/>
       </w:tblGrid>
       <w:tr>
         <w:trPr>
@@ -17495,7 +17495,7 @@
         </w:trPr>
         <w:tc>
           <w:tcPr>
-            <w:tcW w:type="dxa" w:w="1232"/>
+            <w:tcW w:type="dxa" w:w="1229"/>
             <w:vAlign w:val="center"/>
             <w:tcBorders>
               <w:top w:val="single" w:sz="4" w:space="0" w:color="D9E1EA"/>
@@ -17529,7 +17529,7 @@
         </w:tc>
         <w:tc>
           <w:tcPr>
-            <w:tcW w:type="dxa" w:w="4302"/>
+            <w:tcW w:type="dxa" w:w="4280"/>
             <w:vAlign w:val="center"/>
             <w:tcBorders>
               <w:top w:val="single" w:sz="4" w:space="0" w:color="D9E1EA"/>
@@ -17563,7 +17563,7 @@
         </w:tc>
         <w:tc>
           <w:tcPr>
-            <w:tcW w:type="dxa" w:w="3826"/>
+            <w:tcW w:type="dxa" w:w="3851"/>
             <w:vAlign w:val="center"/>
             <w:tcBorders>
               <w:top w:val="single" w:sz="4" w:space="0" w:color="D9E1EA"/>
@@ -17602,7 +17602,7 @@
         </w:trPr>
         <w:tc>
           <w:tcPr>
-            <w:tcW w:type="dxa" w:w="1232"/>
+            <w:tcW w:type="dxa" w:w="1229"/>
             <w:vAlign w:val="center"/>
             <w:tcBorders>
               <w:top w:val="single" w:sz="4" w:space="0" w:color="D9E1EA"/>
@@ -17637,7 +17637,7 @@
         </w:tc>
         <w:tc>
           <w:tcPr>
-            <w:tcW w:type="dxa" w:w="4302"/>
+            <w:tcW w:type="dxa" w:w="4280"/>
             <w:vAlign w:val="center"/>
             <w:tcBorders>
               <w:top w:val="single" w:sz="4" w:space="0" w:color="D9E1EA"/>
@@ -17669,7 +17669,7 @@
         </w:tc>
         <w:tc>
           <w:tcPr>
-            <w:tcW w:type="dxa" w:w="3826"/>
+            <w:tcW w:type="dxa" w:w="3851"/>
             <w:vAlign w:val="center"/>
             <w:tcBorders>
               <w:top w:val="single" w:sz="4" w:space="0" w:color="D9E1EA"/>
@@ -17706,7 +17706,7 @@
         </w:trPr>
         <w:tc>
           <w:tcPr>
-            <w:tcW w:type="dxa" w:w="1232"/>
+            <w:tcW w:type="dxa" w:w="1229"/>
             <w:vAlign w:val="center"/>
             <w:tcBorders>
               <w:top w:val="single" w:sz="4" w:space="0" w:color="D9E1EA"/>
@@ -17741,7 +17741,7 @@
         </w:tc>
         <w:tc>
           <w:tcPr>
-            <w:tcW w:type="dxa" w:w="4302"/>
+            <w:tcW w:type="dxa" w:w="4280"/>
             <w:vAlign w:val="center"/>
             <w:tcBorders>
               <w:top w:val="single" w:sz="4" w:space="0" w:color="D9E1EA"/>
@@ -17773,7 +17773,7 @@
         </w:tc>
         <w:tc>
           <w:tcPr>
-            <w:tcW w:type="dxa" w:w="3826"/>
+            <w:tcW w:type="dxa" w:w="3851"/>
             <w:vAlign w:val="center"/>
             <w:tcBorders>
               <w:top w:val="single" w:sz="4" w:space="0" w:color="D9E1EA"/>
@@ -17810,7 +17810,7 @@
         </w:trPr>
         <w:tc>
           <w:tcPr>
-            <w:tcW w:type="dxa" w:w="1232"/>
+            <w:tcW w:type="dxa" w:w="1229"/>
             <w:vAlign w:val="center"/>
             <w:tcBorders>
               <w:top w:val="single" w:sz="4" w:space="0" w:color="D9E1EA"/>
@@ -17845,7 +17845,7 @@
         </w:tc>
         <w:tc>
           <w:tcPr>
-            <w:tcW w:type="dxa" w:w="4302"/>
+            <w:tcW w:type="dxa" w:w="4280"/>
             <w:vAlign w:val="center"/>
             <w:tcBorders>
               <w:top w:val="single" w:sz="4" w:space="0" w:color="D9E1EA"/>
@@ -17877,7 +17877,7 @@
         </w:tc>
         <w:tc>
           <w:tcPr>
-            <w:tcW w:type="dxa" w:w="3826"/>
+            <w:tcW w:type="dxa" w:w="3851"/>
             <w:vAlign w:val="center"/>
             <w:tcBorders>
               <w:top w:val="single" w:sz="4" w:space="0" w:color="D9E1EA"/>
@@ -17914,7 +17914,7 @@
         </w:trPr>
         <w:tc>
           <w:tcPr>
-            <w:tcW w:type="dxa" w:w="1232"/>
+            <w:tcW w:type="dxa" w:w="1229"/>
             <w:vAlign w:val="center"/>
             <w:tcBorders>
               <w:top w:val="single" w:sz="4" w:space="0" w:color="D9E1EA"/>
@@ -17949,7 +17949,7 @@
         </w:tc>
         <w:tc>
           <w:tcPr>
-            <w:tcW w:type="dxa" w:w="4302"/>
+            <w:tcW w:type="dxa" w:w="4280"/>
             <w:vAlign w:val="center"/>
             <w:tcBorders>
               <w:top w:val="single" w:sz="4" w:space="0" w:color="D9E1EA"/>
@@ -17981,7 +17981,7 @@
         </w:tc>
         <w:tc>
           <w:tcPr>
-            <w:tcW w:type="dxa" w:w="3826"/>
+            <w:tcW w:type="dxa" w:w="3851"/>
             <w:vAlign w:val="center"/>
             <w:tcBorders>
               <w:top w:val="single" w:sz="4" w:space="0" w:color="D9E1EA"/>
@@ -18018,7 +18018,7 @@
         </w:trPr>
         <w:tc>
           <w:tcPr>
-            <w:tcW w:type="dxa" w:w="1232"/>
+            <w:tcW w:type="dxa" w:w="1229"/>
             <w:vAlign w:val="center"/>
             <w:tcBorders>
               <w:top w:val="single" w:sz="4" w:space="0" w:color="D9E1EA"/>
@@ -18091,7 +18091,7 @@
         </w:tc>
         <w:tc>
           <w:tcPr>
-            <w:tcW w:type="dxa" w:w="4302"/>
+            <w:tcW w:type="dxa" w:w="4280"/>
             <w:vAlign w:val="center"/>
             <w:tcBorders>
               <w:top w:val="single" w:sz="4" w:space="0" w:color="D9E1EA"/>
@@ -18123,7 +18123,7 @@
         </w:tc>
         <w:tc>
           <w:tcPr>
-            <w:tcW w:type="dxa" w:w="3826"/>
+            <w:tcW w:type="dxa" w:w="3851"/>
             <w:vAlign w:val="center"/>
             <w:tcBorders>
               <w:top w:val="single" w:sz="4" w:space="0" w:color="D9E1EA"/>
@@ -18149,7 +18149,7 @@
                 <w:color w:val="000000"/>
                 <w:sz w:val="18"/>
               </w:rPr>
-              <w:t>Shipping rights, accuracy, and latency without the VoiceKey bake-off</w:t>
+              <w:t>Shipping rights, accuracy, and latency without the VoiceKey model comparison</w:t>
             </w:r>
           </w:p>
         </w:tc>
@@ -18160,7 +18160,7 @@
         </w:trPr>
         <w:tc>
           <w:tcPr>
-            <w:tcW w:type="dxa" w:w="1232"/>
+            <w:tcW w:type="dxa" w:w="1229"/>
             <w:vAlign w:val="center"/>
             <w:tcBorders>
               <w:top w:val="single" w:sz="4" w:space="0" w:color="D9E1EA"/>
@@ -18195,7 +18195,7 @@
         </w:tc>
         <w:tc>
           <w:tcPr>
-            <w:tcW w:type="dxa" w:w="4302"/>
+            <w:tcW w:type="dxa" w:w="4280"/>
             <w:vAlign w:val="center"/>
             <w:tcBorders>
               <w:top w:val="single" w:sz="4" w:space="0" w:color="D9E1EA"/>
@@ -18227,7 +18227,7 @@
         </w:tc>
         <w:tc>
           <w:tcPr>
-            <w:tcW w:type="dxa" w:w="3826"/>
+            <w:tcW w:type="dxa" w:w="3851"/>
             <w:vAlign w:val="center"/>
             <w:tcBorders>
               <w:top w:val="single" w:sz="4" w:space="0" w:color="D9E1EA"/>
@@ -18264,7 +18264,7 @@
         </w:trPr>
         <w:tc>
           <w:tcPr>
-            <w:tcW w:type="dxa" w:w="1232"/>
+            <w:tcW w:type="dxa" w:w="1229"/>
             <w:vAlign w:val="center"/>
             <w:tcBorders>
               <w:top w:val="single" w:sz="4" w:space="0" w:color="D9E1EA"/>
@@ -18318,7 +18318,7 @@
         </w:tc>
         <w:tc>
           <w:tcPr>
-            <w:tcW w:type="dxa" w:w="4302"/>
+            <w:tcW w:type="dxa" w:w="4280"/>
             <w:vAlign w:val="center"/>
             <w:tcBorders>
               <w:top w:val="single" w:sz="4" w:space="0" w:color="D9E1EA"/>
@@ -18350,7 +18350,7 @@
         </w:tc>
         <w:tc>
           <w:tcPr>
-            <w:tcW w:type="dxa" w:w="3826"/>
+            <w:tcW w:type="dxa" w:w="3851"/>
             <w:vAlign w:val="center"/>
             <w:tcBorders>
               <w:top w:val="single" w:sz="4" w:space="0" w:color="D9E1EA"/>
@@ -18387,7 +18387,7 @@
         </w:trPr>
         <w:tc>
           <w:tcPr>
-            <w:tcW w:type="dxa" w:w="1232"/>
+            <w:tcW w:type="dxa" w:w="1229"/>
             <w:vAlign w:val="center"/>
             <w:tcBorders>
               <w:top w:val="single" w:sz="4" w:space="0" w:color="D9E1EA"/>
@@ -18422,7 +18422,7 @@
         </w:tc>
         <w:tc>
           <w:tcPr>
-            <w:tcW w:type="dxa" w:w="4302"/>
+            <w:tcW w:type="dxa" w:w="4280"/>
             <w:vAlign w:val="center"/>
             <w:tcBorders>
               <w:top w:val="single" w:sz="4" w:space="0" w:color="D9E1EA"/>
@@ -18454,7 +18454,7 @@
         </w:tc>
         <w:tc>
           <w:tcPr>
-            <w:tcW w:type="dxa" w:w="3826"/>
+            <w:tcW w:type="dxa" w:w="3851"/>
             <w:vAlign w:val="center"/>
             <w:tcBorders>
               <w:top w:val="single" w:sz="4" w:space="0" w:color="D9E1EA"/>
@@ -18491,7 +18491,7 @@
         </w:trPr>
         <w:tc>
           <w:tcPr>
-            <w:tcW w:type="dxa" w:w="1232"/>
+            <w:tcW w:type="dxa" w:w="1229"/>
             <w:vAlign w:val="center"/>
             <w:tcBorders>
               <w:top w:val="single" w:sz="4" w:space="0" w:color="D9E1EA"/>
@@ -18526,7 +18526,7 @@
         </w:tc>
         <w:tc>
           <w:tcPr>
-            <w:tcW w:type="dxa" w:w="4302"/>
+            <w:tcW w:type="dxa" w:w="4280"/>
             <w:vAlign w:val="center"/>
             <w:tcBorders>
               <w:top w:val="single" w:sz="4" w:space="0" w:color="D9E1EA"/>
@@ -18558,7 +18558,7 @@
         </w:tc>
         <w:tc>
           <w:tcPr>
-            <w:tcW w:type="dxa" w:w="3826"/>
+            <w:tcW w:type="dxa" w:w="3851"/>
             <w:vAlign w:val="center"/>
             <w:tcBorders>
               <w:top w:val="single" w:sz="4" w:space="0" w:color="D9E1EA"/>
@@ -18595,7 +18595,7 @@
         </w:trPr>
         <w:tc>
           <w:tcPr>
-            <w:tcW w:type="dxa" w:w="1232"/>
+            <w:tcW w:type="dxa" w:w="1229"/>
             <w:vAlign w:val="center"/>
             <w:tcBorders>
               <w:top w:val="single" w:sz="4" w:space="0" w:color="D9E1EA"/>
@@ -18649,7 +18649,7 @@
         </w:tc>
         <w:tc>
           <w:tcPr>
-            <w:tcW w:type="dxa" w:w="4302"/>
+            <w:tcW w:type="dxa" w:w="4280"/>
             <w:vAlign w:val="center"/>
             <w:tcBorders>
               <w:top w:val="single" w:sz="4" w:space="0" w:color="D9E1EA"/>
@@ -18681,7 +18681,7 @@
         </w:tc>
         <w:tc>
           <w:tcPr>
-            <w:tcW w:type="dxa" w:w="3826"/>
+            <w:tcW w:type="dxa" w:w="3851"/>
             <w:vAlign w:val="center"/>
             <w:tcBorders>
               <w:top w:val="single" w:sz="4" w:space="0" w:color="D9E1EA"/>
@@ -18718,7 +18718,7 @@
         </w:trPr>
         <w:tc>
           <w:tcPr>
-            <w:tcW w:type="dxa" w:w="1232"/>
+            <w:tcW w:type="dxa" w:w="1229"/>
             <w:vAlign w:val="center"/>
             <w:tcBorders>
               <w:top w:val="single" w:sz="4" w:space="0" w:color="D9E1EA"/>
@@ -18753,7 +18753,7 @@
         </w:tc>
         <w:tc>
           <w:tcPr>
-            <w:tcW w:type="dxa" w:w="4302"/>
+            <w:tcW w:type="dxa" w:w="4280"/>
             <w:vAlign w:val="center"/>
             <w:tcBorders>
               <w:top w:val="single" w:sz="4" w:space="0" w:color="D9E1EA"/>
@@ -18785,7 +18785,7 @@
         </w:tc>
         <w:tc>
           <w:tcPr>
-            <w:tcW w:type="dxa" w:w="3826"/>
+            <w:tcW w:type="dxa" w:w="3851"/>
             <w:vAlign w:val="center"/>
             <w:tcBorders>
               <w:top w:val="single" w:sz="4" w:space="0" w:color="D9E1EA"/>
@@ -18952,7 +18952,7 @@
           <w:color w:val="000000"/>
           <w:sz w:val="22"/>
         </w:rPr>
-        <w:t>The following links show adjacent product formats and user flows. They are not benchmarks for VoiceKey. A vendor tutorial shows a workflow, not independent accuracy, latency, offline reliability, or microphone quality.</w:t>
+        <w:t>These links show related product formats and user flows. They are not VoiceKey benchmarks. A vendor tutorial can show a workflow, but not independent accuracy, latency, offline reliability, or microphone quality.</w:t>
       </w:r>
     </w:p>
     <w:tbl>
@@ -20443,7 +20443,7 @@
                 <w:color w:val="000000"/>
                 <w:sz w:val="18"/>
               </w:rPr>
-              <w:t>Show the exact Android phone, app build, EN-VI pack version, and Airplane Mode. Include the recorded result of the network-enabled no-egress test.</w:t>
+              <w:t>Show the exact Android phone, app build, EN-VI pack version, and Airplane Mode. Include the recorded result of the network-enabled test that records zero VoiceKey outbound connections.</w:t>
             </w:r>
           </w:p>
         </w:tc>

</xml_diff>